<commit_message>
update the doc and child profile prototype
</commit_message>
<xml_diff>
--- a/docs/Money Mirror Documentation.docx
+++ b/docs/Money Mirror Documentation.docx
@@ -7999,7 +7999,17 @@
           <w:sz w:val="24"/>
           <w:szCs w:val="24"/>
         </w:rPr>
-        <w:t>6.0+ with Identity + JWT for secure authentication.</w:t>
+        <w:t>8.0</w:t>
+      </w:r>
+      <w:r>
+        <w:rPr>
+          <w:rFonts w:ascii="Times New Roman" w:hAnsi="Times New Roman"/>
+          <w:i w:val="0"/>
+          <w:iCs/>
+          <w:sz w:val="24"/>
+          <w:szCs w:val="24"/>
+        </w:rPr>
+        <w:t xml:space="preserve"> with JWT for secure authentication.</w:t>
       </w:r>
     </w:p>
     <w:p>
@@ -8046,8 +8056,9 @@
           <w:sz w:val="24"/>
           <w:szCs w:val="24"/>
         </w:rPr>
-        <w:t xml:space="preserve">QL Server </w:t>
-      </w:r>
+        <w:t xml:space="preserve">QL </w:t>
+      </w:r>
+      <w:proofErr w:type="gramStart"/>
       <w:r>
         <w:rPr>
           <w:rFonts w:ascii="Times New Roman" w:hAnsi="Times New Roman"/>
@@ -8056,7 +8067,28 @@
           <w:sz w:val="24"/>
           <w:szCs w:val="24"/>
         </w:rPr>
-        <w:t xml:space="preserve"> 2019+ for storing user credentials, expenses, moods, personality profiles, goals, and achievements.</w:t>
+        <w:t xml:space="preserve">Server </w:t>
+      </w:r>
+      <w:r>
+        <w:rPr>
+          <w:rFonts w:ascii="Times New Roman" w:hAnsi="Times New Roman"/>
+          <w:i w:val="0"/>
+          <w:iCs/>
+          <w:sz w:val="24"/>
+          <w:szCs w:val="24"/>
+        </w:rPr>
+        <w:t xml:space="preserve"> 2021</w:t>
+      </w:r>
+      <w:proofErr w:type="gramEnd"/>
+      <w:r>
+        <w:rPr>
+          <w:rFonts w:ascii="Times New Roman" w:hAnsi="Times New Roman"/>
+          <w:i w:val="0"/>
+          <w:iCs/>
+          <w:sz w:val="24"/>
+          <w:szCs w:val="24"/>
+        </w:rPr>
+        <w:t xml:space="preserve"> for storing user credentials, expenses, moods, personality profiles, goals, and achievements.</w:t>
       </w:r>
     </w:p>
     <w:p>
@@ -8837,8 +8869,6 @@
           </wp:inline>
         </w:drawing>
       </w:r>
-      <w:bookmarkStart w:id="38" w:name="_GoBack"/>
-      <w:bookmarkEnd w:id="38"/>
       <w:r>
         <w:rPr>
           <w:i w:val="0"/>
@@ -9031,7 +9061,7 @@
                 <w:szCs w:val="24"/>
               </w:rPr>
             </w:pPr>
-            <w:bookmarkStart w:id="39" w:name="_Hlk164783543"/>
+            <w:bookmarkStart w:id="38" w:name="_Hlk164783543"/>
             <w:r>
               <w:rPr>
                 <w:rFonts w:ascii="Times New Roman" w:eastAsia="DengXian" w:hAnsi="Times New Roman" w:cs="Arial"/>
@@ -9042,7 +9072,7 @@
               </w:rPr>
               <w:t>Use Case Name: Parent Signup and Child Code Generation</w:t>
             </w:r>
-            <w:bookmarkEnd w:id="39"/>
+            <w:bookmarkEnd w:id="38"/>
           </w:p>
         </w:tc>
         <w:tc>
@@ -21349,6 +21379,8 @@
           <w:lang w:bidi="ar-EG"/>
         </w:rPr>
       </w:pPr>
+      <w:bookmarkStart w:id="39" w:name="_GoBack"/>
+      <w:bookmarkEnd w:id="39"/>
     </w:p>
     <w:p>
       <w:pPr>
@@ -21451,9 +21483,8 @@
                 <w:bCs/>
                 <w:sz w:val="22"/>
                 <w:szCs w:val="22"/>
-                <w:rtl/>
-              </w:rPr>
-              <w:t>5</w:t>
+              </w:rPr>
+              <w:t>4</w:t>
             </w:r>
           </w:p>
         </w:tc>
@@ -23333,7 +23364,35 @@
                 <w:rFonts w:ascii="Times New Roman" w:hAnsi="Times New Roman"/>
                 <w:szCs w:val="24"/>
               </w:rPr>
-              <w:t>React Native (frontend), ASP.NET Core 6.0+ Web API (backend), SQL Server 2019+, Python (</w:t>
+              <w:t xml:space="preserve">React Native (frontend), ASP.NET Core </w:t>
+            </w:r>
+            <w:r>
+              <w:rPr>
+                <w:rFonts w:ascii="Times New Roman" w:hAnsi="Times New Roman"/>
+                <w:szCs w:val="24"/>
+              </w:rPr>
+              <w:t>8</w:t>
+            </w:r>
+            <w:r>
+              <w:rPr>
+                <w:rFonts w:ascii="Times New Roman" w:hAnsi="Times New Roman"/>
+                <w:szCs w:val="24"/>
+              </w:rPr>
+              <w:t>.0+ Web</w:t>
+            </w:r>
+            <w:r>
+              <w:rPr>
+                <w:rFonts w:ascii="Times New Roman" w:hAnsi="Times New Roman"/>
+                <w:szCs w:val="24"/>
+              </w:rPr>
+              <w:t xml:space="preserve"> API (backend), SQL Server 2021</w:t>
+            </w:r>
+            <w:r>
+              <w:rPr>
+                <w:rFonts w:ascii="Times New Roman" w:hAnsi="Times New Roman"/>
+                <w:szCs w:val="24"/>
+              </w:rPr>
+              <w:t>, Python (</w:t>
             </w:r>
             <w:proofErr w:type="spellStart"/>
             <w:r>
@@ -25895,7 +25954,7 @@
       <w:rPr>
         <w:noProof/>
       </w:rPr>
-      <w:t>53</w:t>
+      <w:t>40</w:t>
     </w:r>
     <w:r>
       <w:fldChar w:fldCharType="end"/>
@@ -32398,20 +32457,20 @@
 </file>
 
 <file path=customXml/item2.xml><?xml version="1.0" encoding="utf-8"?>
-<p:properties xmlns:p="http://schemas.microsoft.com/office/2006/metadata/properties" xmlns:xsi="http://www.w3.org/2001/XMLSchema-instance" xmlns:pc="http://schemas.microsoft.com/office/infopath/2007/PartnerControls">
-  <documentManagement>
-    <_activity xmlns="a0b9350d-f11b-4c2c-9411-1305d64a2cf9" xsi:nil="true"/>
-  </documentManagement>
-</p:properties>
-</file>
-
-<file path=customXml/item3.xml><?xml version="1.0" encoding="utf-8"?>
 <?mso-contentType ?>
 <FormTemplates xmlns="http://schemas.microsoft.com/sharepoint/v3/contenttype/forms">
   <Display>DocumentLibraryForm</Display>
   <Edit>DocumentLibraryForm</Edit>
   <New>DocumentLibraryForm</New>
 </FormTemplates>
+</file>
+
+<file path=customXml/item3.xml><?xml version="1.0" encoding="utf-8"?>
+<p:properties xmlns:p="http://schemas.microsoft.com/office/2006/metadata/properties" xmlns:xsi="http://www.w3.org/2001/XMLSchema-instance" xmlns:pc="http://schemas.microsoft.com/office/infopath/2007/PartnerControls">
+  <documentManagement>
+    <_activity xmlns="a0b9350d-f11b-4c2c-9411-1305d64a2cf9" xsi:nil="true"/>
+  </documentManagement>
+</p:properties>
 </file>
 
 <file path=customXml/item4.xml><?xml version="1.0" encoding="utf-8"?>
@@ -32438,6 +32497,14 @@
 </file>
 
 <file path=customXml/itemProps2.xml><?xml version="1.0" encoding="utf-8"?>
+<ds:datastoreItem xmlns:ds="http://schemas.openxmlformats.org/officeDocument/2006/customXml" ds:itemID="{CA1C910A-E087-4A41-BE29-FE60FF116498}">
+  <ds:schemaRefs>
+    <ds:schemaRef ds:uri="http://schemas.microsoft.com/sharepoint/v3/contenttype/forms"/>
+  </ds:schemaRefs>
+</ds:datastoreItem>
+</file>
+
+<file path=customXml/itemProps3.xml><?xml version="1.0" encoding="utf-8"?>
 <ds:datastoreItem xmlns:ds="http://schemas.openxmlformats.org/officeDocument/2006/customXml" ds:itemID="{F48E6873-909C-4AED-A304-42171A5F15F4}">
   <ds:schemaRefs>
     <ds:schemaRef ds:uri="http://schemas.microsoft.com/office/2006/metadata/properties"/>
@@ -32447,16 +32514,8 @@
 </ds:datastoreItem>
 </file>
 
-<file path=customXml/itemProps3.xml><?xml version="1.0" encoding="utf-8"?>
-<ds:datastoreItem xmlns:ds="http://schemas.openxmlformats.org/officeDocument/2006/customXml" ds:itemID="{CA1C910A-E087-4A41-BE29-FE60FF116498}">
-  <ds:schemaRefs>
-    <ds:schemaRef ds:uri="http://schemas.microsoft.com/sharepoint/v3/contenttype/forms"/>
-  </ds:schemaRefs>
-</ds:datastoreItem>
-</file>
-
 <file path=customXml/itemProps4.xml><?xml version="1.0" encoding="utf-8"?>
-<ds:datastoreItem xmlns:ds="http://schemas.openxmlformats.org/officeDocument/2006/customXml" ds:itemID="{92475BA8-0D03-4179-A15A-7E788B816243}">
+<ds:datastoreItem xmlns:ds="http://schemas.openxmlformats.org/officeDocument/2006/customXml" ds:itemID="{7D6DE3D6-237B-4F07-AAF8-D9D9A6B6251A}">
   <ds:schemaRefs>
     <ds:schemaRef ds:uri="http://schemas.openxmlformats.org/officeDocument/2006/bibliography"/>
   </ds:schemaRefs>

</xml_diff>

<commit_message>
updated the child login use case
</commit_message>
<xml_diff>
--- a/docs/Money Mirror Documentation.docx
+++ b/docs/Money Mirror Documentation.docx
@@ -8179,7 +8179,17 @@
           <w:sz w:val="24"/>
           <w:szCs w:val="24"/>
         </w:rPr>
-        <w:t>-learn, and Transformers</w:t>
+        <w:t xml:space="preserve">-learn, </w:t>
+      </w:r>
+      <w:r>
+        <w:rPr>
+          <w:rFonts w:ascii="Times New Roman" w:hAnsi="Times New Roman"/>
+          <w:i w:val="0"/>
+          <w:iCs/>
+          <w:sz w:val="24"/>
+          <w:szCs w:val="24"/>
+        </w:rPr>
+        <w:t>etc.</w:t>
       </w:r>
       <w:r>
         <w:rPr>
@@ -9070,7 +9080,7 @@
                 <w:sz w:val="22"/>
                 <w:szCs w:val="24"/>
               </w:rPr>
-              <w:t>Use Case Name: Parent Signup and Child Code Generation</w:t>
+              <w:t xml:space="preserve">Use Case Name: Parent Signup </w:t>
             </w:r>
             <w:bookmarkEnd w:id="38"/>
           </w:p>
@@ -9205,7 +9215,7 @@
                 <w:sz w:val="22"/>
                 <w:szCs w:val="24"/>
               </w:rPr>
-              <w:t>Description: Allows a parent to sign up using email and password to create an account and generate unique login codes for each child.</w:t>
+              <w:t>Description: Allows a parent to sign up using email and password to create an account.</w:t>
             </w:r>
           </w:p>
         </w:tc>
@@ -9334,6 +9344,8 @@
               </w:rPr>
               <w:t>-  The app is available and operational.</w:t>
             </w:r>
+            <w:bookmarkStart w:id="39" w:name="_GoBack"/>
+            <w:bookmarkEnd w:id="39"/>
           </w:p>
           <w:p>
             <w:pPr>
@@ -9373,7 +9385,7 @@
       </w:tr>
       <w:tr>
         <w:trPr>
-          <w:trHeight w:val="2423"/>
+          <w:trHeight w:val="1736"/>
         </w:trPr>
         <w:tc>
           <w:tcPr>
@@ -9489,72 +9501,6 @@
                 <w:szCs w:val="24"/>
               </w:rPr>
               <w:t>4- The system validate parent info</w:t>
-            </w:r>
-          </w:p>
-          <w:p>
-            <w:pPr>
-              <w:spacing w:line="273" w:lineRule="auto"/>
-              <w:rPr>
-                <w:rFonts w:ascii="Times New Roman" w:eastAsia="DengXian" w:hAnsi="Times New Roman" w:cs="Arial"/>
-                <w:b/>
-                <w:bCs/>
-                <w:sz w:val="22"/>
-                <w:szCs w:val="24"/>
-              </w:rPr>
-            </w:pPr>
-            <w:r>
-              <w:rPr>
-                <w:rFonts w:ascii="Times New Roman" w:eastAsia="DengXian" w:hAnsi="Times New Roman" w:cs="Arial"/>
-                <w:b/>
-                <w:bCs/>
-                <w:sz w:val="22"/>
-                <w:szCs w:val="24"/>
-              </w:rPr>
-              <w:t>4- The system prompts the parent to add children.</w:t>
-            </w:r>
-          </w:p>
-          <w:p>
-            <w:pPr>
-              <w:spacing w:line="273" w:lineRule="auto"/>
-              <w:rPr>
-                <w:rFonts w:ascii="Times New Roman" w:eastAsia="DengXian" w:hAnsi="Times New Roman" w:cs="Arial"/>
-                <w:b/>
-                <w:bCs/>
-                <w:sz w:val="22"/>
-                <w:szCs w:val="24"/>
-              </w:rPr>
-            </w:pPr>
-            <w:r>
-              <w:rPr>
-                <w:rFonts w:ascii="Times New Roman" w:eastAsia="DengXian" w:hAnsi="Times New Roman" w:cs="Arial"/>
-                <w:b/>
-                <w:bCs/>
-                <w:sz w:val="22"/>
-                <w:szCs w:val="24"/>
-              </w:rPr>
-              <w:t>5- For each child, the system generates a unique login code.</w:t>
-            </w:r>
-          </w:p>
-          <w:p>
-            <w:pPr>
-              <w:spacing w:line="273" w:lineRule="auto"/>
-              <w:rPr>
-                <w:rFonts w:ascii="Times New Roman" w:eastAsia="DengXian" w:hAnsi="Times New Roman" w:cs="Arial"/>
-                <w:b/>
-                <w:bCs/>
-                <w:sz w:val="22"/>
-                <w:szCs w:val="24"/>
-              </w:rPr>
-            </w:pPr>
-            <w:r>
-              <w:rPr>
-                <w:rFonts w:ascii="Times New Roman" w:eastAsia="DengXian" w:hAnsi="Times New Roman" w:cs="Arial"/>
-                <w:b/>
-                <w:bCs/>
-                <w:sz w:val="22"/>
-                <w:szCs w:val="24"/>
-              </w:rPr>
-              <w:t>6- The parent saves or shares the code for each child.</w:t>
             </w:r>
           </w:p>
         </w:tc>
@@ -9615,28 +9561,6 @@
                 <w:szCs w:val="24"/>
               </w:rPr>
               <w:t>-  The parent’s account and credentials are stored in the database.</w:t>
-            </w:r>
-          </w:p>
-          <w:p>
-            <w:pPr>
-              <w:spacing w:line="240" w:lineRule="auto"/>
-              <w:rPr>
-                <w:rFonts w:ascii="Times New Roman" w:eastAsia="Calibri" w:hAnsi="Times New Roman" w:cs="Arial"/>
-                <w:b/>
-                <w:bCs/>
-                <w:sz w:val="22"/>
-                <w:szCs w:val="24"/>
-              </w:rPr>
-            </w:pPr>
-            <w:r>
-              <w:rPr>
-                <w:rFonts w:ascii="Times New Roman" w:eastAsia="Calibri" w:hAnsi="Times New Roman" w:cs="Arial"/>
-                <w:b/>
-                <w:bCs/>
-                <w:sz w:val="22"/>
-                <w:szCs w:val="24"/>
-              </w:rPr>
-              <w:t>-  A unique login code is generated for each child.</w:t>
             </w:r>
           </w:p>
           <w:p>
@@ -9814,6 +9738,7 @@
                 <w:sz w:val="22"/>
                 <w:szCs w:val="24"/>
               </w:rPr>
+              <w:lastRenderedPageBreak/>
               <w:t>Use Case Name: Child Login Using Parent Code</w:t>
             </w:r>
           </w:p>
@@ -10516,6 +10441,7 @@
                 <w:sz w:val="22"/>
                 <w:szCs w:val="24"/>
               </w:rPr>
+              <w:lastRenderedPageBreak/>
               <w:t>Use Case Name: Multi-Child Support for Parents</w:t>
             </w:r>
           </w:p>
@@ -11229,7 +11155,38 @@
                 <w:sz w:val="22"/>
                 <w:szCs w:val="24"/>
               </w:rPr>
+              <w:lastRenderedPageBreak/>
               <w:t>Use Case Name: Initial Profiling for New Child</w:t>
+            </w:r>
+            <w:r>
+              <w:rPr>
+                <w:rFonts w:ascii="Times New Roman" w:eastAsia="DengXian" w:hAnsi="Times New Roman" w:cs="Arial"/>
+                <w:b/>
+                <w:bCs/>
+                <w:sz w:val="22"/>
+                <w:szCs w:val="24"/>
+              </w:rPr>
+              <w:t xml:space="preserve"> </w:t>
+            </w:r>
+            <w:r>
+              <w:rPr>
+                <w:rFonts w:ascii="Times New Roman" w:eastAsia="DengXian" w:hAnsi="Times New Roman" w:cs="Arial"/>
+                <w:b/>
+                <w:bCs/>
+                <w:sz w:val="22"/>
+                <w:szCs w:val="24"/>
+              </w:rPr>
+              <w:t xml:space="preserve"> </w:t>
+            </w:r>
+            <w:r>
+              <w:rPr>
+                <w:rFonts w:ascii="Times New Roman" w:eastAsia="DengXian" w:hAnsi="Times New Roman" w:cs="Arial"/>
+                <w:b/>
+                <w:bCs/>
+                <w:sz w:val="22"/>
+                <w:szCs w:val="24"/>
+              </w:rPr>
+              <w:t>and Child Code Generation</w:t>
             </w:r>
           </w:p>
         </w:tc>
@@ -11359,7 +11316,37 @@
                 <w:sz w:val="22"/>
                 <w:szCs w:val="24"/>
               </w:rPr>
-              <w:t>Description: Allows parents to complete a questionnaire when adding a new child to establish a preliminary financial personality profile. Provides immediate insights into the child’s potential financial behaviors.</w:t>
+              <w:t>Description: Allows parents to complete a questionnaire when adding a new child to establish a preliminary</w:t>
+            </w:r>
+            <w:r>
+              <w:rPr>
+                <w:rFonts w:ascii="Times New Roman" w:eastAsia="DengXian" w:hAnsi="Times New Roman" w:cs="Arial"/>
+                <w:b/>
+                <w:bCs/>
+                <w:sz w:val="22"/>
+                <w:szCs w:val="24"/>
+              </w:rPr>
+              <w:t xml:space="preserve"> financial personality profile </w:t>
+            </w:r>
+            <w:r>
+              <w:rPr>
+                <w:rFonts w:ascii="Times New Roman" w:eastAsia="DengXian" w:hAnsi="Times New Roman" w:cs="Arial"/>
+                <w:b/>
+                <w:bCs/>
+                <w:sz w:val="22"/>
+                <w:szCs w:val="24"/>
+              </w:rPr>
+              <w:t>and generate unique login codes for each child</w:t>
+            </w:r>
+            <w:r>
+              <w:rPr>
+                <w:rFonts w:ascii="Times New Roman" w:eastAsia="DengXian" w:hAnsi="Times New Roman" w:cs="Arial"/>
+                <w:b/>
+                <w:bCs/>
+                <w:sz w:val="22"/>
+                <w:szCs w:val="24"/>
+              </w:rPr>
+              <w:t>.</w:t>
             </w:r>
           </w:p>
         </w:tc>
@@ -11572,23 +11559,11 @@
               <w:t>The app and questionnaire module are operational.</w:t>
             </w:r>
           </w:p>
-          <w:p>
-            <w:pPr>
-              <w:spacing w:before="100" w:beforeAutospacing="1" w:line="273" w:lineRule="auto"/>
-              <w:rPr>
-                <w:rFonts w:ascii="Times New Roman" w:eastAsia="DengXian" w:hAnsi="Times New Roman" w:cs="Arial"/>
-                <w:b/>
-                <w:bCs/>
-                <w:sz w:val="22"/>
-                <w:szCs w:val="24"/>
-              </w:rPr>
-            </w:pPr>
-          </w:p>
         </w:tc>
       </w:tr>
       <w:tr>
         <w:trPr>
-          <w:trHeight w:val="2684"/>
+          <w:trHeight w:val="2351"/>
         </w:trPr>
         <w:tc>
           <w:tcPr>
@@ -11724,29 +11699,17 @@
                 <w:sz w:val="22"/>
                 <w:szCs w:val="24"/>
               </w:rPr>
-              <w:t>5- The app generates an initial financial personality profile for the child.</w:t>
-            </w:r>
-          </w:p>
-          <w:p>
-            <w:pPr>
-              <w:spacing w:line="273" w:lineRule="auto"/>
-              <w:rPr>
-                <w:rFonts w:ascii="Times New Roman" w:eastAsia="DengXian" w:hAnsi="Times New Roman" w:cs="Arial"/>
-                <w:b/>
-                <w:bCs/>
-                <w:sz w:val="22"/>
-                <w:szCs w:val="24"/>
-              </w:rPr>
-            </w:pPr>
-            <w:r>
-              <w:rPr>
-                <w:rFonts w:ascii="Times New Roman" w:eastAsia="DengXian" w:hAnsi="Times New Roman" w:cs="Arial"/>
-                <w:b/>
-                <w:bCs/>
-                <w:sz w:val="22"/>
-                <w:szCs w:val="24"/>
-              </w:rPr>
-              <w:t>6- The parent reviews the generated profile on the dashboard</w:t>
+              <w:t>5- The app generates a login code and</w:t>
+            </w:r>
+            <w:r>
+              <w:rPr>
+                <w:rFonts w:ascii="Times New Roman" w:eastAsia="DengXian" w:hAnsi="Times New Roman" w:cs="Arial"/>
+                <w:b/>
+                <w:bCs/>
+                <w:sz w:val="22"/>
+                <w:szCs w:val="24"/>
+              </w:rPr>
+              <w:t xml:space="preserve"> initial financial personality profile for the child.</w:t>
             </w:r>
           </w:p>
         </w:tc>
@@ -11802,7 +11765,27 @@
                 <w:sz w:val="22"/>
                 <w:szCs w:val="24"/>
               </w:rPr>
-              <w:t>- The child’s preliminary financial personality profile is stored in the database.</w:t>
+              <w:t xml:space="preserve">- The child’s preliminary financial personality profile </w:t>
+            </w:r>
+            <w:r>
+              <w:rPr>
+                <w:rFonts w:ascii="Times New Roman" w:eastAsia="DengXian" w:hAnsi="Times New Roman" w:cs="Arial"/>
+                <w:b/>
+                <w:bCs/>
+                <w:sz w:val="22"/>
+                <w:szCs w:val="24"/>
+              </w:rPr>
+              <w:t>and login code are</w:t>
+            </w:r>
+            <w:r>
+              <w:rPr>
+                <w:rFonts w:ascii="Times New Roman" w:eastAsia="DengXian" w:hAnsi="Times New Roman" w:cs="Arial"/>
+                <w:b/>
+                <w:bCs/>
+                <w:sz w:val="22"/>
+                <w:szCs w:val="24"/>
+              </w:rPr>
+              <w:t xml:space="preserve"> stored in the database.</w:t>
             </w:r>
           </w:p>
           <w:p>
@@ -21379,8 +21362,6 @@
           <w:lang w:bidi="ar-EG"/>
         </w:rPr>
       </w:pPr>
-      <w:bookmarkStart w:id="39" w:name="_GoBack"/>
-      <w:bookmarkEnd w:id="39"/>
     </w:p>
     <w:p>
       <w:pPr>
@@ -25954,7 +25935,7 @@
       <w:rPr>
         <w:noProof/>
       </w:rPr>
-      <w:t>40</w:t>
+      <w:t>24</w:t>
     </w:r>
     <w:r>
       <w:fldChar w:fldCharType="end"/>
@@ -32515,7 +32496,7 @@
 </file>
 
 <file path=customXml/itemProps4.xml><?xml version="1.0" encoding="utf-8"?>
-<ds:datastoreItem xmlns:ds="http://schemas.openxmlformats.org/officeDocument/2006/customXml" ds:itemID="{7D6DE3D6-237B-4F07-AAF8-D9D9A6B6251A}">
+<ds:datastoreItem xmlns:ds="http://schemas.openxmlformats.org/officeDocument/2006/customXml" ds:itemID="{2E0E3325-F60A-430F-8DC0-085AC7693D67}">
   <ds:schemaRefs>
     <ds:schemaRef ds:uri="http://schemas.openxmlformats.org/officeDocument/2006/bibliography"/>
   </ds:schemaRefs>

</xml_diff>

<commit_message>
changed email from sendgrid to brevo
</commit_message>
<xml_diff>
--- a/docs/Money Mirror Documentation.docx
+++ b/docs/Money Mirror Documentation.docx
@@ -5653,7 +5653,7 @@
                 <w:sz w:val="24"/>
                 <w:szCs w:val="24"/>
               </w:rPr>
-              <w:t>SendGrid</w:t>
+              <w:t>Brevo</w:t>
             </w:r>
             <w:proofErr w:type="spellEnd"/>
             <w:r>
@@ -8348,7 +8348,29 @@
           <w:sz w:val="24"/>
           <w:szCs w:val="24"/>
         </w:rPr>
-        <w:t>Email Notifications: For parents (e.g., profile updates, weekly reports), sent via SendGrid.</w:t>
+        <w:t xml:space="preserve">Email Notifications: For parents (e.g., profile updates, weekly reports), sent via </w:t>
+      </w:r>
+      <w:proofErr w:type="spellStart"/>
+      <w:r>
+        <w:rPr>
+          <w:rFonts w:ascii="Times New Roman" w:hAnsi="Times New Roman"/>
+          <w:i w:val="0"/>
+          <w:iCs/>
+          <w:sz w:val="24"/>
+          <w:szCs w:val="24"/>
+        </w:rPr>
+        <w:t>Brevo</w:t>
+      </w:r>
+      <w:proofErr w:type="spellEnd"/>
+      <w:r>
+        <w:rPr>
+          <w:rFonts w:ascii="Times New Roman" w:hAnsi="Times New Roman"/>
+          <w:i w:val="0"/>
+          <w:iCs/>
+          <w:sz w:val="24"/>
+          <w:szCs w:val="24"/>
+        </w:rPr>
+        <w:t>.</w:t>
       </w:r>
     </w:p>
     <w:p>
@@ -9344,8 +9366,6 @@
               </w:rPr>
               <w:t>-  The app is available and operational.</w:t>
             </w:r>
-            <w:bookmarkStart w:id="39" w:name="_GoBack"/>
-            <w:bookmarkEnd w:id="39"/>
           </w:p>
           <w:p>
             <w:pPr>
@@ -11176,17 +11196,7 @@
                 <w:sz w:val="22"/>
                 <w:szCs w:val="24"/>
               </w:rPr>
-              <w:t xml:space="preserve"> </w:t>
-            </w:r>
-            <w:r>
-              <w:rPr>
-                <w:rFonts w:ascii="Times New Roman" w:eastAsia="DengXian" w:hAnsi="Times New Roman" w:cs="Arial"/>
-                <w:b/>
-                <w:bCs/>
-                <w:sz w:val="22"/>
-                <w:szCs w:val="24"/>
-              </w:rPr>
-              <w:t>and Child Code Generation</w:t>
+              <w:t xml:space="preserve"> and Child Code Generation</w:t>
             </w:r>
           </w:p>
         </w:tc>
@@ -21788,7 +21798,29 @@
                 <w:szCs w:val="24"/>
               </w:rPr>
               <w:br/>
-              <w:t>3- The system sends the email via SendGrid to the parent’s registered address.</w:t>
+              <w:t xml:space="preserve">3- The system sends the email via </w:t>
+            </w:r>
+            <w:proofErr w:type="spellStart"/>
+            <w:r>
+              <w:rPr>
+                <w:rFonts w:ascii="Times New Roman" w:eastAsia="DengXian" w:hAnsi="Times New Roman" w:cs="Arial"/>
+                <w:b/>
+                <w:bCs/>
+                <w:sz w:val="22"/>
+                <w:szCs w:val="24"/>
+              </w:rPr>
+              <w:t>Brevo</w:t>
+            </w:r>
+            <w:proofErr w:type="spellEnd"/>
+            <w:r>
+              <w:rPr>
+                <w:rFonts w:ascii="Times New Roman" w:eastAsia="DengXian" w:hAnsi="Times New Roman" w:cs="Arial"/>
+                <w:b/>
+                <w:bCs/>
+                <w:sz w:val="22"/>
+                <w:szCs w:val="24"/>
+              </w:rPr>
+              <w:t xml:space="preserve"> to the parent’s registered address.</w:t>
             </w:r>
             <w:r>
               <w:rPr>
@@ -23429,8 +23461,10 @@
                 <w:rFonts w:ascii="Times New Roman" w:hAnsi="Times New Roman"/>
                 <w:szCs w:val="24"/>
               </w:rPr>
-              <w:t>SendGrid</w:t>
-            </w:r>
+              <w:t>Brevo</w:t>
+            </w:r>
+            <w:bookmarkStart w:id="39" w:name="_GoBack"/>
+            <w:bookmarkEnd w:id="39"/>
             <w:proofErr w:type="spellEnd"/>
             <w:r>
               <w:rPr>
@@ -25935,7 +25969,7 @@
       <w:rPr>
         <w:noProof/>
       </w:rPr>
-      <w:t>24</w:t>
+      <w:t>52</w:t>
     </w:r>
     <w:r>
       <w:fldChar w:fldCharType="end"/>
@@ -31892,6 +31926,17 @@
       <w:bCs/>
     </w:rPr>
   </w:style>
+  <w:style w:type="paragraph" w:styleId="ListParagraph">
+    <w:name w:val="List Paragraph"/>
+    <w:basedOn w:val="Normal"/>
+    <w:uiPriority w:val="34"/>
+    <w:qFormat/>
+    <w:rsid w:val="00885936"/>
+    <w:pPr>
+      <w:ind w:left="720"/>
+      <w:contextualSpacing/>
+    </w:pPr>
+  </w:style>
 </w:styles>
 </file>
 
@@ -32438,20 +32483,20 @@
 </file>
 
 <file path=customXml/item2.xml><?xml version="1.0" encoding="utf-8"?>
+<p:properties xmlns:p="http://schemas.microsoft.com/office/2006/metadata/properties" xmlns:xsi="http://www.w3.org/2001/XMLSchema-instance" xmlns:pc="http://schemas.microsoft.com/office/infopath/2007/PartnerControls">
+  <documentManagement>
+    <_activity xmlns="a0b9350d-f11b-4c2c-9411-1305d64a2cf9" xsi:nil="true"/>
+  </documentManagement>
+</p:properties>
+</file>
+
+<file path=customXml/item3.xml><?xml version="1.0" encoding="utf-8"?>
 <?mso-contentType ?>
 <FormTemplates xmlns="http://schemas.microsoft.com/sharepoint/v3/contenttype/forms">
   <Display>DocumentLibraryForm</Display>
   <Edit>DocumentLibraryForm</Edit>
   <New>DocumentLibraryForm</New>
 </FormTemplates>
-</file>
-
-<file path=customXml/item3.xml><?xml version="1.0" encoding="utf-8"?>
-<p:properties xmlns:p="http://schemas.microsoft.com/office/2006/metadata/properties" xmlns:xsi="http://www.w3.org/2001/XMLSchema-instance" xmlns:pc="http://schemas.microsoft.com/office/infopath/2007/PartnerControls">
-  <documentManagement>
-    <_activity xmlns="a0b9350d-f11b-4c2c-9411-1305d64a2cf9" xsi:nil="true"/>
-  </documentManagement>
-</p:properties>
 </file>
 
 <file path=customXml/item4.xml><?xml version="1.0" encoding="utf-8"?>
@@ -32478,14 +32523,6 @@
 </file>
 
 <file path=customXml/itemProps2.xml><?xml version="1.0" encoding="utf-8"?>
-<ds:datastoreItem xmlns:ds="http://schemas.openxmlformats.org/officeDocument/2006/customXml" ds:itemID="{CA1C910A-E087-4A41-BE29-FE60FF116498}">
-  <ds:schemaRefs>
-    <ds:schemaRef ds:uri="http://schemas.microsoft.com/sharepoint/v3/contenttype/forms"/>
-  </ds:schemaRefs>
-</ds:datastoreItem>
-</file>
-
-<file path=customXml/itemProps3.xml><?xml version="1.0" encoding="utf-8"?>
 <ds:datastoreItem xmlns:ds="http://schemas.openxmlformats.org/officeDocument/2006/customXml" ds:itemID="{F48E6873-909C-4AED-A304-42171A5F15F4}">
   <ds:schemaRefs>
     <ds:schemaRef ds:uri="http://schemas.microsoft.com/office/2006/metadata/properties"/>
@@ -32495,8 +32532,16 @@
 </ds:datastoreItem>
 </file>
 
+<file path=customXml/itemProps3.xml><?xml version="1.0" encoding="utf-8"?>
+<ds:datastoreItem xmlns:ds="http://schemas.openxmlformats.org/officeDocument/2006/customXml" ds:itemID="{CA1C910A-E087-4A41-BE29-FE60FF116498}">
+  <ds:schemaRefs>
+    <ds:schemaRef ds:uri="http://schemas.microsoft.com/sharepoint/v3/contenttype/forms"/>
+  </ds:schemaRefs>
+</ds:datastoreItem>
+</file>
+
 <file path=customXml/itemProps4.xml><?xml version="1.0" encoding="utf-8"?>
-<ds:datastoreItem xmlns:ds="http://schemas.openxmlformats.org/officeDocument/2006/customXml" ds:itemID="{2E0E3325-F60A-430F-8DC0-085AC7693D67}">
+<ds:datastoreItem xmlns:ds="http://schemas.openxmlformats.org/officeDocument/2006/customXml" ds:itemID="{AA278107-1E87-408E-BC55-64AD4C32AD91}">
   <ds:schemaRefs>
     <ds:schemaRef ds:uri="http://schemas.openxmlformats.org/officeDocument/2006/bibliography"/>
   </ds:schemaRefs>

</xml_diff>

<commit_message>
fix use case numbering and add fci logo
</commit_message>
<xml_diff>
--- a/docs/Money Mirror Documentation.docx
+++ b/docs/Money Mirror Documentation.docx
@@ -9,6 +9,10 @@
         <w:jc w:val="center"/>
         <w:rPr>
           <w:rFonts w:ascii="Times New Roman" w:hAnsi="Times New Roman"/>
+          <w:b w:val="0"/>
+          <w:bCs/>
+          <w:sz w:val="32"/>
+          <w:szCs w:val="32"/>
         </w:rPr>
       </w:pPr>
       <w:r>
@@ -17,9 +21,17 @@
           <w:noProof/>
         </w:rPr>
         <w:drawing>
-          <wp:inline distT="0" distB="0" distL="0" distR="0" wp14:anchorId="76F8AB64" wp14:editId="1692BF48">
+          <wp:anchor distT="0" distB="0" distL="114300" distR="114300" simplePos="0" relativeHeight="251658240" behindDoc="0" locked="0" layoutInCell="1" allowOverlap="1" wp14:anchorId="1D4E81AB" wp14:editId="45771520">
+            <wp:simplePos x="0" y="0"/>
+            <wp:positionH relativeFrom="column">
+              <wp:posOffset>4816475</wp:posOffset>
+            </wp:positionH>
+            <wp:positionV relativeFrom="paragraph">
+              <wp:posOffset>0</wp:posOffset>
+            </wp:positionV>
             <wp:extent cx="1424940" cy="1424940"/>
-            <wp:effectExtent l="0" t="0" r="0" b="0"/>
+            <wp:effectExtent l="0" t="0" r="3810" b="3810"/>
+            <wp:wrapSquare wrapText="bothSides"/>
             <wp:docPr id="1" name="Picture 27"/>
             <wp:cNvGraphicFramePr>
               <a:graphicFrameLocks xmlns:a="http://schemas.openxmlformats.org/drawingml/2006/main" noChangeAspect="1"/>
@@ -62,15 +74,107 @@
                 </pic:pic>
               </a:graphicData>
             </a:graphic>
-          </wp:inline>
+          </wp:anchor>
         </w:drawing>
       </w:r>
       <w:r>
         <w:rPr>
           <w:rFonts w:ascii="Times New Roman" w:hAnsi="Times New Roman"/>
+          <w:b w:val="0"/>
+          <w:bCs/>
+          <w:noProof/>
+          <w:sz w:val="32"/>
+          <w:szCs w:val="32"/>
+        </w:rPr>
+        <w:drawing>
+          <wp:anchor distT="0" distB="0" distL="114300" distR="114300" simplePos="0" relativeHeight="251659264" behindDoc="1" locked="0" layoutInCell="1" allowOverlap="1" wp14:anchorId="22AE1E13" wp14:editId="6956F2B8">
+            <wp:simplePos x="0" y="0"/>
+            <wp:positionH relativeFrom="column">
+              <wp:posOffset>-177588</wp:posOffset>
+            </wp:positionH>
+            <wp:positionV relativeFrom="paragraph">
+              <wp:posOffset>87419</wp:posOffset>
+            </wp:positionV>
+            <wp:extent cx="1177925" cy="1337310"/>
+            <wp:effectExtent l="0" t="0" r="3175" b="0"/>
+            <wp:wrapSquare wrapText="bothSides"/>
+            <wp:docPr id="2" name="Picture 2" descr="F:\1Non-Apps\Money Mirror\pics and docs\Logos\images (1).jpg"/>
+            <wp:cNvGraphicFramePr>
+              <a:graphicFrameLocks xmlns:a="http://schemas.openxmlformats.org/drawingml/2006/main" noChangeAspect="1"/>
+            </wp:cNvGraphicFramePr>
+            <a:graphic xmlns:a="http://schemas.openxmlformats.org/drawingml/2006/main">
+              <a:graphicData uri="http://schemas.openxmlformats.org/drawingml/2006/picture">
+                <pic:pic xmlns:pic="http://schemas.openxmlformats.org/drawingml/2006/picture">
+                  <pic:nvPicPr>
+                    <pic:cNvPr id="0" name="Picture 1" descr="F:\1Non-Apps\Money Mirror\pics and docs\Logos\images (1).jpg"/>
+                    <pic:cNvPicPr>
+                      <a:picLocks noChangeAspect="1" noChangeArrowheads="1"/>
+                    </pic:cNvPicPr>
+                  </pic:nvPicPr>
+                  <pic:blipFill>
+                    <a:blip r:embed="rId12" cstate="print">
+                      <a:extLst>
+                        <a:ext uri="{28A0092B-C50C-407E-A947-70E740481C1C}">
+                          <a14:useLocalDpi xmlns:a14="http://schemas.microsoft.com/office/drawing/2010/main" val="0"/>
+                        </a:ext>
+                      </a:extLst>
+                    </a:blip>
+                    <a:srcRect/>
+                    <a:stretch>
+                      <a:fillRect/>
+                    </a:stretch>
+                  </pic:blipFill>
+                  <pic:spPr bwMode="auto">
+                    <a:xfrm>
+                      <a:off x="0" y="0"/>
+                      <a:ext cx="1177925" cy="1337310"/>
+                    </a:xfrm>
+                    <a:prstGeom prst="rect">
+                      <a:avLst/>
+                    </a:prstGeom>
+                    <a:noFill/>
+                    <a:ln>
+                      <a:noFill/>
+                    </a:ln>
+                  </pic:spPr>
+                </pic:pic>
+              </a:graphicData>
+            </a:graphic>
+          </wp:anchor>
+        </w:drawing>
+      </w:r>
+      <w:r>
+        <w:rPr>
+          <w:rStyle w:val="Normal"/>
+          <w:rFonts w:ascii="Times New Roman" w:hAnsi="Times New Roman"/>
+          <w:snapToGrid w:val="0"/>
+          <w:color w:val="000000"/>
+          <w:w w:val="0"/>
+          <w:sz w:val="0"/>
+          <w:szCs w:val="0"/>
+          <w:u w:color="000000"/>
+          <w:bdr w:val="none" w:sz="0" w:space="0" w:color="000000"/>
+          <w:shd w:val="clear" w:color="000000" w:fill="000000"/>
+          <w:lang w:val="x-none" w:eastAsia="x-none" w:bidi="x-none"/>
+        </w:rPr>
+        <w:t xml:space="preserve"> </w:t>
+      </w:r>
+      <w:r>
+        <w:rPr>
+          <w:rFonts w:ascii="Times New Roman" w:hAnsi="Times New Roman"/>
         </w:rPr>
         <w:br/>
       </w:r>
+    </w:p>
+    <w:p>
+      <w:pPr>
+        <w:pStyle w:val="Title"/>
+        <w:spacing w:line="276" w:lineRule="auto"/>
+        <w:jc w:val="center"/>
+        <w:rPr>
+          <w:rFonts w:ascii="Times New Roman" w:hAnsi="Times New Roman"/>
+        </w:rPr>
+      </w:pPr>
       <w:r>
         <w:rPr>
           <w:rFonts w:ascii="Times New Roman" w:hAnsi="Times New Roman"/>
@@ -95,14 +199,16 @@
         <w:jc w:val="center"/>
         <w:rPr>
           <w:rFonts w:ascii="Times New Roman" w:hAnsi="Times New Roman"/>
+          <w:sz w:val="28"/>
+          <w:szCs w:val="28"/>
         </w:rPr>
       </w:pPr>
       <w:r>
         <w:rPr>
           <w:rFonts w:ascii="Times New Roman" w:hAnsi="Times New Roman"/>
           <w:color w:val="FF0000"/>
-          <w:sz w:val="44"/>
-          <w:szCs w:val="44"/>
+          <w:sz w:val="60"/>
+          <w:szCs w:val="60"/>
         </w:rPr>
         <w:t>Money Mirror</w:t>
       </w:r>
@@ -136,7 +242,19 @@
         <w:rPr>
           <w:rFonts w:ascii="Times New Roman" w:hAnsi="Times New Roman"/>
         </w:rPr>
-        <w:t>Submitted by</w:t>
+        <w:t xml:space="preserve">Under the supervision </w:t>
+      </w:r>
+      <w:r>
+        <w:rPr>
+          <w:rFonts w:ascii="Times New Roman" w:hAnsi="Times New Roman"/>
+        </w:rPr>
+        <w:t>o</w:t>
+      </w:r>
+      <w:r>
+        <w:rPr>
+          <w:rFonts w:ascii="Times New Roman" w:hAnsi="Times New Roman"/>
+        </w:rPr>
+        <w:t>f</w:t>
       </w:r>
       <w:proofErr w:type="gramStart"/>
       <w:r>
@@ -146,69 +264,82 @@
         <w:t>:</w:t>
       </w:r>
       <w:proofErr w:type="gramEnd"/>
-      <w:r>
-        <w:rPr>
-          <w:rFonts w:ascii="Times New Roman" w:hAnsi="Times New Roman"/>
-        </w:rPr>
-        <w:br/>
-      </w:r>
-      <w:r>
-        <w:rPr>
-          <w:rFonts w:ascii="Times New Roman" w:hAnsi="Times New Roman"/>
-        </w:rPr>
-        <w:br/>
-      </w:r>
       <w:r>
         <w:rPr>
           <w:rFonts w:ascii="Times New Roman" w:hAnsi="Times New Roman"/>
           <w:b w:val="0"/>
           <w:bCs/>
         </w:rPr>
-        <w:t xml:space="preserve">1. Jannah Ayman </w:t>
-      </w:r>
+        <w:br/>
+        <w:t xml:space="preserve">Dr. </w:t>
+      </w:r>
+      <w:proofErr w:type="spellStart"/>
       <w:r>
         <w:rPr>
           <w:rFonts w:ascii="Times New Roman" w:hAnsi="Times New Roman"/>
           <w:b w:val="0"/>
           <w:bCs/>
         </w:rPr>
-        <w:t>Abdelraouf (CS)</w:t>
-      </w:r>
+        <w:t>Marwa</w:t>
+      </w:r>
+      <w:proofErr w:type="spellEnd"/>
       <w:r>
         <w:rPr>
           <w:rFonts w:ascii="Times New Roman" w:hAnsi="Times New Roman"/>
           <w:b w:val="0"/>
           <w:bCs/>
         </w:rPr>
-        <w:br/>
-        <w:t xml:space="preserve">2. Nancy Saad Muhammad </w:t>
-      </w:r>
+        <w:t xml:space="preserve"> </w:t>
+      </w:r>
+      <w:proofErr w:type="spellStart"/>
       <w:r>
         <w:rPr>
           <w:rFonts w:ascii="Times New Roman" w:hAnsi="Times New Roman"/>
           <w:b w:val="0"/>
           <w:bCs/>
         </w:rPr>
-        <w:t>(CS</w:t>
-      </w:r>
-      <w:proofErr w:type="gramStart"/>
-      <w:r>
+        <w:t>Hussien</w:t>
+      </w:r>
+      <w:proofErr w:type="spellEnd"/>
+    </w:p>
+    <w:p>
+      <w:pPr>
+        <w:pStyle w:val="ByLine"/>
+        <w:spacing w:line="276" w:lineRule="auto"/>
+        <w:jc w:val="center"/>
         <w:rPr>
           <w:rFonts w:ascii="Times New Roman" w:hAnsi="Times New Roman"/>
           <w:b w:val="0"/>
           <w:bCs/>
         </w:rPr>
-        <w:t>)</w:t>
+      </w:pPr>
+      <w:r>
+        <w:rPr>
+          <w:rFonts w:ascii="Times New Roman" w:hAnsi="Times New Roman"/>
+        </w:rPr>
+        <w:t>Students</w:t>
+      </w:r>
+      <w:proofErr w:type="gramStart"/>
+      <w:r>
+        <w:rPr>
+          <w:rFonts w:ascii="Times New Roman" w:hAnsi="Times New Roman"/>
+        </w:rPr>
+        <w:t>:</w:t>
       </w:r>
       <w:proofErr w:type="gramEnd"/>
+      <w:r>
+        <w:rPr>
+          <w:rFonts w:ascii="Times New Roman" w:hAnsi="Times New Roman"/>
+        </w:rPr>
+        <w:br/>
+      </w:r>
       <w:r>
         <w:rPr>
           <w:rFonts w:ascii="Times New Roman" w:hAnsi="Times New Roman"/>
           <w:b w:val="0"/>
           <w:bCs/>
         </w:rPr>
-        <w:br/>
-        <w:t xml:space="preserve">3. Rawan Sotohy </w:t>
+        <w:t xml:space="preserve">1. Jannah Ayman </w:t>
       </w:r>
       <w:r>
         <w:rPr>
@@ -216,7 +347,7 @@
           <w:b w:val="0"/>
           <w:bCs/>
         </w:rPr>
-        <w:t>Mohamme</w:t>
+        <w:t>Abdelraouf (CS)</w:t>
       </w:r>
       <w:r>
         <w:rPr>
@@ -224,7 +355,8 @@
           <w:b w:val="0"/>
           <w:bCs/>
         </w:rPr>
-        <w:t xml:space="preserve">d </w:t>
+        <w:br/>
+        <w:t xml:space="preserve">2. Nancy Saad Muhammad </w:t>
       </w:r>
       <w:r>
         <w:rPr>
@@ -251,7 +383,7 @@
           <w:bCs/>
         </w:rPr>
         <w:br/>
-        <w:t xml:space="preserve">4. Arwa Hassan </w:t>
+        <w:t xml:space="preserve">3. Rawan Sotohy </w:t>
       </w:r>
       <w:r>
         <w:rPr>
@@ -275,7 +407,7 @@
           <w:b w:val="0"/>
           <w:bCs/>
         </w:rPr>
-        <w:t>(IS</w:t>
+        <w:t>(CS</w:t>
       </w:r>
       <w:proofErr w:type="gramStart"/>
       <w:r>
@@ -294,7 +426,7 @@
           <w:bCs/>
         </w:rPr>
         <w:br/>
-        <w:t xml:space="preserve">5. Rahma Tarek </w:t>
+        <w:t xml:space="preserve">4. Arwa Hassan </w:t>
       </w:r>
       <w:r>
         <w:rPr>
@@ -302,7 +434,7 @@
           <w:b w:val="0"/>
           <w:bCs/>
         </w:rPr>
-        <w:t>Moha</w:t>
+        <w:t>Mohamme</w:t>
       </w:r>
       <w:r>
         <w:rPr>
@@ -310,7 +442,7 @@
           <w:b w:val="0"/>
           <w:bCs/>
         </w:rPr>
-        <w:t>m</w:t>
+        <w:t xml:space="preserve">d </w:t>
       </w:r>
       <w:r>
         <w:rPr>
@@ -318,76 +450,58 @@
           <w:b w:val="0"/>
           <w:bCs/>
         </w:rPr>
-        <w:t>med</w:t>
-      </w:r>
+        <w:t>(IS</w:t>
+      </w:r>
+      <w:proofErr w:type="gramStart"/>
       <w:r>
         <w:rPr>
           <w:rFonts w:ascii="Times New Roman" w:hAnsi="Times New Roman"/>
           <w:b w:val="0"/>
           <w:bCs/>
         </w:rPr>
-        <w:t xml:space="preserve"> </w:t>
-      </w:r>
+        <w:t>)</w:t>
+      </w:r>
+      <w:proofErr w:type="gramEnd"/>
       <w:r>
         <w:rPr>
           <w:rFonts w:ascii="Times New Roman" w:hAnsi="Times New Roman"/>
           <w:b w:val="0"/>
           <w:bCs/>
         </w:rPr>
-        <w:t>(IS</w:t>
-      </w:r>
-      <w:proofErr w:type="gramStart"/>
+        <w:br/>
+        <w:t xml:space="preserve">5. Rahma Tarek </w:t>
+      </w:r>
       <w:r>
         <w:rPr>
           <w:rFonts w:ascii="Times New Roman" w:hAnsi="Times New Roman"/>
           <w:b w:val="0"/>
           <w:bCs/>
         </w:rPr>
-        <w:t>)</w:t>
-      </w:r>
-      <w:proofErr w:type="gramEnd"/>
+        <w:t>Moha</w:t>
+      </w:r>
       <w:r>
         <w:rPr>
           <w:rFonts w:ascii="Times New Roman" w:hAnsi="Times New Roman"/>
           <w:b w:val="0"/>
           <w:bCs/>
         </w:rPr>
-        <w:br/>
-        <w:t>6. Doha Emad Abdeltawab (IS)</w:t>
-      </w:r>
-    </w:p>
-    <w:p>
-      <w:pPr>
-        <w:pStyle w:val="ByLine"/>
-        <w:spacing w:line="276" w:lineRule="auto"/>
-        <w:jc w:val="center"/>
+        <w:t>m</w:t>
+      </w:r>
+      <w:r>
         <w:rPr>
           <w:rFonts w:ascii="Times New Roman" w:hAnsi="Times New Roman"/>
           <w:b w:val="0"/>
           <w:bCs/>
         </w:rPr>
-      </w:pPr>
-      <w:r>
-        <w:rPr>
-          <w:rFonts w:ascii="Times New Roman" w:hAnsi="Times New Roman"/>
-        </w:rPr>
-        <w:t>Submitted to</w:t>
-      </w:r>
-      <w:proofErr w:type="gramStart"/>
-      <w:r>
-        <w:rPr>
-          <w:rFonts w:ascii="Times New Roman" w:hAnsi="Times New Roman"/>
-        </w:rPr>
-        <w:t>:</w:t>
-      </w:r>
-      <w:proofErr w:type="gramEnd"/>
+        <w:t>med</w:t>
+      </w:r>
       <w:r>
         <w:rPr>
           <w:rFonts w:ascii="Times New Roman" w:hAnsi="Times New Roman"/>
           <w:b w:val="0"/>
           <w:bCs/>
         </w:rPr>
-        <w:br/>
+        <w:t xml:space="preserve"> </w:t>
       </w:r>
       <w:r>
         <w:rPr>
@@ -395,7 +509,26 @@
           <w:b w:val="0"/>
           <w:bCs/>
         </w:rPr>
-        <w:t>Dr. Marwa Hussien</w:t>
+        <w:t>(IS</w:t>
+      </w:r>
+      <w:proofErr w:type="gramStart"/>
+      <w:r>
+        <w:rPr>
+          <w:rFonts w:ascii="Times New Roman" w:hAnsi="Times New Roman"/>
+          <w:b w:val="0"/>
+          <w:bCs/>
+        </w:rPr>
+        <w:t>)</w:t>
+      </w:r>
+      <w:proofErr w:type="gramEnd"/>
+      <w:r>
+        <w:rPr>
+          <w:rFonts w:ascii="Times New Roman" w:hAnsi="Times New Roman"/>
+          <w:b w:val="0"/>
+          <w:bCs/>
+        </w:rPr>
+        <w:br/>
+        <w:t>6. Doha Emad Abdeltawab (IS)</w:t>
       </w:r>
     </w:p>
     <w:p>
@@ -424,9 +557,9 @@
           <w:sz w:val="32"/>
         </w:rPr>
         <w:sectPr>
-          <w:footerReference w:type="default" r:id="rId12"/>
+          <w:footerReference w:type="default" r:id="rId13"/>
           <w:pgSz w:w="12240" w:h="15840" w:code="1"/>
-          <w:pgMar w:top="1440" w:right="1440" w:bottom="1440" w:left="1440" w:header="720" w:footer="720" w:gutter="0"/>
+          <w:pgMar w:top="810" w:right="1440" w:bottom="1440" w:left="1440" w:header="720" w:footer="720" w:gutter="0"/>
           <w:pgNumType w:fmt="lowerRoman" w:start="1"/>
           <w:cols w:space="720"/>
         </w:sectPr>
@@ -1725,8 +1858,8 @@
       <w:pPr>
         <w:spacing w:line="276" w:lineRule="auto"/>
         <w:sectPr>
-          <w:headerReference w:type="default" r:id="rId13"/>
-          <w:footerReference w:type="default" r:id="rId14"/>
+          <w:headerReference w:type="default" r:id="rId14"/>
+          <w:footerReference w:type="default" r:id="rId15"/>
           <w:pgSz w:w="12240" w:h="15840" w:code="1"/>
           <w:pgMar w:top="1440" w:right="1440" w:bottom="1170" w:left="1440" w:header="720" w:footer="720" w:gutter="0"/>
           <w:pgNumType w:fmt="lowerRoman"/>
@@ -1743,7 +1876,12 @@
       <w:bookmarkStart w:id="7" w:name="_Toc441230972"/>
       <w:r>
         <w:lastRenderedPageBreak/>
-        <w:t>Introduction</w:t>
+        <w:t>Introducti</w:t>
+      </w:r>
+      <w:bookmarkStart w:id="8" w:name="_GoBack"/>
+      <w:bookmarkEnd w:id="8"/>
+      <w:r>
+        <w:t>on</w:t>
       </w:r>
       <w:bookmarkEnd w:id="6"/>
       <w:bookmarkEnd w:id="7"/>
@@ -1753,13 +1891,13 @@
         <w:pStyle w:val="Heading2"/>
         <w:spacing w:line="276" w:lineRule="auto"/>
       </w:pPr>
-      <w:bookmarkStart w:id="8" w:name="_Toc439994667"/>
-      <w:bookmarkStart w:id="9" w:name="_Toc441230973"/>
+      <w:bookmarkStart w:id="9" w:name="_Toc439994667"/>
+      <w:bookmarkStart w:id="10" w:name="_Toc441230973"/>
       <w:r>
         <w:t>Purpose</w:t>
       </w:r>
-      <w:bookmarkEnd w:id="8"/>
       <w:bookmarkEnd w:id="9"/>
+      <w:bookmarkEnd w:id="10"/>
       <w:r>
         <w:t xml:space="preserve"> </w:t>
       </w:r>
@@ -1808,13 +1946,13 @@
         <w:pStyle w:val="Heading2"/>
         <w:spacing w:line="276" w:lineRule="auto"/>
       </w:pPr>
-      <w:bookmarkStart w:id="10" w:name="_Toc439994669"/>
-      <w:bookmarkStart w:id="11" w:name="_Toc441230975"/>
+      <w:bookmarkStart w:id="11" w:name="_Toc439994669"/>
+      <w:bookmarkStart w:id="12" w:name="_Toc441230975"/>
       <w:r>
         <w:t>Intended Audience and Reading Suggestions</w:t>
       </w:r>
-      <w:bookmarkEnd w:id="10"/>
       <w:bookmarkEnd w:id="11"/>
+      <w:bookmarkEnd w:id="12"/>
     </w:p>
     <w:p>
       <w:pPr>
@@ -1881,8 +2019,8 @@
           <w:szCs w:val="24"/>
         </w:rPr>
       </w:pPr>
-      <w:bookmarkStart w:id="12" w:name="_Toc439994670"/>
-      <w:bookmarkStart w:id="13" w:name="_Toc441230976"/>
+      <w:bookmarkStart w:id="13" w:name="_Toc439994670"/>
+      <w:bookmarkStart w:id="14" w:name="_Toc441230976"/>
       <w:r>
         <w:rPr>
           <w:rFonts w:asciiTheme="majorBidi" w:eastAsia="Arial" w:hAnsiTheme="majorBidi" w:cstheme="majorBidi"/>
@@ -1965,8 +2103,8 @@
       <w:r>
         <w:t>Product Scope</w:t>
       </w:r>
-      <w:bookmarkEnd w:id="12"/>
       <w:bookmarkEnd w:id="13"/>
+      <w:bookmarkEnd w:id="14"/>
     </w:p>
     <w:p>
       <w:pPr>
@@ -2012,8 +2150,8 @@
           <w:szCs w:val="24"/>
         </w:rPr>
       </w:pPr>
-      <w:bookmarkStart w:id="14" w:name="_Toc439994673"/>
-      <w:bookmarkStart w:id="15" w:name="_Toc441230978"/>
+      <w:bookmarkStart w:id="15" w:name="_Toc439994673"/>
+      <w:bookmarkStart w:id="16" w:name="_Toc441230978"/>
       <w:r>
         <w:rPr>
           <w:rFonts w:asciiTheme="majorBidi" w:eastAsia="Arial" w:hAnsiTheme="majorBidi" w:cstheme="majorBidi"/>
@@ -2205,21 +2343,21 @@
         <w:lastRenderedPageBreak/>
         <w:t>Overall Description</w:t>
       </w:r>
-      <w:bookmarkEnd w:id="14"/>
       <w:bookmarkEnd w:id="15"/>
+      <w:bookmarkEnd w:id="16"/>
     </w:p>
     <w:p>
       <w:pPr>
         <w:pStyle w:val="Heading2"/>
         <w:spacing w:line="276" w:lineRule="auto"/>
       </w:pPr>
-      <w:bookmarkStart w:id="16" w:name="_Toc439994674"/>
-      <w:bookmarkStart w:id="17" w:name="_Toc441230979"/>
+      <w:bookmarkStart w:id="17" w:name="_Toc439994674"/>
+      <w:bookmarkStart w:id="18" w:name="_Toc441230979"/>
       <w:r>
         <w:t>Product Perspective</w:t>
       </w:r>
-      <w:bookmarkEnd w:id="16"/>
       <w:bookmarkEnd w:id="17"/>
+      <w:bookmarkEnd w:id="18"/>
     </w:p>
     <w:p>
       <w:pPr>
@@ -2482,13 +2620,13 @@
         <w:pStyle w:val="Heading2"/>
         <w:spacing w:line="276" w:lineRule="auto"/>
       </w:pPr>
-      <w:bookmarkStart w:id="18" w:name="_Toc439994675"/>
-      <w:bookmarkStart w:id="19" w:name="_Toc441230980"/>
+      <w:bookmarkStart w:id="19" w:name="_Toc439994675"/>
+      <w:bookmarkStart w:id="20" w:name="_Toc441230980"/>
       <w:r>
         <w:t>Product Functions</w:t>
       </w:r>
-      <w:bookmarkEnd w:id="18"/>
       <w:bookmarkEnd w:id="19"/>
+      <w:bookmarkEnd w:id="20"/>
       <w:r>
         <w:br/>
       </w:r>
@@ -7627,8 +7765,15 @@
           <w:lang w:bidi="ar-EG"/>
         </w:rPr>
       </w:pPr>
-      <w:bookmarkStart w:id="20" w:name="_Toc439994676"/>
-      <w:bookmarkStart w:id="21" w:name="_Toc441230981"/>
+      <w:bookmarkStart w:id="21" w:name="_Toc439994676"/>
+      <w:bookmarkStart w:id="22" w:name="_Toc441230981"/>
+    </w:p>
+    <w:p>
+      <w:pPr>
+        <w:rPr>
+          <w:lang w:bidi="ar-EG"/>
+        </w:rPr>
+      </w:pPr>
     </w:p>
     <w:tbl>
       <w:tblPr>
@@ -8007,8 +8152,8 @@
         <w:lastRenderedPageBreak/>
         <w:t>User Classes and Characteristics</w:t>
       </w:r>
-      <w:bookmarkEnd w:id="20"/>
       <w:bookmarkEnd w:id="21"/>
+      <w:bookmarkEnd w:id="22"/>
     </w:p>
     <w:p>
       <w:pPr>
@@ -8153,13 +8298,13 @@
         <w:pStyle w:val="Heading2"/>
         <w:spacing w:line="276" w:lineRule="auto"/>
       </w:pPr>
-      <w:bookmarkStart w:id="22" w:name="_Toc439994680"/>
-      <w:bookmarkStart w:id="23" w:name="_Toc441230985"/>
+      <w:bookmarkStart w:id="23" w:name="_Toc439994680"/>
+      <w:bookmarkStart w:id="24" w:name="_Toc441230985"/>
       <w:r>
         <w:t>Assumptions and Dependencies</w:t>
       </w:r>
-      <w:bookmarkEnd w:id="22"/>
       <w:bookmarkEnd w:id="23"/>
+      <w:bookmarkEnd w:id="24"/>
     </w:p>
     <w:p>
       <w:pPr>
@@ -8336,13 +8481,13 @@
         <w:pStyle w:val="Heading2"/>
         <w:spacing w:line="276" w:lineRule="auto"/>
       </w:pPr>
-      <w:bookmarkStart w:id="24" w:name="_Toc439994678"/>
-      <w:bookmarkStart w:id="25" w:name="_Toc441230983"/>
+      <w:bookmarkStart w:id="25" w:name="_Toc439994678"/>
+      <w:bookmarkStart w:id="26" w:name="_Toc441230983"/>
       <w:r>
         <w:t>Design and Implementation Constraints</w:t>
       </w:r>
-      <w:bookmarkEnd w:id="24"/>
       <w:bookmarkEnd w:id="25"/>
+      <w:bookmarkEnd w:id="26"/>
     </w:p>
     <w:p>
       <w:pPr>
@@ -8567,13 +8712,13 @@
         <w:pStyle w:val="Heading2"/>
         <w:spacing w:line="276" w:lineRule="auto"/>
       </w:pPr>
-      <w:bookmarkStart w:id="26" w:name="_Toc439994679"/>
-      <w:bookmarkStart w:id="27" w:name="_Toc441230984"/>
+      <w:bookmarkStart w:id="27" w:name="_Toc439994679"/>
+      <w:bookmarkStart w:id="28" w:name="_Toc441230984"/>
       <w:r>
         <w:t>User Documentation</w:t>
       </w:r>
-      <w:bookmarkEnd w:id="26"/>
       <w:bookmarkEnd w:id="27"/>
+      <w:bookmarkEnd w:id="28"/>
     </w:p>
     <w:p>
       <w:pPr>
@@ -8656,14 +8801,14 @@
         <w:pStyle w:val="Heading1"/>
         <w:spacing w:line="276" w:lineRule="auto"/>
       </w:pPr>
-      <w:bookmarkStart w:id="28" w:name="_Toc439994682"/>
-      <w:bookmarkStart w:id="29" w:name="_Toc441230986"/>
+      <w:bookmarkStart w:id="29" w:name="_Toc439994682"/>
+      <w:bookmarkStart w:id="30" w:name="_Toc441230986"/>
       <w:r>
         <w:lastRenderedPageBreak/>
         <w:t>External Interface Requirements</w:t>
       </w:r>
-      <w:bookmarkEnd w:id="28"/>
       <w:bookmarkEnd w:id="29"/>
+      <w:bookmarkEnd w:id="30"/>
     </w:p>
     <w:p>
       <w:pPr>
@@ -8682,8 +8827,8 @@
           <w:szCs w:val="24"/>
         </w:rPr>
       </w:pPr>
-      <w:bookmarkStart w:id="30" w:name="_Toc439994685"/>
-      <w:bookmarkStart w:id="31" w:name="_Toc441230989"/>
+      <w:bookmarkStart w:id="31" w:name="_Toc439994685"/>
+      <w:bookmarkStart w:id="32" w:name="_Toc441230989"/>
       <w:r>
         <w:rPr>
           <w:rFonts w:asciiTheme="majorBidi" w:hAnsiTheme="majorBidi" w:cstheme="majorBidi"/>
@@ -9323,8 +9468,8 @@
         <w:lastRenderedPageBreak/>
         <w:t>Software Interfaces</w:t>
       </w:r>
-      <w:bookmarkEnd w:id="30"/>
       <w:bookmarkEnd w:id="31"/>
+      <w:bookmarkEnd w:id="32"/>
     </w:p>
     <w:p>
       <w:pPr>
@@ -9972,13 +10117,13 @@
         <w:pStyle w:val="Heading2"/>
         <w:spacing w:line="276" w:lineRule="auto"/>
       </w:pPr>
-      <w:bookmarkStart w:id="32" w:name="_Toc439994686"/>
-      <w:bookmarkStart w:id="33" w:name="_Toc441230990"/>
+      <w:bookmarkStart w:id="33" w:name="_Toc439994686"/>
+      <w:bookmarkStart w:id="34" w:name="_Toc441230990"/>
       <w:r>
         <w:t>Communications Interfaces</w:t>
       </w:r>
-      <w:bookmarkEnd w:id="32"/>
       <w:bookmarkEnd w:id="33"/>
+      <w:bookmarkEnd w:id="34"/>
     </w:p>
     <w:p>
       <w:pPr>
@@ -10279,14 +10424,14 @@
         <w:pStyle w:val="Heading1"/>
         <w:spacing w:line="276" w:lineRule="auto"/>
       </w:pPr>
-      <w:bookmarkStart w:id="34" w:name="_Toc439994687"/>
-      <w:bookmarkStart w:id="35" w:name="_Toc441230991"/>
+      <w:bookmarkStart w:id="35" w:name="_Toc439994687"/>
+      <w:bookmarkStart w:id="36" w:name="_Toc441230991"/>
       <w:r>
         <w:lastRenderedPageBreak/>
         <w:t>S</w:t>
       </w:r>
-      <w:bookmarkEnd w:id="34"/>
       <w:bookmarkEnd w:id="35"/>
+      <w:bookmarkEnd w:id="36"/>
       <w:r>
         <w:t>pecific Requirements</w:t>
       </w:r>
@@ -10345,7 +10490,7 @@
                     </pic:cNvPicPr>
                   </pic:nvPicPr>
                   <pic:blipFill rotWithShape="1">
-                    <a:blip r:embed="rId15" cstate="print">
+                    <a:blip r:embed="rId16" cstate="print">
                       <a:extLst>
                         <a:ext uri="{28A0092B-C50C-407E-A947-70E740481C1C}">
                           <a14:useLocalDpi xmlns:a14="http://schemas.microsoft.com/office/drawing/2010/main" val="0"/>
@@ -10448,7 +10593,7 @@
                     </pic:cNvPicPr>
                   </pic:nvPicPr>
                   <pic:blipFill>
-                    <a:blip r:embed="rId16">
+                    <a:blip r:embed="rId17">
                       <a:extLst>
                         <a:ext uri="{28A0092B-C50C-407E-A947-70E740481C1C}">
                           <a14:useLocalDpi xmlns:a14="http://schemas.microsoft.com/office/drawing/2010/main" val="0"/>
@@ -10542,12 +10687,6 @@
         <w:gridCol w:w="7155"/>
       </w:tblGrid>
       <w:tr>
-        <w:tblPrEx>
-          <w:tblCellMar>
-            <w:top w:w="0" w:type="dxa"/>
-            <w:bottom w:w="0" w:type="dxa"/>
-          </w:tblCellMar>
-        </w:tblPrEx>
         <w:tc>
           <w:tcPr>
             <w:tcW w:w="2200" w:type="dxa"/>
@@ -10614,12 +10753,6 @@
         </w:tc>
       </w:tr>
       <w:tr>
-        <w:tblPrEx>
-          <w:tblCellMar>
-            <w:top w:w="0" w:type="dxa"/>
-            <w:bottom w:w="0" w:type="dxa"/>
-          </w:tblCellMar>
-        </w:tblPrEx>
         <w:tc>
           <w:tcPr>
             <w:tcW w:w="2200" w:type="dxa"/>
@@ -10678,12 +10811,6 @@
         </w:tc>
       </w:tr>
       <w:tr>
-        <w:tblPrEx>
-          <w:tblCellMar>
-            <w:top w:w="0" w:type="dxa"/>
-            <w:bottom w:w="0" w:type="dxa"/>
-          </w:tblCellMar>
-        </w:tblPrEx>
         <w:tc>
           <w:tcPr>
             <w:tcW w:w="2200" w:type="dxa"/>
@@ -10742,12 +10869,6 @@
         </w:tc>
       </w:tr>
       <w:tr>
-        <w:tblPrEx>
-          <w:tblCellMar>
-            <w:top w:w="0" w:type="dxa"/>
-            <w:bottom w:w="0" w:type="dxa"/>
-          </w:tblCellMar>
-        </w:tblPrEx>
         <w:tc>
           <w:tcPr>
             <w:tcW w:w="2200" w:type="dxa"/>
@@ -10806,12 +10927,6 @@
         </w:tc>
       </w:tr>
       <w:tr>
-        <w:tblPrEx>
-          <w:tblCellMar>
-            <w:top w:w="0" w:type="dxa"/>
-            <w:bottom w:w="0" w:type="dxa"/>
-          </w:tblCellMar>
-        </w:tblPrEx>
         <w:tc>
           <w:tcPr>
             <w:tcW w:w="2200" w:type="dxa"/>
@@ -10870,12 +10985,6 @@
         </w:tc>
       </w:tr>
       <w:tr>
-        <w:tblPrEx>
-          <w:tblCellMar>
-            <w:top w:w="0" w:type="dxa"/>
-            <w:bottom w:w="0" w:type="dxa"/>
-          </w:tblCellMar>
-        </w:tblPrEx>
         <w:tc>
           <w:tcPr>
             <w:tcW w:w="2200" w:type="dxa"/>
@@ -10928,7 +11037,49 @@
                 <w:rFonts w:asciiTheme="majorBidi" w:hAnsiTheme="majorBidi" w:cstheme="majorBidi"/>
                 <w:szCs w:val="24"/>
               </w:rPr>
-              <w:t xml:space="preserve">1. Parent selects Sign Up. 2. Enters email and password. 3. System validates and creates account. 4. System sends 6-digit email confirmation code via </w:t>
+              <w:t xml:space="preserve">1. Parent selects Sign Up. </w:t>
+            </w:r>
+            <w:r>
+              <w:rPr>
+                <w:rFonts w:asciiTheme="majorBidi" w:hAnsiTheme="majorBidi" w:cstheme="majorBidi"/>
+                <w:szCs w:val="24"/>
+              </w:rPr>
+              <w:br/>
+            </w:r>
+            <w:r>
+              <w:rPr>
+                <w:rFonts w:asciiTheme="majorBidi" w:hAnsiTheme="majorBidi" w:cstheme="majorBidi"/>
+                <w:szCs w:val="24"/>
+              </w:rPr>
+              <w:t xml:space="preserve">2. Enters email and password. </w:t>
+            </w:r>
+            <w:r>
+              <w:rPr>
+                <w:rFonts w:asciiTheme="majorBidi" w:hAnsiTheme="majorBidi" w:cstheme="majorBidi"/>
+                <w:szCs w:val="24"/>
+              </w:rPr>
+              <w:br/>
+            </w:r>
+            <w:r>
+              <w:rPr>
+                <w:rFonts w:asciiTheme="majorBidi" w:hAnsiTheme="majorBidi" w:cstheme="majorBidi"/>
+                <w:szCs w:val="24"/>
+              </w:rPr>
+              <w:t xml:space="preserve">3. System validates and creates account. </w:t>
+            </w:r>
+            <w:r>
+              <w:rPr>
+                <w:rFonts w:asciiTheme="majorBidi" w:hAnsiTheme="majorBidi" w:cstheme="majorBidi"/>
+                <w:szCs w:val="24"/>
+              </w:rPr>
+              <w:br/>
+            </w:r>
+            <w:r>
+              <w:rPr>
+                <w:rFonts w:asciiTheme="majorBidi" w:hAnsiTheme="majorBidi" w:cstheme="majorBidi"/>
+                <w:szCs w:val="24"/>
+              </w:rPr>
+              <w:t xml:space="preserve">4. System sends 6-digit email confirmation code via </w:t>
             </w:r>
             <w:proofErr w:type="spellStart"/>
             <w:r>
@@ -10944,18 +11095,40 @@
                 <w:rFonts w:asciiTheme="majorBidi" w:hAnsiTheme="majorBidi" w:cstheme="majorBidi"/>
                 <w:szCs w:val="24"/>
               </w:rPr>
-              <w:t>. 5. Parent enters code to confirm email. 6. Parent is automatically logged in.</w:t>
+              <w:t xml:space="preserve">. </w:t>
+            </w:r>
+            <w:r>
+              <w:rPr>
+                <w:rFonts w:asciiTheme="majorBidi" w:hAnsiTheme="majorBidi" w:cstheme="majorBidi"/>
+                <w:szCs w:val="24"/>
+              </w:rPr>
+              <w:br/>
+            </w:r>
+            <w:r>
+              <w:rPr>
+                <w:rFonts w:asciiTheme="majorBidi" w:hAnsiTheme="majorBidi" w:cstheme="majorBidi"/>
+                <w:szCs w:val="24"/>
+              </w:rPr>
+              <w:t xml:space="preserve">5. Parent enters code to confirm email. </w:t>
+            </w:r>
+            <w:r>
+              <w:rPr>
+                <w:rFonts w:asciiTheme="majorBidi" w:hAnsiTheme="majorBidi" w:cstheme="majorBidi"/>
+                <w:szCs w:val="24"/>
+              </w:rPr>
+              <w:br/>
+            </w:r>
+            <w:r>
+              <w:rPr>
+                <w:rFonts w:asciiTheme="majorBidi" w:hAnsiTheme="majorBidi" w:cstheme="majorBidi"/>
+                <w:szCs w:val="24"/>
+              </w:rPr>
+              <w:t>6. Parent is automatically logged in.</w:t>
             </w:r>
           </w:p>
         </w:tc>
       </w:tr>
       <w:tr>
-        <w:tblPrEx>
-          <w:tblCellMar>
-            <w:top w:w="0" w:type="dxa"/>
-            <w:bottom w:w="0" w:type="dxa"/>
-          </w:tblCellMar>
-        </w:tblPrEx>
         <w:tc>
           <w:tcPr>
             <w:tcW w:w="2200" w:type="dxa"/>
@@ -11063,12 +11236,6 @@
         <w:gridCol w:w="7155"/>
       </w:tblGrid>
       <w:tr>
-        <w:tblPrEx>
-          <w:tblCellMar>
-            <w:top w:w="0" w:type="dxa"/>
-            <w:bottom w:w="0" w:type="dxa"/>
-          </w:tblCellMar>
-        </w:tblPrEx>
         <w:trPr>
           <w:trHeight w:val="359"/>
         </w:trPr>
@@ -11140,12 +11307,6 @@
         </w:tc>
       </w:tr>
       <w:tr>
-        <w:tblPrEx>
-          <w:tblCellMar>
-            <w:top w:w="0" w:type="dxa"/>
-            <w:bottom w:w="0" w:type="dxa"/>
-          </w:tblCellMar>
-        </w:tblPrEx>
         <w:tc>
           <w:tcPr>
             <w:tcW w:w="2200" w:type="dxa"/>
@@ -11208,12 +11369,6 @@
         </w:tc>
       </w:tr>
       <w:tr>
-        <w:tblPrEx>
-          <w:tblCellMar>
-            <w:top w:w="0" w:type="dxa"/>
-            <w:bottom w:w="0" w:type="dxa"/>
-          </w:tblCellMar>
-        </w:tblPrEx>
         <w:tc>
           <w:tcPr>
             <w:tcW w:w="2200" w:type="dxa"/>
@@ -11276,12 +11431,6 @@
         </w:tc>
       </w:tr>
       <w:tr>
-        <w:tblPrEx>
-          <w:tblCellMar>
-            <w:top w:w="0" w:type="dxa"/>
-            <w:bottom w:w="0" w:type="dxa"/>
-          </w:tblCellMar>
-        </w:tblPrEx>
         <w:tc>
           <w:tcPr>
             <w:tcW w:w="2200" w:type="dxa"/>
@@ -11344,12 +11493,6 @@
         </w:tc>
       </w:tr>
       <w:tr>
-        <w:tblPrEx>
-          <w:tblCellMar>
-            <w:top w:w="0" w:type="dxa"/>
-            <w:bottom w:w="0" w:type="dxa"/>
-          </w:tblCellMar>
-        </w:tblPrEx>
         <w:tc>
           <w:tcPr>
             <w:tcW w:w="2200" w:type="dxa"/>
@@ -11412,12 +11555,6 @@
         </w:tc>
       </w:tr>
       <w:tr>
-        <w:tblPrEx>
-          <w:tblCellMar>
-            <w:top w:w="0" w:type="dxa"/>
-            <w:bottom w:w="0" w:type="dxa"/>
-          </w:tblCellMar>
-        </w:tblPrEx>
         <w:tc>
           <w:tcPr>
             <w:tcW w:w="2200" w:type="dxa"/>
@@ -11474,18 +11611,76 @@
                 <w:color w:val="000000" w:themeColor="text1"/>
                 <w:szCs w:val="24"/>
               </w:rPr>
-              <w:t>1. Child selects Child Login. 2. Enters the 6-character code. 3. System verifies code and loads child profile. 4. JWT tokens issued. 5. Child sees their dashboard.</w:t>
+              <w:t xml:space="preserve">1. Child selects Child Login. </w:t>
+            </w:r>
+            <w:r>
+              <w:rPr>
+                <w:rFonts w:asciiTheme="majorBidi" w:hAnsiTheme="majorBidi" w:cstheme="majorBidi"/>
+                <w:color w:val="000000" w:themeColor="text1"/>
+                <w:szCs w:val="24"/>
+              </w:rPr>
+              <w:br/>
+            </w:r>
+            <w:r>
+              <w:rPr>
+                <w:rFonts w:asciiTheme="majorBidi" w:hAnsiTheme="majorBidi" w:cstheme="majorBidi"/>
+                <w:color w:val="000000" w:themeColor="text1"/>
+                <w:szCs w:val="24"/>
+              </w:rPr>
+              <w:t xml:space="preserve">2. Enters the 6-character code. </w:t>
+            </w:r>
+            <w:r>
+              <w:rPr>
+                <w:rFonts w:asciiTheme="majorBidi" w:hAnsiTheme="majorBidi" w:cstheme="majorBidi"/>
+                <w:color w:val="000000" w:themeColor="text1"/>
+                <w:szCs w:val="24"/>
+              </w:rPr>
+              <w:br/>
+            </w:r>
+            <w:r>
+              <w:rPr>
+                <w:rFonts w:asciiTheme="majorBidi" w:hAnsiTheme="majorBidi" w:cstheme="majorBidi"/>
+                <w:color w:val="000000" w:themeColor="text1"/>
+                <w:szCs w:val="24"/>
+              </w:rPr>
+              <w:t xml:space="preserve">3. System verifies code and loads child profile. </w:t>
+            </w:r>
+            <w:r>
+              <w:rPr>
+                <w:rFonts w:asciiTheme="majorBidi" w:hAnsiTheme="majorBidi" w:cstheme="majorBidi"/>
+                <w:color w:val="000000" w:themeColor="text1"/>
+                <w:szCs w:val="24"/>
+              </w:rPr>
+              <w:br/>
+            </w:r>
+            <w:r>
+              <w:rPr>
+                <w:rFonts w:asciiTheme="majorBidi" w:hAnsiTheme="majorBidi" w:cstheme="majorBidi"/>
+                <w:color w:val="000000" w:themeColor="text1"/>
+                <w:szCs w:val="24"/>
+              </w:rPr>
+              <w:t xml:space="preserve">4. JWT tokens issued. </w:t>
+            </w:r>
+            <w:r>
+              <w:rPr>
+                <w:rFonts w:asciiTheme="majorBidi" w:hAnsiTheme="majorBidi" w:cstheme="majorBidi"/>
+                <w:color w:val="000000" w:themeColor="text1"/>
+                <w:szCs w:val="24"/>
+              </w:rPr>
+              <w:br/>
+            </w:r>
+            <w:r>
+              <w:rPr>
+                <w:rFonts w:asciiTheme="majorBidi" w:hAnsiTheme="majorBidi" w:cstheme="majorBidi"/>
+                <w:color w:val="000000" w:themeColor="text1"/>
+                <w:szCs w:val="24"/>
+              </w:rPr>
+              <w:t>5. Child sees their dashboard.</w:t>
             </w:r>
           </w:p>
         </w:tc>
       </w:tr>
       <w:tr>
-        <w:tblPrEx>
-          <w:tblCellMar>
-            <w:top w:w="0" w:type="dxa"/>
-            <w:bottom w:w="0" w:type="dxa"/>
-          </w:tblCellMar>
-        </w:tblPrEx>
         <w:tc>
           <w:tcPr>
             <w:tcW w:w="2200" w:type="dxa"/>
@@ -11548,46 +11743,6 @@
         </w:tc>
       </w:tr>
     </w:tbl>
-    <w:p>
-      <w:pPr>
-        <w:spacing w:after="80"/>
-        <w:rPr>
-          <w:rFonts w:asciiTheme="majorBidi" w:hAnsiTheme="majorBidi" w:cstheme="majorBidi"/>
-          <w:color w:val="000000" w:themeColor="text1"/>
-          <w:szCs w:val="24"/>
-        </w:rPr>
-      </w:pPr>
-    </w:p>
-    <w:p>
-      <w:pPr>
-        <w:spacing w:after="80"/>
-        <w:rPr>
-          <w:rFonts w:asciiTheme="majorBidi" w:hAnsiTheme="majorBidi" w:cstheme="majorBidi"/>
-          <w:color w:val="000000" w:themeColor="text1"/>
-          <w:szCs w:val="24"/>
-        </w:rPr>
-      </w:pPr>
-    </w:p>
-    <w:p>
-      <w:pPr>
-        <w:spacing w:after="80"/>
-        <w:rPr>
-          <w:rFonts w:asciiTheme="majorBidi" w:hAnsiTheme="majorBidi" w:cstheme="majorBidi"/>
-          <w:color w:val="000000" w:themeColor="text1"/>
-          <w:szCs w:val="24"/>
-        </w:rPr>
-      </w:pPr>
-    </w:p>
-    <w:p>
-      <w:pPr>
-        <w:spacing w:after="80"/>
-        <w:rPr>
-          <w:rFonts w:asciiTheme="majorBidi" w:hAnsiTheme="majorBidi" w:cstheme="majorBidi"/>
-          <w:color w:val="000000" w:themeColor="text1"/>
-          <w:szCs w:val="24"/>
-        </w:rPr>
-      </w:pPr>
-    </w:p>
     <w:p>
       <w:pPr>
         <w:spacing w:after="80"/>
@@ -11700,12 +11855,6 @@
         <w:gridCol w:w="7159"/>
       </w:tblGrid>
       <w:tr>
-        <w:tblPrEx>
-          <w:tblCellMar>
-            <w:top w:w="0" w:type="dxa"/>
-            <w:bottom w:w="0" w:type="dxa"/>
-          </w:tblCellMar>
-        </w:tblPrEx>
         <w:tc>
           <w:tcPr>
             <w:tcW w:w="2200" w:type="dxa"/>
@@ -11774,12 +11923,6 @@
         </w:tc>
       </w:tr>
       <w:tr>
-        <w:tblPrEx>
-          <w:tblCellMar>
-            <w:top w:w="0" w:type="dxa"/>
-            <w:bottom w:w="0" w:type="dxa"/>
-          </w:tblCellMar>
-        </w:tblPrEx>
         <w:tc>
           <w:tcPr>
             <w:tcW w:w="2200" w:type="dxa"/>
@@ -11842,12 +11985,6 @@
         </w:tc>
       </w:tr>
       <w:tr>
-        <w:tblPrEx>
-          <w:tblCellMar>
-            <w:top w:w="0" w:type="dxa"/>
-            <w:bottom w:w="0" w:type="dxa"/>
-          </w:tblCellMar>
-        </w:tblPrEx>
         <w:tc>
           <w:tcPr>
             <w:tcW w:w="2200" w:type="dxa"/>
@@ -11910,12 +12047,6 @@
         </w:tc>
       </w:tr>
       <w:tr>
-        <w:tblPrEx>
-          <w:tblCellMar>
-            <w:top w:w="0" w:type="dxa"/>
-            <w:bottom w:w="0" w:type="dxa"/>
-          </w:tblCellMar>
-        </w:tblPrEx>
         <w:tc>
           <w:tcPr>
             <w:tcW w:w="2200" w:type="dxa"/>
@@ -11978,12 +12109,6 @@
         </w:tc>
       </w:tr>
       <w:tr>
-        <w:tblPrEx>
-          <w:tblCellMar>
-            <w:top w:w="0" w:type="dxa"/>
-            <w:bottom w:w="0" w:type="dxa"/>
-          </w:tblCellMar>
-        </w:tblPrEx>
         <w:tc>
           <w:tcPr>
             <w:tcW w:w="2200" w:type="dxa"/>
@@ -12046,12 +12171,6 @@
         </w:tc>
       </w:tr>
       <w:tr>
-        <w:tblPrEx>
-          <w:tblCellMar>
-            <w:top w:w="0" w:type="dxa"/>
-            <w:bottom w:w="0" w:type="dxa"/>
-          </w:tblCellMar>
-        </w:tblPrEx>
         <w:tc>
           <w:tcPr>
             <w:tcW w:w="2200" w:type="dxa"/>
@@ -12108,18 +12227,60 @@
                 <w:color w:val="000000" w:themeColor="text1"/>
                 <w:szCs w:val="24"/>
               </w:rPr>
-              <w:t>1. Dashboard shows all linked children as cards. 2. Parent selects a child. 3. App loads selected child's data (balance, expenses, goals, personality). 4. Parent can switch children at any time.</w:t>
+              <w:t xml:space="preserve">1. Dashboard shows all linked children as cards. </w:t>
+            </w:r>
+            <w:r>
+              <w:rPr>
+                <w:rFonts w:asciiTheme="majorBidi" w:hAnsiTheme="majorBidi" w:cstheme="majorBidi"/>
+                <w:color w:val="000000" w:themeColor="text1"/>
+                <w:szCs w:val="24"/>
+              </w:rPr>
+              <w:br/>
+            </w:r>
+            <w:r>
+              <w:rPr>
+                <w:rFonts w:asciiTheme="majorBidi" w:hAnsiTheme="majorBidi" w:cstheme="majorBidi"/>
+                <w:color w:val="000000" w:themeColor="text1"/>
+                <w:szCs w:val="24"/>
+              </w:rPr>
+              <w:t xml:space="preserve">2. Parent selects a child. </w:t>
+            </w:r>
+            <w:r>
+              <w:rPr>
+                <w:rFonts w:asciiTheme="majorBidi" w:hAnsiTheme="majorBidi" w:cstheme="majorBidi"/>
+                <w:color w:val="000000" w:themeColor="text1"/>
+                <w:szCs w:val="24"/>
+              </w:rPr>
+              <w:br/>
+            </w:r>
+            <w:r>
+              <w:rPr>
+                <w:rFonts w:asciiTheme="majorBidi" w:hAnsiTheme="majorBidi" w:cstheme="majorBidi"/>
+                <w:color w:val="000000" w:themeColor="text1"/>
+                <w:szCs w:val="24"/>
+              </w:rPr>
+              <w:t xml:space="preserve">3. App loads selected child's data (balance, expenses, goals, personality). </w:t>
+            </w:r>
+            <w:r>
+              <w:rPr>
+                <w:rFonts w:asciiTheme="majorBidi" w:hAnsiTheme="majorBidi" w:cstheme="majorBidi"/>
+                <w:color w:val="000000" w:themeColor="text1"/>
+                <w:szCs w:val="24"/>
+              </w:rPr>
+              <w:br/>
+            </w:r>
+            <w:r>
+              <w:rPr>
+                <w:rFonts w:asciiTheme="majorBidi" w:hAnsiTheme="majorBidi" w:cstheme="majorBidi"/>
+                <w:color w:val="000000" w:themeColor="text1"/>
+                <w:szCs w:val="24"/>
+              </w:rPr>
+              <w:t>4. Parent can switch children at any time.</w:t>
             </w:r>
           </w:p>
         </w:tc>
       </w:tr>
       <w:tr>
-        <w:tblPrEx>
-          <w:tblCellMar>
-            <w:top w:w="0" w:type="dxa"/>
-            <w:bottom w:w="0" w:type="dxa"/>
-          </w:tblCellMar>
-        </w:tblPrEx>
         <w:tc>
           <w:tcPr>
             <w:tcW w:w="2200" w:type="dxa"/>
@@ -12234,12 +12395,6 @@
         <w:gridCol w:w="7159"/>
       </w:tblGrid>
       <w:tr>
-        <w:tblPrEx>
-          <w:tblCellMar>
-            <w:top w:w="0" w:type="dxa"/>
-            <w:bottom w:w="0" w:type="dxa"/>
-          </w:tblCellMar>
-        </w:tblPrEx>
         <w:tc>
           <w:tcPr>
             <w:tcW w:w="2200" w:type="dxa"/>
@@ -12308,12 +12463,6 @@
         </w:tc>
       </w:tr>
       <w:tr>
-        <w:tblPrEx>
-          <w:tblCellMar>
-            <w:top w:w="0" w:type="dxa"/>
-            <w:bottom w:w="0" w:type="dxa"/>
-          </w:tblCellMar>
-        </w:tblPrEx>
         <w:tc>
           <w:tcPr>
             <w:tcW w:w="2200" w:type="dxa"/>
@@ -12376,12 +12525,6 @@
         </w:tc>
       </w:tr>
       <w:tr>
-        <w:tblPrEx>
-          <w:tblCellMar>
-            <w:top w:w="0" w:type="dxa"/>
-            <w:bottom w:w="0" w:type="dxa"/>
-          </w:tblCellMar>
-        </w:tblPrEx>
         <w:tc>
           <w:tcPr>
             <w:tcW w:w="2200" w:type="dxa"/>
@@ -12444,12 +12587,6 @@
         </w:tc>
       </w:tr>
       <w:tr>
-        <w:tblPrEx>
-          <w:tblCellMar>
-            <w:top w:w="0" w:type="dxa"/>
-            <w:bottom w:w="0" w:type="dxa"/>
-          </w:tblCellMar>
-        </w:tblPrEx>
         <w:tc>
           <w:tcPr>
             <w:tcW w:w="2200" w:type="dxa"/>
@@ -12512,12 +12649,6 @@
         </w:tc>
       </w:tr>
       <w:tr>
-        <w:tblPrEx>
-          <w:tblCellMar>
-            <w:top w:w="0" w:type="dxa"/>
-            <w:bottom w:w="0" w:type="dxa"/>
-          </w:tblCellMar>
-        </w:tblPrEx>
         <w:tc>
           <w:tcPr>
             <w:tcW w:w="2200" w:type="dxa"/>
@@ -12580,12 +12711,6 @@
         </w:tc>
       </w:tr>
       <w:tr>
-        <w:tblPrEx>
-          <w:tblCellMar>
-            <w:top w:w="0" w:type="dxa"/>
-            <w:bottom w:w="0" w:type="dxa"/>
-          </w:tblCellMar>
-        </w:tblPrEx>
         <w:tc>
           <w:tcPr>
             <w:tcW w:w="2200" w:type="dxa"/>
@@ -12642,18 +12767,92 @@
                 <w:color w:val="000000" w:themeColor="text1"/>
                 <w:szCs w:val="24"/>
               </w:rPr>
-              <w:t>1. Parent selects Add New Child. 2. Enters child's basic info (name, DOB, gender, relationship). 3. Completes the 9-question profiling questionnaire. 4. System calls Python AI service to calculate initial personality type. 5. System generates unique 6-character login code. 6. Parent receives the code to share with the child.</w:t>
+              <w:t xml:space="preserve">1. Parent selects Add New Child. </w:t>
+            </w:r>
+            <w:r>
+              <w:rPr>
+                <w:rFonts w:asciiTheme="majorBidi" w:hAnsiTheme="majorBidi" w:cstheme="majorBidi"/>
+                <w:color w:val="000000" w:themeColor="text1"/>
+                <w:szCs w:val="24"/>
+              </w:rPr>
+              <w:br/>
+            </w:r>
+            <w:r>
+              <w:rPr>
+                <w:rFonts w:asciiTheme="majorBidi" w:hAnsiTheme="majorBidi" w:cstheme="majorBidi"/>
+                <w:color w:val="000000" w:themeColor="text1"/>
+                <w:szCs w:val="24"/>
+              </w:rPr>
+              <w:t xml:space="preserve">2. Enters child's basic info (name, DOB, gender, relationship). </w:t>
+            </w:r>
+            <w:r>
+              <w:rPr>
+                <w:rFonts w:asciiTheme="majorBidi" w:hAnsiTheme="majorBidi" w:cstheme="majorBidi"/>
+                <w:color w:val="000000" w:themeColor="text1"/>
+                <w:szCs w:val="24"/>
+              </w:rPr>
+              <w:br/>
+            </w:r>
+            <w:r>
+              <w:rPr>
+                <w:rFonts w:asciiTheme="majorBidi" w:hAnsiTheme="majorBidi" w:cstheme="majorBidi"/>
+                <w:color w:val="000000" w:themeColor="text1"/>
+                <w:szCs w:val="24"/>
+              </w:rPr>
+              <w:t xml:space="preserve">3. Completes the 9-question profiling questionnaire. </w:t>
+            </w:r>
+            <w:r>
+              <w:rPr>
+                <w:rFonts w:asciiTheme="majorBidi" w:hAnsiTheme="majorBidi" w:cstheme="majorBidi"/>
+                <w:color w:val="000000" w:themeColor="text1"/>
+                <w:szCs w:val="24"/>
+              </w:rPr>
+              <w:br/>
+            </w:r>
+            <w:r>
+              <w:rPr>
+                <w:rFonts w:asciiTheme="majorBidi" w:hAnsiTheme="majorBidi" w:cstheme="majorBidi"/>
+                <w:color w:val="000000" w:themeColor="text1"/>
+                <w:szCs w:val="24"/>
+              </w:rPr>
+              <w:t xml:space="preserve">4. System calls Python AI service to calculate initial personality type. </w:t>
+            </w:r>
+            <w:r>
+              <w:rPr>
+                <w:rFonts w:asciiTheme="majorBidi" w:hAnsiTheme="majorBidi" w:cstheme="majorBidi"/>
+                <w:color w:val="000000" w:themeColor="text1"/>
+                <w:szCs w:val="24"/>
+              </w:rPr>
+              <w:br/>
+            </w:r>
+            <w:r>
+              <w:rPr>
+                <w:rFonts w:asciiTheme="majorBidi" w:hAnsiTheme="majorBidi" w:cstheme="majorBidi"/>
+                <w:color w:val="000000" w:themeColor="text1"/>
+                <w:szCs w:val="24"/>
+              </w:rPr>
+              <w:t xml:space="preserve">5. System generates unique 6-character login code. </w:t>
+            </w:r>
+            <w:r>
+              <w:rPr>
+                <w:rFonts w:asciiTheme="majorBidi" w:hAnsiTheme="majorBidi" w:cstheme="majorBidi"/>
+                <w:color w:val="000000" w:themeColor="text1"/>
+                <w:szCs w:val="24"/>
+              </w:rPr>
+              <w:br/>
+            </w:r>
+            <w:r>
+              <w:rPr>
+                <w:rFonts w:asciiTheme="majorBidi" w:hAnsiTheme="majorBidi" w:cstheme="majorBidi"/>
+                <w:color w:val="000000" w:themeColor="text1"/>
+                <w:szCs w:val="24"/>
+              </w:rPr>
+              <w:t>6. Parent receives the code to share with the child.</w:t>
             </w:r>
           </w:p>
         </w:tc>
       </w:tr>
       <w:tr>
-        <w:tblPrEx>
-          <w:tblCellMar>
-            <w:top w:w="0" w:type="dxa"/>
-            <w:bottom w:w="0" w:type="dxa"/>
-          </w:tblCellMar>
-        </w:tblPrEx>
         <w:tc>
           <w:tcPr>
             <w:tcW w:w="2200" w:type="dxa"/>
@@ -12716,36 +12915,6 @@
         </w:tc>
       </w:tr>
     </w:tbl>
-    <w:p>
-      <w:pPr>
-        <w:spacing w:after="80"/>
-        <w:rPr>
-          <w:rFonts w:asciiTheme="majorBidi" w:hAnsiTheme="majorBidi" w:cstheme="majorBidi"/>
-          <w:color w:val="000000" w:themeColor="text1"/>
-          <w:szCs w:val="24"/>
-        </w:rPr>
-      </w:pPr>
-    </w:p>
-    <w:p>
-      <w:pPr>
-        <w:spacing w:after="80"/>
-        <w:rPr>
-          <w:rFonts w:asciiTheme="majorBidi" w:hAnsiTheme="majorBidi" w:cstheme="majorBidi"/>
-          <w:color w:val="000000" w:themeColor="text1"/>
-          <w:szCs w:val="24"/>
-        </w:rPr>
-      </w:pPr>
-    </w:p>
-    <w:p>
-      <w:pPr>
-        <w:spacing w:after="80"/>
-        <w:rPr>
-          <w:rFonts w:asciiTheme="majorBidi" w:hAnsiTheme="majorBidi" w:cstheme="majorBidi"/>
-          <w:color w:val="000000" w:themeColor="text1"/>
-          <w:szCs w:val="24"/>
-        </w:rPr>
-      </w:pPr>
-    </w:p>
     <w:p>
       <w:pPr>
         <w:spacing w:after="80"/>
@@ -12848,12 +13017,6 @@
         <w:gridCol w:w="7159"/>
       </w:tblGrid>
       <w:tr>
-        <w:tblPrEx>
-          <w:tblCellMar>
-            <w:top w:w="0" w:type="dxa"/>
-            <w:bottom w:w="0" w:type="dxa"/>
-          </w:tblCellMar>
-        </w:tblPrEx>
         <w:tc>
           <w:tcPr>
             <w:tcW w:w="2200" w:type="dxa"/>
@@ -12922,12 +13085,6 @@
         </w:tc>
       </w:tr>
       <w:tr>
-        <w:tblPrEx>
-          <w:tblCellMar>
-            <w:top w:w="0" w:type="dxa"/>
-            <w:bottom w:w="0" w:type="dxa"/>
-          </w:tblCellMar>
-        </w:tblPrEx>
         <w:tc>
           <w:tcPr>
             <w:tcW w:w="2200" w:type="dxa"/>
@@ -12990,12 +13147,6 @@
         </w:tc>
       </w:tr>
       <w:tr>
-        <w:tblPrEx>
-          <w:tblCellMar>
-            <w:top w:w="0" w:type="dxa"/>
-            <w:bottom w:w="0" w:type="dxa"/>
-          </w:tblCellMar>
-        </w:tblPrEx>
         <w:tc>
           <w:tcPr>
             <w:tcW w:w="2200" w:type="dxa"/>
@@ -13058,12 +13209,6 @@
         </w:tc>
       </w:tr>
       <w:tr>
-        <w:tblPrEx>
-          <w:tblCellMar>
-            <w:top w:w="0" w:type="dxa"/>
-            <w:bottom w:w="0" w:type="dxa"/>
-          </w:tblCellMar>
-        </w:tblPrEx>
         <w:tc>
           <w:tcPr>
             <w:tcW w:w="2200" w:type="dxa"/>
@@ -13126,12 +13271,6 @@
         </w:tc>
       </w:tr>
       <w:tr>
-        <w:tblPrEx>
-          <w:tblCellMar>
-            <w:top w:w="0" w:type="dxa"/>
-            <w:bottom w:w="0" w:type="dxa"/>
-          </w:tblCellMar>
-        </w:tblPrEx>
         <w:tc>
           <w:tcPr>
             <w:tcW w:w="2200" w:type="dxa"/>
@@ -13194,12 +13333,6 @@
         </w:tc>
       </w:tr>
       <w:tr>
-        <w:tblPrEx>
-          <w:tblCellMar>
-            <w:top w:w="0" w:type="dxa"/>
-            <w:bottom w:w="0" w:type="dxa"/>
-          </w:tblCellMar>
-        </w:tblPrEx>
         <w:tc>
           <w:tcPr>
             <w:tcW w:w="2200" w:type="dxa"/>
@@ -13256,7 +13389,71 @@
                 <w:color w:val="000000" w:themeColor="text1"/>
                 <w:szCs w:val="24"/>
               </w:rPr>
-              <w:t xml:space="preserve">1. Parent selects a child. 2. Navigates to Allowance section. 3. Sets allowance type (Daily/Weekly/Monthly), amount, and schedule. 4. System stores schedule in DB. 5. </w:t>
+              <w:t xml:space="preserve">1. Parent selects a child. </w:t>
+            </w:r>
+            <w:r>
+              <w:rPr>
+                <w:rFonts w:asciiTheme="majorBidi" w:hAnsiTheme="majorBidi" w:cstheme="majorBidi"/>
+                <w:color w:val="000000" w:themeColor="text1"/>
+                <w:szCs w:val="24"/>
+              </w:rPr>
+              <w:br/>
+            </w:r>
+            <w:r>
+              <w:rPr>
+                <w:rFonts w:asciiTheme="majorBidi" w:hAnsiTheme="majorBidi" w:cstheme="majorBidi"/>
+                <w:color w:val="000000" w:themeColor="text1"/>
+                <w:szCs w:val="24"/>
+              </w:rPr>
+              <w:t xml:space="preserve">2. Navigates to Allowance section. </w:t>
+            </w:r>
+            <w:r>
+              <w:rPr>
+                <w:rFonts w:asciiTheme="majorBidi" w:hAnsiTheme="majorBidi" w:cstheme="majorBidi"/>
+                <w:color w:val="000000" w:themeColor="text1"/>
+                <w:szCs w:val="24"/>
+              </w:rPr>
+              <w:br/>
+            </w:r>
+            <w:r>
+              <w:rPr>
+                <w:rFonts w:asciiTheme="majorBidi" w:hAnsiTheme="majorBidi" w:cstheme="majorBidi"/>
+                <w:color w:val="000000" w:themeColor="text1"/>
+                <w:szCs w:val="24"/>
+              </w:rPr>
+              <w:t xml:space="preserve">3. Sets allowance type (Daily/Weekly/Monthly), amount, and schedule. </w:t>
+            </w:r>
+            <w:r>
+              <w:rPr>
+                <w:rFonts w:asciiTheme="majorBidi" w:hAnsiTheme="majorBidi" w:cstheme="majorBidi"/>
+                <w:color w:val="000000" w:themeColor="text1"/>
+                <w:szCs w:val="24"/>
+              </w:rPr>
+              <w:br/>
+            </w:r>
+            <w:r>
+              <w:rPr>
+                <w:rFonts w:asciiTheme="majorBidi" w:hAnsiTheme="majorBidi" w:cstheme="majorBidi"/>
+                <w:color w:val="000000" w:themeColor="text1"/>
+                <w:szCs w:val="24"/>
+              </w:rPr>
+              <w:t xml:space="preserve">4. System stores schedule in DB. </w:t>
+            </w:r>
+            <w:r>
+              <w:rPr>
+                <w:rFonts w:asciiTheme="majorBidi" w:hAnsiTheme="majorBidi" w:cstheme="majorBidi"/>
+                <w:color w:val="000000" w:themeColor="text1"/>
+                <w:szCs w:val="24"/>
+              </w:rPr>
+              <w:br/>
+            </w:r>
+            <w:r>
+              <w:rPr>
+                <w:rFonts w:asciiTheme="majorBidi" w:hAnsiTheme="majorBidi" w:cstheme="majorBidi"/>
+                <w:color w:val="000000" w:themeColor="text1"/>
+                <w:szCs w:val="24"/>
+              </w:rPr>
+              <w:t xml:space="preserve">5. </w:t>
             </w:r>
             <w:proofErr w:type="spellStart"/>
             <w:r>
@@ -13274,18 +13471,44 @@
                 <w:color w:val="000000" w:themeColor="text1"/>
                 <w:szCs w:val="24"/>
               </w:rPr>
-              <w:t xml:space="preserve"> job automatically credits allowance on schedule. 6. Parent optionally gives one-time bonus with reason. 7. Child receives in-app notification upon credit.</w:t>
+              <w:t xml:space="preserve"> job automatically credits allowance on schedule. </w:t>
+            </w:r>
+            <w:r>
+              <w:rPr>
+                <w:rFonts w:asciiTheme="majorBidi" w:hAnsiTheme="majorBidi" w:cstheme="majorBidi"/>
+                <w:color w:val="000000" w:themeColor="text1"/>
+                <w:szCs w:val="24"/>
+              </w:rPr>
+              <w:br/>
+            </w:r>
+            <w:r>
+              <w:rPr>
+                <w:rFonts w:asciiTheme="majorBidi" w:hAnsiTheme="majorBidi" w:cstheme="majorBidi"/>
+                <w:color w:val="000000" w:themeColor="text1"/>
+                <w:szCs w:val="24"/>
+              </w:rPr>
+              <w:t xml:space="preserve">6. Parent optionally gives one-time bonus with reason. </w:t>
+            </w:r>
+            <w:r>
+              <w:rPr>
+                <w:rFonts w:asciiTheme="majorBidi" w:hAnsiTheme="majorBidi" w:cstheme="majorBidi"/>
+                <w:color w:val="000000" w:themeColor="text1"/>
+                <w:szCs w:val="24"/>
+              </w:rPr>
+              <w:br/>
+            </w:r>
+            <w:r>
+              <w:rPr>
+                <w:rFonts w:asciiTheme="majorBidi" w:hAnsiTheme="majorBidi" w:cstheme="majorBidi"/>
+                <w:color w:val="000000" w:themeColor="text1"/>
+                <w:szCs w:val="24"/>
+              </w:rPr>
+              <w:t>7. Child receives in-app notification upon credit.</w:t>
             </w:r>
           </w:p>
         </w:tc>
       </w:tr>
       <w:tr>
-        <w:tblPrEx>
-          <w:tblCellMar>
-            <w:top w:w="0" w:type="dxa"/>
-            <w:bottom w:w="0" w:type="dxa"/>
-          </w:tblCellMar>
-        </w:tblPrEx>
         <w:tc>
           <w:tcPr>
             <w:tcW w:w="2200" w:type="dxa"/>
@@ -13400,12 +13623,6 @@
         <w:gridCol w:w="7159"/>
       </w:tblGrid>
       <w:tr>
-        <w:tblPrEx>
-          <w:tblCellMar>
-            <w:top w:w="0" w:type="dxa"/>
-            <w:bottom w:w="0" w:type="dxa"/>
-          </w:tblCellMar>
-        </w:tblPrEx>
         <w:tc>
           <w:tcPr>
             <w:tcW w:w="2200" w:type="dxa"/>
@@ -13474,12 +13691,6 @@
         </w:tc>
       </w:tr>
       <w:tr>
-        <w:tblPrEx>
-          <w:tblCellMar>
-            <w:top w:w="0" w:type="dxa"/>
-            <w:bottom w:w="0" w:type="dxa"/>
-          </w:tblCellMar>
-        </w:tblPrEx>
         <w:tc>
           <w:tcPr>
             <w:tcW w:w="2200" w:type="dxa"/>
@@ -13542,12 +13753,6 @@
         </w:tc>
       </w:tr>
       <w:tr>
-        <w:tblPrEx>
-          <w:tblCellMar>
-            <w:top w:w="0" w:type="dxa"/>
-            <w:bottom w:w="0" w:type="dxa"/>
-          </w:tblCellMar>
-        </w:tblPrEx>
         <w:tc>
           <w:tcPr>
             <w:tcW w:w="2200" w:type="dxa"/>
@@ -13610,12 +13815,6 @@
         </w:tc>
       </w:tr>
       <w:tr>
-        <w:tblPrEx>
-          <w:tblCellMar>
-            <w:top w:w="0" w:type="dxa"/>
-            <w:bottom w:w="0" w:type="dxa"/>
-          </w:tblCellMar>
-        </w:tblPrEx>
         <w:tc>
           <w:tcPr>
             <w:tcW w:w="2200" w:type="dxa"/>
@@ -13678,12 +13877,6 @@
         </w:tc>
       </w:tr>
       <w:tr>
-        <w:tblPrEx>
-          <w:tblCellMar>
-            <w:top w:w="0" w:type="dxa"/>
-            <w:bottom w:w="0" w:type="dxa"/>
-          </w:tblCellMar>
-        </w:tblPrEx>
         <w:tc>
           <w:tcPr>
             <w:tcW w:w="2200" w:type="dxa"/>
@@ -13746,12 +13939,6 @@
         </w:tc>
       </w:tr>
       <w:tr>
-        <w:tblPrEx>
-          <w:tblCellMar>
-            <w:top w:w="0" w:type="dxa"/>
-            <w:bottom w:w="0" w:type="dxa"/>
-          </w:tblCellMar>
-        </w:tblPrEx>
         <w:tc>
           <w:tcPr>
             <w:tcW w:w="2200" w:type="dxa"/>
@@ -13808,18 +13995,76 @@
                 <w:color w:val="000000" w:themeColor="text1"/>
                 <w:szCs w:val="24"/>
               </w:rPr>
-              <w:t>1. Child selects Savings Goals. 2. Creates a new goal (name, target amount, optional end date). 3. Child adds money from their balance to the goal. 4. Progress bar updates. 5. On completion, system marks goal as Success and notifies all linked parents.</w:t>
+              <w:t xml:space="preserve">1. Child selects Savings Goals. </w:t>
+            </w:r>
+            <w:r>
+              <w:rPr>
+                <w:rFonts w:asciiTheme="majorBidi" w:hAnsiTheme="majorBidi" w:cstheme="majorBidi"/>
+                <w:color w:val="000000" w:themeColor="text1"/>
+                <w:szCs w:val="24"/>
+              </w:rPr>
+              <w:br/>
+            </w:r>
+            <w:r>
+              <w:rPr>
+                <w:rFonts w:asciiTheme="majorBidi" w:hAnsiTheme="majorBidi" w:cstheme="majorBidi"/>
+                <w:color w:val="000000" w:themeColor="text1"/>
+                <w:szCs w:val="24"/>
+              </w:rPr>
+              <w:t xml:space="preserve">2. Creates a new goal (name, target amount, optional end date). </w:t>
+            </w:r>
+            <w:r>
+              <w:rPr>
+                <w:rFonts w:asciiTheme="majorBidi" w:hAnsiTheme="majorBidi" w:cstheme="majorBidi"/>
+                <w:color w:val="000000" w:themeColor="text1"/>
+                <w:szCs w:val="24"/>
+              </w:rPr>
+              <w:br/>
+            </w:r>
+            <w:r>
+              <w:rPr>
+                <w:rFonts w:asciiTheme="majorBidi" w:hAnsiTheme="majorBidi" w:cstheme="majorBidi"/>
+                <w:color w:val="000000" w:themeColor="text1"/>
+                <w:szCs w:val="24"/>
+              </w:rPr>
+              <w:t xml:space="preserve">3. Child adds money from their balance to the goal. </w:t>
+            </w:r>
+            <w:r>
+              <w:rPr>
+                <w:rFonts w:asciiTheme="majorBidi" w:hAnsiTheme="majorBidi" w:cstheme="majorBidi"/>
+                <w:color w:val="000000" w:themeColor="text1"/>
+                <w:szCs w:val="24"/>
+              </w:rPr>
+              <w:br/>
+            </w:r>
+            <w:r>
+              <w:rPr>
+                <w:rFonts w:asciiTheme="majorBidi" w:hAnsiTheme="majorBidi" w:cstheme="majorBidi"/>
+                <w:color w:val="000000" w:themeColor="text1"/>
+                <w:szCs w:val="24"/>
+              </w:rPr>
+              <w:t xml:space="preserve">4. Progress bar updates. </w:t>
+            </w:r>
+            <w:r>
+              <w:rPr>
+                <w:rFonts w:asciiTheme="majorBidi" w:hAnsiTheme="majorBidi" w:cstheme="majorBidi"/>
+                <w:color w:val="000000" w:themeColor="text1"/>
+                <w:szCs w:val="24"/>
+              </w:rPr>
+              <w:br/>
+            </w:r>
+            <w:r>
+              <w:rPr>
+                <w:rFonts w:asciiTheme="majorBidi" w:hAnsiTheme="majorBidi" w:cstheme="majorBidi"/>
+                <w:color w:val="000000" w:themeColor="text1"/>
+                <w:szCs w:val="24"/>
+              </w:rPr>
+              <w:t>5. On completion, system marks goal as Success and notifies all linked parents.</w:t>
             </w:r>
           </w:p>
         </w:tc>
       </w:tr>
       <w:tr>
-        <w:tblPrEx>
-          <w:tblCellMar>
-            <w:top w:w="0" w:type="dxa"/>
-            <w:bottom w:w="0" w:type="dxa"/>
-          </w:tblCellMar>
-        </w:tblPrEx>
         <w:tc>
           <w:tcPr>
             <w:tcW w:w="2200" w:type="dxa"/>
@@ -13882,16 +14127,6 @@
         </w:tc>
       </w:tr>
     </w:tbl>
-    <w:p>
-      <w:pPr>
-        <w:spacing w:after="80"/>
-        <w:rPr>
-          <w:rFonts w:asciiTheme="majorBidi" w:hAnsiTheme="majorBidi" w:cstheme="majorBidi"/>
-          <w:color w:val="000000" w:themeColor="text1"/>
-          <w:szCs w:val="24"/>
-        </w:rPr>
-      </w:pPr>
-    </w:p>
     <w:p>
       <w:pPr>
         <w:spacing w:after="80"/>
@@ -14014,12 +14249,6 @@
         <w:gridCol w:w="7159"/>
       </w:tblGrid>
       <w:tr>
-        <w:tblPrEx>
-          <w:tblCellMar>
-            <w:top w:w="0" w:type="dxa"/>
-            <w:bottom w:w="0" w:type="dxa"/>
-          </w:tblCellMar>
-        </w:tblPrEx>
         <w:tc>
           <w:tcPr>
             <w:tcW w:w="2200" w:type="dxa"/>
@@ -14088,12 +14317,6 @@
         </w:tc>
       </w:tr>
       <w:tr>
-        <w:tblPrEx>
-          <w:tblCellMar>
-            <w:top w:w="0" w:type="dxa"/>
-            <w:bottom w:w="0" w:type="dxa"/>
-          </w:tblCellMar>
-        </w:tblPrEx>
         <w:tc>
           <w:tcPr>
             <w:tcW w:w="2200" w:type="dxa"/>
@@ -14156,12 +14379,6 @@
         </w:tc>
       </w:tr>
       <w:tr>
-        <w:tblPrEx>
-          <w:tblCellMar>
-            <w:top w:w="0" w:type="dxa"/>
-            <w:bottom w:w="0" w:type="dxa"/>
-          </w:tblCellMar>
-        </w:tblPrEx>
         <w:tc>
           <w:tcPr>
             <w:tcW w:w="2200" w:type="dxa"/>
@@ -14224,12 +14441,6 @@
         </w:tc>
       </w:tr>
       <w:tr>
-        <w:tblPrEx>
-          <w:tblCellMar>
-            <w:top w:w="0" w:type="dxa"/>
-            <w:bottom w:w="0" w:type="dxa"/>
-          </w:tblCellMar>
-        </w:tblPrEx>
         <w:tc>
           <w:tcPr>
             <w:tcW w:w="2200" w:type="dxa"/>
@@ -14292,12 +14503,6 @@
         </w:tc>
       </w:tr>
       <w:tr>
-        <w:tblPrEx>
-          <w:tblCellMar>
-            <w:top w:w="0" w:type="dxa"/>
-            <w:bottom w:w="0" w:type="dxa"/>
-          </w:tblCellMar>
-        </w:tblPrEx>
         <w:tc>
           <w:tcPr>
             <w:tcW w:w="2200" w:type="dxa"/>
@@ -14360,12 +14565,6 @@
         </w:tc>
       </w:tr>
       <w:tr>
-        <w:tblPrEx>
-          <w:tblCellMar>
-            <w:top w:w="0" w:type="dxa"/>
-            <w:bottom w:w="0" w:type="dxa"/>
-          </w:tblCellMar>
-        </w:tblPrEx>
         <w:tc>
           <w:tcPr>
             <w:tcW w:w="2200" w:type="dxa"/>
@@ -14422,18 +14621,92 @@
                 <w:color w:val="000000" w:themeColor="text1"/>
                 <w:szCs w:val="24"/>
               </w:rPr>
-              <w:t>1. Parent selects a child and navigates to Challenge Goals. 2. Creates challenge (title, target amount, end date, optional reward EGP). 3. Child receives in-app notification of new challenge. 4. Child adds money to the goal. 5. On completion, reward is automatically credited to child's balance. 6. Parent receives completion notification.</w:t>
+              <w:t xml:space="preserve">1. Parent selects a child and navigates to Challenge Goals. </w:t>
+            </w:r>
+            <w:r>
+              <w:rPr>
+                <w:rFonts w:asciiTheme="majorBidi" w:hAnsiTheme="majorBidi" w:cstheme="majorBidi"/>
+                <w:color w:val="000000" w:themeColor="text1"/>
+                <w:szCs w:val="24"/>
+              </w:rPr>
+              <w:br/>
+            </w:r>
+            <w:r>
+              <w:rPr>
+                <w:rFonts w:asciiTheme="majorBidi" w:hAnsiTheme="majorBidi" w:cstheme="majorBidi"/>
+                <w:color w:val="000000" w:themeColor="text1"/>
+                <w:szCs w:val="24"/>
+              </w:rPr>
+              <w:t xml:space="preserve">2. Creates challenge (title, target amount, end date, optional reward). </w:t>
+            </w:r>
+            <w:r>
+              <w:rPr>
+                <w:rFonts w:asciiTheme="majorBidi" w:hAnsiTheme="majorBidi" w:cstheme="majorBidi"/>
+                <w:color w:val="000000" w:themeColor="text1"/>
+                <w:szCs w:val="24"/>
+              </w:rPr>
+              <w:br/>
+            </w:r>
+            <w:r>
+              <w:rPr>
+                <w:rFonts w:asciiTheme="majorBidi" w:hAnsiTheme="majorBidi" w:cstheme="majorBidi"/>
+                <w:color w:val="000000" w:themeColor="text1"/>
+                <w:szCs w:val="24"/>
+              </w:rPr>
+              <w:t xml:space="preserve">3. Child receives in-app notification of new challenge. </w:t>
+            </w:r>
+            <w:r>
+              <w:rPr>
+                <w:rFonts w:asciiTheme="majorBidi" w:hAnsiTheme="majorBidi" w:cstheme="majorBidi"/>
+                <w:color w:val="000000" w:themeColor="text1"/>
+                <w:szCs w:val="24"/>
+              </w:rPr>
+              <w:br/>
+            </w:r>
+            <w:r>
+              <w:rPr>
+                <w:rFonts w:asciiTheme="majorBidi" w:hAnsiTheme="majorBidi" w:cstheme="majorBidi"/>
+                <w:color w:val="000000" w:themeColor="text1"/>
+                <w:szCs w:val="24"/>
+              </w:rPr>
+              <w:t xml:space="preserve">4. Child adds money to the goal. </w:t>
+            </w:r>
+            <w:r>
+              <w:rPr>
+                <w:rFonts w:asciiTheme="majorBidi" w:hAnsiTheme="majorBidi" w:cstheme="majorBidi"/>
+                <w:color w:val="000000" w:themeColor="text1"/>
+                <w:szCs w:val="24"/>
+              </w:rPr>
+              <w:br/>
+            </w:r>
+            <w:r>
+              <w:rPr>
+                <w:rFonts w:asciiTheme="majorBidi" w:hAnsiTheme="majorBidi" w:cstheme="majorBidi"/>
+                <w:color w:val="000000" w:themeColor="text1"/>
+                <w:szCs w:val="24"/>
+              </w:rPr>
+              <w:t xml:space="preserve">5. On completion, reward is automatically credited to child's balance. </w:t>
+            </w:r>
+            <w:r>
+              <w:rPr>
+                <w:rFonts w:asciiTheme="majorBidi" w:hAnsiTheme="majorBidi" w:cstheme="majorBidi"/>
+                <w:color w:val="000000" w:themeColor="text1"/>
+                <w:szCs w:val="24"/>
+              </w:rPr>
+              <w:br/>
+            </w:r>
+            <w:r>
+              <w:rPr>
+                <w:rFonts w:asciiTheme="majorBidi" w:hAnsiTheme="majorBidi" w:cstheme="majorBidi"/>
+                <w:color w:val="000000" w:themeColor="text1"/>
+                <w:szCs w:val="24"/>
+              </w:rPr>
+              <w:t>6. Parent receives completion notification.</w:t>
             </w:r>
           </w:p>
         </w:tc>
       </w:tr>
       <w:tr>
-        <w:tblPrEx>
-          <w:tblCellMar>
-            <w:top w:w="0" w:type="dxa"/>
-            <w:bottom w:w="0" w:type="dxa"/>
-          </w:tblCellMar>
-        </w:tblPrEx>
         <w:tc>
           <w:tcPr>
             <w:tcW w:w="2200" w:type="dxa"/>
@@ -14548,12 +14821,6 @@
         <w:gridCol w:w="7159"/>
       </w:tblGrid>
       <w:tr>
-        <w:tblPrEx>
-          <w:tblCellMar>
-            <w:top w:w="0" w:type="dxa"/>
-            <w:bottom w:w="0" w:type="dxa"/>
-          </w:tblCellMar>
-        </w:tblPrEx>
         <w:tc>
           <w:tcPr>
             <w:tcW w:w="2200" w:type="dxa"/>
@@ -14622,12 +14889,6 @@
         </w:tc>
       </w:tr>
       <w:tr>
-        <w:tblPrEx>
-          <w:tblCellMar>
-            <w:top w:w="0" w:type="dxa"/>
-            <w:bottom w:w="0" w:type="dxa"/>
-          </w:tblCellMar>
-        </w:tblPrEx>
         <w:tc>
           <w:tcPr>
             <w:tcW w:w="2200" w:type="dxa"/>
@@ -14690,12 +14951,6 @@
         </w:tc>
       </w:tr>
       <w:tr>
-        <w:tblPrEx>
-          <w:tblCellMar>
-            <w:top w:w="0" w:type="dxa"/>
-            <w:bottom w:w="0" w:type="dxa"/>
-          </w:tblCellMar>
-        </w:tblPrEx>
         <w:tc>
           <w:tcPr>
             <w:tcW w:w="2200" w:type="dxa"/>
@@ -14758,12 +15013,6 @@
         </w:tc>
       </w:tr>
       <w:tr>
-        <w:tblPrEx>
-          <w:tblCellMar>
-            <w:top w:w="0" w:type="dxa"/>
-            <w:bottom w:w="0" w:type="dxa"/>
-          </w:tblCellMar>
-        </w:tblPrEx>
         <w:tc>
           <w:tcPr>
             <w:tcW w:w="2200" w:type="dxa"/>
@@ -14826,12 +15075,6 @@
         </w:tc>
       </w:tr>
       <w:tr>
-        <w:tblPrEx>
-          <w:tblCellMar>
-            <w:top w:w="0" w:type="dxa"/>
-            <w:bottom w:w="0" w:type="dxa"/>
-          </w:tblCellMar>
-        </w:tblPrEx>
         <w:tc>
           <w:tcPr>
             <w:tcW w:w="2200" w:type="dxa"/>
@@ -14894,12 +15137,6 @@
         </w:tc>
       </w:tr>
       <w:tr>
-        <w:tblPrEx>
-          <w:tblCellMar>
-            <w:top w:w="0" w:type="dxa"/>
-            <w:bottom w:w="0" w:type="dxa"/>
-          </w:tblCellMar>
-        </w:tblPrEx>
         <w:tc>
           <w:tcPr>
             <w:tcW w:w="2200" w:type="dxa"/>
@@ -14956,7 +15193,103 @@
                 <w:color w:val="000000" w:themeColor="text1"/>
                 <w:szCs w:val="24"/>
               </w:rPr>
-              <w:t xml:space="preserve">1. Child selects Log Expense. 2. Enters amount, category, and mood emoji. 3. Optionally adds item name (required for 'Other' category) and a note. 4. System validates balance. 5. Balance deducted. 6. Expense and Transaction records created. 7. Parents notified in real time via </w:t>
+              <w:t xml:space="preserve">1. Child selects Log Expense. </w:t>
+            </w:r>
+            <w:r>
+              <w:rPr>
+                <w:rFonts w:asciiTheme="majorBidi" w:hAnsiTheme="majorBidi" w:cstheme="majorBidi"/>
+                <w:color w:val="000000" w:themeColor="text1"/>
+                <w:szCs w:val="24"/>
+              </w:rPr>
+              <w:br/>
+            </w:r>
+            <w:r>
+              <w:rPr>
+                <w:rFonts w:asciiTheme="majorBidi" w:hAnsiTheme="majorBidi" w:cstheme="majorBidi"/>
+                <w:color w:val="000000" w:themeColor="text1"/>
+                <w:szCs w:val="24"/>
+              </w:rPr>
+              <w:t xml:space="preserve">2. Enters amount, category, and mood emoji. </w:t>
+            </w:r>
+            <w:r>
+              <w:rPr>
+                <w:rFonts w:asciiTheme="majorBidi" w:hAnsiTheme="majorBidi" w:cstheme="majorBidi"/>
+                <w:color w:val="000000" w:themeColor="text1"/>
+                <w:szCs w:val="24"/>
+              </w:rPr>
+              <w:br/>
+            </w:r>
+            <w:r>
+              <w:rPr>
+                <w:rFonts w:asciiTheme="majorBidi" w:hAnsiTheme="majorBidi" w:cstheme="majorBidi"/>
+                <w:color w:val="000000" w:themeColor="text1"/>
+                <w:szCs w:val="24"/>
+              </w:rPr>
+              <w:t xml:space="preserve">3. Optionally adds item name (required for 'Other' category) and a note. </w:t>
+            </w:r>
+            <w:r>
+              <w:rPr>
+                <w:rFonts w:asciiTheme="majorBidi" w:hAnsiTheme="majorBidi" w:cstheme="majorBidi"/>
+                <w:color w:val="000000" w:themeColor="text1"/>
+                <w:szCs w:val="24"/>
+              </w:rPr>
+              <w:br/>
+            </w:r>
+            <w:r>
+              <w:rPr>
+                <w:rFonts w:asciiTheme="majorBidi" w:hAnsiTheme="majorBidi" w:cstheme="majorBidi"/>
+                <w:color w:val="000000" w:themeColor="text1"/>
+                <w:szCs w:val="24"/>
+              </w:rPr>
+              <w:t xml:space="preserve">4. System validates balance. </w:t>
+            </w:r>
+            <w:r>
+              <w:rPr>
+                <w:rFonts w:asciiTheme="majorBidi" w:hAnsiTheme="majorBidi" w:cstheme="majorBidi"/>
+                <w:color w:val="000000" w:themeColor="text1"/>
+                <w:szCs w:val="24"/>
+              </w:rPr>
+              <w:br/>
+            </w:r>
+            <w:r>
+              <w:rPr>
+                <w:rFonts w:asciiTheme="majorBidi" w:hAnsiTheme="majorBidi" w:cstheme="majorBidi"/>
+                <w:color w:val="000000" w:themeColor="text1"/>
+                <w:szCs w:val="24"/>
+              </w:rPr>
+              <w:t xml:space="preserve">5. Balance deducted. </w:t>
+            </w:r>
+            <w:r>
+              <w:rPr>
+                <w:rFonts w:asciiTheme="majorBidi" w:hAnsiTheme="majorBidi" w:cstheme="majorBidi"/>
+                <w:color w:val="000000" w:themeColor="text1"/>
+                <w:szCs w:val="24"/>
+              </w:rPr>
+              <w:br/>
+            </w:r>
+            <w:r>
+              <w:rPr>
+                <w:rFonts w:asciiTheme="majorBidi" w:hAnsiTheme="majorBidi" w:cstheme="majorBidi"/>
+                <w:color w:val="000000" w:themeColor="text1"/>
+                <w:szCs w:val="24"/>
+              </w:rPr>
+              <w:t xml:space="preserve">6. Expense and Transaction records created. </w:t>
+            </w:r>
+            <w:r>
+              <w:rPr>
+                <w:rFonts w:asciiTheme="majorBidi" w:hAnsiTheme="majorBidi" w:cstheme="majorBidi"/>
+                <w:color w:val="000000" w:themeColor="text1"/>
+                <w:szCs w:val="24"/>
+              </w:rPr>
+              <w:br/>
+            </w:r>
+            <w:r>
+              <w:rPr>
+                <w:rFonts w:asciiTheme="majorBidi" w:hAnsiTheme="majorBidi" w:cstheme="majorBidi"/>
+                <w:color w:val="000000" w:themeColor="text1"/>
+                <w:szCs w:val="24"/>
+              </w:rPr>
+              <w:t xml:space="preserve">7. Parents notified in real time via </w:t>
             </w:r>
             <w:proofErr w:type="spellStart"/>
             <w:r>
@@ -14980,12 +15313,6 @@
         </w:tc>
       </w:tr>
       <w:tr>
-        <w:tblPrEx>
-          <w:tblCellMar>
-            <w:top w:w="0" w:type="dxa"/>
-            <w:bottom w:w="0" w:type="dxa"/>
-          </w:tblCellMar>
-        </w:tblPrEx>
         <w:tc>
           <w:tcPr>
             <w:tcW w:w="2200" w:type="dxa"/>
@@ -15048,36 +15375,6 @@
         </w:tc>
       </w:tr>
     </w:tbl>
-    <w:p>
-      <w:pPr>
-        <w:spacing w:after="80"/>
-        <w:rPr>
-          <w:rFonts w:asciiTheme="majorBidi" w:hAnsiTheme="majorBidi" w:cstheme="majorBidi"/>
-          <w:color w:val="000000" w:themeColor="text1"/>
-          <w:szCs w:val="24"/>
-        </w:rPr>
-      </w:pPr>
-    </w:p>
-    <w:p>
-      <w:pPr>
-        <w:spacing w:after="80"/>
-        <w:rPr>
-          <w:rFonts w:asciiTheme="majorBidi" w:hAnsiTheme="majorBidi" w:cstheme="majorBidi"/>
-          <w:color w:val="000000" w:themeColor="text1"/>
-          <w:szCs w:val="24"/>
-        </w:rPr>
-      </w:pPr>
-    </w:p>
-    <w:p>
-      <w:pPr>
-        <w:spacing w:after="80"/>
-        <w:rPr>
-          <w:rFonts w:asciiTheme="majorBidi" w:hAnsiTheme="majorBidi" w:cstheme="majorBidi"/>
-          <w:color w:val="000000" w:themeColor="text1"/>
-          <w:szCs w:val="24"/>
-        </w:rPr>
-      </w:pPr>
-    </w:p>
     <w:p>
       <w:pPr>
         <w:spacing w:after="80"/>
@@ -15190,12 +15487,6 @@
         <w:gridCol w:w="7155"/>
       </w:tblGrid>
       <w:tr>
-        <w:tblPrEx>
-          <w:tblCellMar>
-            <w:top w:w="0" w:type="dxa"/>
-            <w:bottom w:w="0" w:type="dxa"/>
-          </w:tblCellMar>
-        </w:tblPrEx>
         <w:tc>
           <w:tcPr>
             <w:tcW w:w="2200" w:type="dxa"/>
@@ -15264,12 +15555,6 @@
         </w:tc>
       </w:tr>
       <w:tr>
-        <w:tblPrEx>
-          <w:tblCellMar>
-            <w:top w:w="0" w:type="dxa"/>
-            <w:bottom w:w="0" w:type="dxa"/>
-          </w:tblCellMar>
-        </w:tblPrEx>
         <w:tc>
           <w:tcPr>
             <w:tcW w:w="2200" w:type="dxa"/>
@@ -15332,12 +15617,6 @@
         </w:tc>
       </w:tr>
       <w:tr>
-        <w:tblPrEx>
-          <w:tblCellMar>
-            <w:top w:w="0" w:type="dxa"/>
-            <w:bottom w:w="0" w:type="dxa"/>
-          </w:tblCellMar>
-        </w:tblPrEx>
         <w:tc>
           <w:tcPr>
             <w:tcW w:w="2200" w:type="dxa"/>
@@ -15400,12 +15679,6 @@
         </w:tc>
       </w:tr>
       <w:tr>
-        <w:tblPrEx>
-          <w:tblCellMar>
-            <w:top w:w="0" w:type="dxa"/>
-            <w:bottom w:w="0" w:type="dxa"/>
-          </w:tblCellMar>
-        </w:tblPrEx>
         <w:tc>
           <w:tcPr>
             <w:tcW w:w="2200" w:type="dxa"/>
@@ -15468,12 +15741,6 @@
         </w:tc>
       </w:tr>
       <w:tr>
-        <w:tblPrEx>
-          <w:tblCellMar>
-            <w:top w:w="0" w:type="dxa"/>
-            <w:bottom w:w="0" w:type="dxa"/>
-          </w:tblCellMar>
-        </w:tblPrEx>
         <w:tc>
           <w:tcPr>
             <w:tcW w:w="2200" w:type="dxa"/>
@@ -15536,12 +15803,6 @@
         </w:tc>
       </w:tr>
       <w:tr>
-        <w:tblPrEx>
-          <w:tblCellMar>
-            <w:top w:w="0" w:type="dxa"/>
-            <w:bottom w:w="0" w:type="dxa"/>
-          </w:tblCellMar>
-        </w:tblPrEx>
         <w:tc>
           <w:tcPr>
             <w:tcW w:w="2200" w:type="dxa"/>
@@ -15598,18 +15859,60 @@
                 <w:color w:val="000000" w:themeColor="text1"/>
                 <w:szCs w:val="24"/>
               </w:rPr>
-              <w:t>1. Child selects Expense History. 2. Views list of purchases with name, date, mood, and amount. 3. Can filter by category or date range. 4. App shows total count and total spent.</w:t>
+              <w:t xml:space="preserve">1. Child selects Expense History. </w:t>
+            </w:r>
+            <w:r>
+              <w:rPr>
+                <w:rFonts w:asciiTheme="majorBidi" w:hAnsiTheme="majorBidi" w:cstheme="majorBidi"/>
+                <w:color w:val="000000" w:themeColor="text1"/>
+                <w:szCs w:val="24"/>
+              </w:rPr>
+              <w:br/>
+            </w:r>
+            <w:r>
+              <w:rPr>
+                <w:rFonts w:asciiTheme="majorBidi" w:hAnsiTheme="majorBidi" w:cstheme="majorBidi"/>
+                <w:color w:val="000000" w:themeColor="text1"/>
+                <w:szCs w:val="24"/>
+              </w:rPr>
+              <w:t xml:space="preserve">2. Views list of purchases with name, date, mood, and amount. </w:t>
+            </w:r>
+            <w:r>
+              <w:rPr>
+                <w:rFonts w:asciiTheme="majorBidi" w:hAnsiTheme="majorBidi" w:cstheme="majorBidi"/>
+                <w:color w:val="000000" w:themeColor="text1"/>
+                <w:szCs w:val="24"/>
+              </w:rPr>
+              <w:br/>
+            </w:r>
+            <w:r>
+              <w:rPr>
+                <w:rFonts w:asciiTheme="majorBidi" w:hAnsiTheme="majorBidi" w:cstheme="majorBidi"/>
+                <w:color w:val="000000" w:themeColor="text1"/>
+                <w:szCs w:val="24"/>
+              </w:rPr>
+              <w:t xml:space="preserve">3. Can filter by category or date range. </w:t>
+            </w:r>
+            <w:r>
+              <w:rPr>
+                <w:rFonts w:asciiTheme="majorBidi" w:hAnsiTheme="majorBidi" w:cstheme="majorBidi"/>
+                <w:color w:val="000000" w:themeColor="text1"/>
+                <w:szCs w:val="24"/>
+              </w:rPr>
+              <w:br/>
+            </w:r>
+            <w:r>
+              <w:rPr>
+                <w:rFonts w:asciiTheme="majorBidi" w:hAnsiTheme="majorBidi" w:cstheme="majorBidi"/>
+                <w:color w:val="000000" w:themeColor="text1"/>
+                <w:szCs w:val="24"/>
+              </w:rPr>
+              <w:t>4. App shows total count and total spent.</w:t>
             </w:r>
           </w:p>
         </w:tc>
       </w:tr>
       <w:tr>
-        <w:tblPrEx>
-          <w:tblCellMar>
-            <w:top w:w="0" w:type="dxa"/>
-            <w:bottom w:w="0" w:type="dxa"/>
-          </w:tblCellMar>
-        </w:tblPrEx>
         <w:tc>
           <w:tcPr>
             <w:tcW w:w="2200" w:type="dxa"/>
@@ -15724,12 +16027,6 @@
         <w:gridCol w:w="7155"/>
       </w:tblGrid>
       <w:tr>
-        <w:tblPrEx>
-          <w:tblCellMar>
-            <w:top w:w="0" w:type="dxa"/>
-            <w:bottom w:w="0" w:type="dxa"/>
-          </w:tblCellMar>
-        </w:tblPrEx>
         <w:tc>
           <w:tcPr>
             <w:tcW w:w="2200" w:type="dxa"/>
@@ -15798,12 +16095,6 @@
         </w:tc>
       </w:tr>
       <w:tr>
-        <w:tblPrEx>
-          <w:tblCellMar>
-            <w:top w:w="0" w:type="dxa"/>
-            <w:bottom w:w="0" w:type="dxa"/>
-          </w:tblCellMar>
-        </w:tblPrEx>
         <w:tc>
           <w:tcPr>
             <w:tcW w:w="2200" w:type="dxa"/>
@@ -15866,12 +16157,6 @@
         </w:tc>
       </w:tr>
       <w:tr>
-        <w:tblPrEx>
-          <w:tblCellMar>
-            <w:top w:w="0" w:type="dxa"/>
-            <w:bottom w:w="0" w:type="dxa"/>
-          </w:tblCellMar>
-        </w:tblPrEx>
         <w:tc>
           <w:tcPr>
             <w:tcW w:w="2200" w:type="dxa"/>
@@ -15934,12 +16219,6 @@
         </w:tc>
       </w:tr>
       <w:tr>
-        <w:tblPrEx>
-          <w:tblCellMar>
-            <w:top w:w="0" w:type="dxa"/>
-            <w:bottom w:w="0" w:type="dxa"/>
-          </w:tblCellMar>
-        </w:tblPrEx>
         <w:tc>
           <w:tcPr>
             <w:tcW w:w="2200" w:type="dxa"/>
@@ -16002,12 +16281,6 @@
         </w:tc>
       </w:tr>
       <w:tr>
-        <w:tblPrEx>
-          <w:tblCellMar>
-            <w:top w:w="0" w:type="dxa"/>
-            <w:bottom w:w="0" w:type="dxa"/>
-          </w:tblCellMar>
-        </w:tblPrEx>
         <w:tc>
           <w:tcPr>
             <w:tcW w:w="2200" w:type="dxa"/>
@@ -16070,12 +16343,6 @@
         </w:tc>
       </w:tr>
       <w:tr>
-        <w:tblPrEx>
-          <w:tblCellMar>
-            <w:top w:w="0" w:type="dxa"/>
-            <w:bottom w:w="0" w:type="dxa"/>
-          </w:tblCellMar>
-        </w:tblPrEx>
         <w:tc>
           <w:tcPr>
             <w:tcW w:w="2200" w:type="dxa"/>
@@ -16132,18 +16399,76 @@
                 <w:color w:val="000000" w:themeColor="text1"/>
                 <w:szCs w:val="24"/>
               </w:rPr>
-              <w:t>1. Parent selects a child. 2. Opens Expense section. 3. Filters by date, category, or mood. 4. Views list with item, date, mood, and amount. 5. Sees summary: total spent, count, top categories, mood distribution.</w:t>
+              <w:t xml:space="preserve">1. Parent selects a child. </w:t>
+            </w:r>
+            <w:r>
+              <w:rPr>
+                <w:rFonts w:asciiTheme="majorBidi" w:hAnsiTheme="majorBidi" w:cstheme="majorBidi"/>
+                <w:color w:val="000000" w:themeColor="text1"/>
+                <w:szCs w:val="24"/>
+              </w:rPr>
+              <w:br/>
+            </w:r>
+            <w:r>
+              <w:rPr>
+                <w:rFonts w:asciiTheme="majorBidi" w:hAnsiTheme="majorBidi" w:cstheme="majorBidi"/>
+                <w:color w:val="000000" w:themeColor="text1"/>
+                <w:szCs w:val="24"/>
+              </w:rPr>
+              <w:t xml:space="preserve">2. Opens Expense section. </w:t>
+            </w:r>
+            <w:r>
+              <w:rPr>
+                <w:rFonts w:asciiTheme="majorBidi" w:hAnsiTheme="majorBidi" w:cstheme="majorBidi"/>
+                <w:color w:val="000000" w:themeColor="text1"/>
+                <w:szCs w:val="24"/>
+              </w:rPr>
+              <w:br/>
+            </w:r>
+            <w:r>
+              <w:rPr>
+                <w:rFonts w:asciiTheme="majorBidi" w:hAnsiTheme="majorBidi" w:cstheme="majorBidi"/>
+                <w:color w:val="000000" w:themeColor="text1"/>
+                <w:szCs w:val="24"/>
+              </w:rPr>
+              <w:t xml:space="preserve">3. Filters by date, category, or mood. </w:t>
+            </w:r>
+            <w:r>
+              <w:rPr>
+                <w:rFonts w:asciiTheme="majorBidi" w:hAnsiTheme="majorBidi" w:cstheme="majorBidi"/>
+                <w:color w:val="000000" w:themeColor="text1"/>
+                <w:szCs w:val="24"/>
+              </w:rPr>
+              <w:br/>
+            </w:r>
+            <w:r>
+              <w:rPr>
+                <w:rFonts w:asciiTheme="majorBidi" w:hAnsiTheme="majorBidi" w:cstheme="majorBidi"/>
+                <w:color w:val="000000" w:themeColor="text1"/>
+                <w:szCs w:val="24"/>
+              </w:rPr>
+              <w:t xml:space="preserve">4. Views list with item, date, mood, and amount. </w:t>
+            </w:r>
+            <w:r>
+              <w:rPr>
+                <w:rFonts w:asciiTheme="majorBidi" w:hAnsiTheme="majorBidi" w:cstheme="majorBidi"/>
+                <w:color w:val="000000" w:themeColor="text1"/>
+                <w:szCs w:val="24"/>
+              </w:rPr>
+              <w:br/>
+            </w:r>
+            <w:r>
+              <w:rPr>
+                <w:rFonts w:asciiTheme="majorBidi" w:hAnsiTheme="majorBidi" w:cstheme="majorBidi"/>
+                <w:color w:val="000000" w:themeColor="text1"/>
+                <w:szCs w:val="24"/>
+              </w:rPr>
+              <w:t>5. Sees summary: total spent, count, top categories, mood distribution.</w:t>
             </w:r>
           </w:p>
         </w:tc>
       </w:tr>
       <w:tr>
-        <w:tblPrEx>
-          <w:tblCellMar>
-            <w:top w:w="0" w:type="dxa"/>
-            <w:bottom w:w="0" w:type="dxa"/>
-          </w:tblCellMar>
-        </w:tblPrEx>
         <w:tc>
           <w:tcPr>
             <w:tcW w:w="2200" w:type="dxa"/>
@@ -16206,36 +16531,6 @@
         </w:tc>
       </w:tr>
     </w:tbl>
-    <w:p>
-      <w:pPr>
-        <w:spacing w:after="80"/>
-        <w:rPr>
-          <w:rFonts w:asciiTheme="majorBidi" w:hAnsiTheme="majorBidi" w:cstheme="majorBidi"/>
-          <w:color w:val="000000" w:themeColor="text1"/>
-          <w:szCs w:val="24"/>
-        </w:rPr>
-      </w:pPr>
-    </w:p>
-    <w:p>
-      <w:pPr>
-        <w:spacing w:after="80"/>
-        <w:rPr>
-          <w:rFonts w:asciiTheme="majorBidi" w:hAnsiTheme="majorBidi" w:cstheme="majorBidi"/>
-          <w:color w:val="000000" w:themeColor="text1"/>
-          <w:szCs w:val="24"/>
-        </w:rPr>
-      </w:pPr>
-    </w:p>
-    <w:p>
-      <w:pPr>
-        <w:spacing w:after="80"/>
-        <w:rPr>
-          <w:rFonts w:asciiTheme="majorBidi" w:hAnsiTheme="majorBidi" w:cstheme="majorBidi"/>
-          <w:color w:val="000000" w:themeColor="text1"/>
-          <w:szCs w:val="24"/>
-        </w:rPr>
-      </w:pPr>
-    </w:p>
     <w:p>
       <w:pPr>
         <w:spacing w:after="80"/>
@@ -16368,12 +16663,6 @@
         <w:gridCol w:w="7159"/>
       </w:tblGrid>
       <w:tr>
-        <w:tblPrEx>
-          <w:tblCellMar>
-            <w:top w:w="0" w:type="dxa"/>
-            <w:bottom w:w="0" w:type="dxa"/>
-          </w:tblCellMar>
-        </w:tblPrEx>
         <w:tc>
           <w:tcPr>
             <w:tcW w:w="2200" w:type="dxa"/>
@@ -16442,12 +16731,6 @@
         </w:tc>
       </w:tr>
       <w:tr>
-        <w:tblPrEx>
-          <w:tblCellMar>
-            <w:top w:w="0" w:type="dxa"/>
-            <w:bottom w:w="0" w:type="dxa"/>
-          </w:tblCellMar>
-        </w:tblPrEx>
         <w:tc>
           <w:tcPr>
             <w:tcW w:w="2200" w:type="dxa"/>
@@ -16510,12 +16793,6 @@
         </w:tc>
       </w:tr>
       <w:tr>
-        <w:tblPrEx>
-          <w:tblCellMar>
-            <w:top w:w="0" w:type="dxa"/>
-            <w:bottom w:w="0" w:type="dxa"/>
-          </w:tblCellMar>
-        </w:tblPrEx>
         <w:tc>
           <w:tcPr>
             <w:tcW w:w="2200" w:type="dxa"/>
@@ -16578,12 +16855,6 @@
         </w:tc>
       </w:tr>
       <w:tr>
-        <w:tblPrEx>
-          <w:tblCellMar>
-            <w:top w:w="0" w:type="dxa"/>
-            <w:bottom w:w="0" w:type="dxa"/>
-          </w:tblCellMar>
-        </w:tblPrEx>
         <w:tc>
           <w:tcPr>
             <w:tcW w:w="2200" w:type="dxa"/>
@@ -16646,12 +16917,6 @@
         </w:tc>
       </w:tr>
       <w:tr>
-        <w:tblPrEx>
-          <w:tblCellMar>
-            <w:top w:w="0" w:type="dxa"/>
-            <w:bottom w:w="0" w:type="dxa"/>
-          </w:tblCellMar>
-        </w:tblPrEx>
         <w:tc>
           <w:tcPr>
             <w:tcW w:w="2200" w:type="dxa"/>
@@ -16714,12 +16979,6 @@
         </w:tc>
       </w:tr>
       <w:tr>
-        <w:tblPrEx>
-          <w:tblCellMar>
-            <w:top w:w="0" w:type="dxa"/>
-            <w:bottom w:w="0" w:type="dxa"/>
-          </w:tblCellMar>
-        </w:tblPrEx>
         <w:tc>
           <w:tcPr>
             <w:tcW w:w="2200" w:type="dxa"/>
@@ -16776,7 +17035,23 @@
                 <w:color w:val="000000" w:themeColor="text1"/>
                 <w:szCs w:val="24"/>
               </w:rPr>
-              <w:t xml:space="preserve">1. Parent selects Analysis for a child. 2. App shows personality profile (type, description, traits, </w:t>
+              <w:t xml:space="preserve">1. Parent selects Analysis for a child. </w:t>
+            </w:r>
+            <w:r>
+              <w:rPr>
+                <w:rFonts w:asciiTheme="majorBidi" w:hAnsiTheme="majorBidi" w:cstheme="majorBidi"/>
+                <w:color w:val="000000" w:themeColor="text1"/>
+                <w:szCs w:val="24"/>
+              </w:rPr>
+              <w:br/>
+            </w:r>
+            <w:r>
+              <w:rPr>
+                <w:rFonts w:asciiTheme="majorBidi" w:hAnsiTheme="majorBidi" w:cstheme="majorBidi"/>
+                <w:color w:val="000000" w:themeColor="text1"/>
+                <w:szCs w:val="24"/>
+              </w:rPr>
+              <w:t xml:space="preserve">2. App shows personality profile (type, description, traits, </w:t>
             </w:r>
             <w:proofErr w:type="gramStart"/>
             <w:r>
@@ -16794,18 +17069,76 @@
                 <w:color w:val="000000" w:themeColor="text1"/>
                 <w:szCs w:val="24"/>
               </w:rPr>
-              <w:t>). 3. If personality scores exist: behavioral dimension chart (Impulsive %, Prudent %, Planner %, Bargain %). 4. Alert cards for detected issues (e.g., high mood-driven spending, low savings). 5. Strength cards for positive behaviors. 6. Data window note (last 14 days).</w:t>
+              <w:t xml:space="preserve">). </w:t>
+            </w:r>
+            <w:r>
+              <w:rPr>
+                <w:rFonts w:asciiTheme="majorBidi" w:hAnsiTheme="majorBidi" w:cstheme="majorBidi"/>
+                <w:color w:val="000000" w:themeColor="text1"/>
+                <w:szCs w:val="24"/>
+              </w:rPr>
+              <w:br/>
+            </w:r>
+            <w:r>
+              <w:rPr>
+                <w:rFonts w:asciiTheme="majorBidi" w:hAnsiTheme="majorBidi" w:cstheme="majorBidi"/>
+                <w:color w:val="000000" w:themeColor="text1"/>
+                <w:szCs w:val="24"/>
+              </w:rPr>
+              <w:t xml:space="preserve">3. If personality scores exist: behavioral dimension chart (Impulsive %, Prudent %, Planner %, Bargain %). </w:t>
+            </w:r>
+            <w:r>
+              <w:rPr>
+                <w:rFonts w:asciiTheme="majorBidi" w:hAnsiTheme="majorBidi" w:cstheme="majorBidi"/>
+                <w:color w:val="000000" w:themeColor="text1"/>
+                <w:szCs w:val="24"/>
+              </w:rPr>
+              <w:br/>
+            </w:r>
+            <w:r>
+              <w:rPr>
+                <w:rFonts w:asciiTheme="majorBidi" w:hAnsiTheme="majorBidi" w:cstheme="majorBidi"/>
+                <w:color w:val="000000" w:themeColor="text1"/>
+                <w:szCs w:val="24"/>
+              </w:rPr>
+              <w:t xml:space="preserve">4. Alert cards for detected issues (e.g., high mood-driven spending, low savings). </w:t>
+            </w:r>
+            <w:r>
+              <w:rPr>
+                <w:rFonts w:asciiTheme="majorBidi" w:hAnsiTheme="majorBidi" w:cstheme="majorBidi"/>
+                <w:color w:val="000000" w:themeColor="text1"/>
+                <w:szCs w:val="24"/>
+              </w:rPr>
+              <w:br/>
+            </w:r>
+            <w:r>
+              <w:rPr>
+                <w:rFonts w:asciiTheme="majorBidi" w:hAnsiTheme="majorBidi" w:cstheme="majorBidi"/>
+                <w:color w:val="000000" w:themeColor="text1"/>
+                <w:szCs w:val="24"/>
+              </w:rPr>
+              <w:t xml:space="preserve">5. Strength cards for positive behaviors. </w:t>
+            </w:r>
+            <w:r>
+              <w:rPr>
+                <w:rFonts w:asciiTheme="majorBidi" w:hAnsiTheme="majorBidi" w:cstheme="majorBidi"/>
+                <w:color w:val="000000" w:themeColor="text1"/>
+                <w:szCs w:val="24"/>
+              </w:rPr>
+              <w:br/>
+            </w:r>
+            <w:r>
+              <w:rPr>
+                <w:rFonts w:asciiTheme="majorBidi" w:hAnsiTheme="majorBidi" w:cstheme="majorBidi"/>
+                <w:color w:val="000000" w:themeColor="text1"/>
+                <w:szCs w:val="24"/>
+              </w:rPr>
+              <w:t>6. Data window note (last 14 days).</w:t>
             </w:r>
           </w:p>
         </w:tc>
       </w:tr>
       <w:tr>
-        <w:tblPrEx>
-          <w:tblCellMar>
-            <w:top w:w="0" w:type="dxa"/>
-            <w:bottom w:w="0" w:type="dxa"/>
-          </w:tblCellMar>
-        </w:tblPrEx>
         <w:tc>
           <w:tcPr>
             <w:tcW w:w="2200" w:type="dxa"/>
@@ -16920,12 +17253,6 @@
         <w:gridCol w:w="7159"/>
       </w:tblGrid>
       <w:tr>
-        <w:tblPrEx>
-          <w:tblCellMar>
-            <w:top w:w="0" w:type="dxa"/>
-            <w:bottom w:w="0" w:type="dxa"/>
-          </w:tblCellMar>
-        </w:tblPrEx>
         <w:tc>
           <w:tcPr>
             <w:tcW w:w="2200" w:type="dxa"/>
@@ -16994,12 +17321,6 @@
         </w:tc>
       </w:tr>
       <w:tr>
-        <w:tblPrEx>
-          <w:tblCellMar>
-            <w:top w:w="0" w:type="dxa"/>
-            <w:bottom w:w="0" w:type="dxa"/>
-          </w:tblCellMar>
-        </w:tblPrEx>
         <w:tc>
           <w:tcPr>
             <w:tcW w:w="2200" w:type="dxa"/>
@@ -17062,12 +17383,6 @@
         </w:tc>
       </w:tr>
       <w:tr>
-        <w:tblPrEx>
-          <w:tblCellMar>
-            <w:top w:w="0" w:type="dxa"/>
-            <w:bottom w:w="0" w:type="dxa"/>
-          </w:tblCellMar>
-        </w:tblPrEx>
         <w:tc>
           <w:tcPr>
             <w:tcW w:w="2200" w:type="dxa"/>
@@ -17130,12 +17445,6 @@
         </w:tc>
       </w:tr>
       <w:tr>
-        <w:tblPrEx>
-          <w:tblCellMar>
-            <w:top w:w="0" w:type="dxa"/>
-            <w:bottom w:w="0" w:type="dxa"/>
-          </w:tblCellMar>
-        </w:tblPrEx>
         <w:tc>
           <w:tcPr>
             <w:tcW w:w="2200" w:type="dxa"/>
@@ -17198,12 +17507,6 @@
         </w:tc>
       </w:tr>
       <w:tr>
-        <w:tblPrEx>
-          <w:tblCellMar>
-            <w:top w:w="0" w:type="dxa"/>
-            <w:bottom w:w="0" w:type="dxa"/>
-          </w:tblCellMar>
-        </w:tblPrEx>
         <w:tc>
           <w:tcPr>
             <w:tcW w:w="2200" w:type="dxa"/>
@@ -17266,12 +17569,6 @@
         </w:tc>
       </w:tr>
       <w:tr>
-        <w:tblPrEx>
-          <w:tblCellMar>
-            <w:top w:w="0" w:type="dxa"/>
-            <w:bottom w:w="0" w:type="dxa"/>
-          </w:tblCellMar>
-        </w:tblPrEx>
         <w:tc>
           <w:tcPr>
             <w:tcW w:w="2200" w:type="dxa"/>
@@ -17328,18 +17625,76 @@
                 <w:color w:val="000000" w:themeColor="text1"/>
                 <w:szCs w:val="24"/>
               </w:rPr>
-              <w:t>1. Child selects Profile. 2. App displays selected character avatar and option to change it. 3. Shows child-friendly personality name (e.g., Speedy Spender, Dream Builder). 4. Displays fun facts and personalized tips. 5. Shows fun facts: favorite category, most common spending mood, biggest purchase this month.</w:t>
+              <w:t xml:space="preserve">1. Child selects Profile. </w:t>
+            </w:r>
+            <w:r>
+              <w:rPr>
+                <w:rFonts w:asciiTheme="majorBidi" w:hAnsiTheme="majorBidi" w:cstheme="majorBidi"/>
+                <w:color w:val="000000" w:themeColor="text1"/>
+                <w:szCs w:val="24"/>
+              </w:rPr>
+              <w:br/>
+            </w:r>
+            <w:r>
+              <w:rPr>
+                <w:rFonts w:asciiTheme="majorBidi" w:hAnsiTheme="majorBidi" w:cstheme="majorBidi"/>
+                <w:color w:val="000000" w:themeColor="text1"/>
+                <w:szCs w:val="24"/>
+              </w:rPr>
+              <w:t xml:space="preserve">2. App displays selected character avatar and option to change it. </w:t>
+            </w:r>
+            <w:r>
+              <w:rPr>
+                <w:rFonts w:asciiTheme="majorBidi" w:hAnsiTheme="majorBidi" w:cstheme="majorBidi"/>
+                <w:color w:val="000000" w:themeColor="text1"/>
+                <w:szCs w:val="24"/>
+              </w:rPr>
+              <w:br/>
+            </w:r>
+            <w:r>
+              <w:rPr>
+                <w:rFonts w:asciiTheme="majorBidi" w:hAnsiTheme="majorBidi" w:cstheme="majorBidi"/>
+                <w:color w:val="000000" w:themeColor="text1"/>
+                <w:szCs w:val="24"/>
+              </w:rPr>
+              <w:t xml:space="preserve">3. Shows child-friendly personality name (e.g., Speedy Spender, Dream Builder). </w:t>
+            </w:r>
+            <w:r>
+              <w:rPr>
+                <w:rFonts w:asciiTheme="majorBidi" w:hAnsiTheme="majorBidi" w:cstheme="majorBidi"/>
+                <w:color w:val="000000" w:themeColor="text1"/>
+                <w:szCs w:val="24"/>
+              </w:rPr>
+              <w:br/>
+            </w:r>
+            <w:r>
+              <w:rPr>
+                <w:rFonts w:asciiTheme="majorBidi" w:hAnsiTheme="majorBidi" w:cstheme="majorBidi"/>
+                <w:color w:val="000000" w:themeColor="text1"/>
+                <w:szCs w:val="24"/>
+              </w:rPr>
+              <w:t xml:space="preserve">4. Displays fun facts and personalized tips. </w:t>
+            </w:r>
+            <w:r>
+              <w:rPr>
+                <w:rFonts w:asciiTheme="majorBidi" w:hAnsiTheme="majorBidi" w:cstheme="majorBidi"/>
+                <w:color w:val="000000" w:themeColor="text1"/>
+                <w:szCs w:val="24"/>
+              </w:rPr>
+              <w:br/>
+            </w:r>
+            <w:r>
+              <w:rPr>
+                <w:rFonts w:asciiTheme="majorBidi" w:hAnsiTheme="majorBidi" w:cstheme="majorBidi"/>
+                <w:color w:val="000000" w:themeColor="text1"/>
+                <w:szCs w:val="24"/>
+              </w:rPr>
+              <w:t>5. Shows fun facts: favorite category, most common spending mood, biggest purchase this month.</w:t>
             </w:r>
           </w:p>
         </w:tc>
       </w:tr>
       <w:tr>
-        <w:tblPrEx>
-          <w:tblCellMar>
-            <w:top w:w="0" w:type="dxa"/>
-            <w:bottom w:w="0" w:type="dxa"/>
-          </w:tblCellMar>
-        </w:tblPrEx>
         <w:tc>
           <w:tcPr>
             <w:tcW w:w="2200" w:type="dxa"/>
@@ -17402,46 +17757,6 @@
         </w:tc>
       </w:tr>
     </w:tbl>
-    <w:p>
-      <w:pPr>
-        <w:spacing w:after="80"/>
-        <w:rPr>
-          <w:rFonts w:asciiTheme="majorBidi" w:hAnsiTheme="majorBidi" w:cstheme="majorBidi"/>
-          <w:color w:val="000000" w:themeColor="text1"/>
-          <w:szCs w:val="24"/>
-        </w:rPr>
-      </w:pPr>
-    </w:p>
-    <w:p>
-      <w:pPr>
-        <w:spacing w:after="80"/>
-        <w:rPr>
-          <w:rFonts w:asciiTheme="majorBidi" w:hAnsiTheme="majorBidi" w:cstheme="majorBidi"/>
-          <w:color w:val="000000" w:themeColor="text1"/>
-          <w:szCs w:val="24"/>
-        </w:rPr>
-      </w:pPr>
-    </w:p>
-    <w:p>
-      <w:pPr>
-        <w:spacing w:after="80"/>
-        <w:rPr>
-          <w:rFonts w:asciiTheme="majorBidi" w:hAnsiTheme="majorBidi" w:cstheme="majorBidi"/>
-          <w:color w:val="000000" w:themeColor="text1"/>
-          <w:szCs w:val="24"/>
-        </w:rPr>
-      </w:pPr>
-    </w:p>
-    <w:p>
-      <w:pPr>
-        <w:spacing w:after="80"/>
-        <w:rPr>
-          <w:rFonts w:asciiTheme="majorBidi" w:hAnsiTheme="majorBidi" w:cstheme="majorBidi"/>
-          <w:color w:val="000000" w:themeColor="text1"/>
-          <w:szCs w:val="24"/>
-        </w:rPr>
-      </w:pPr>
-    </w:p>
     <w:p>
       <w:pPr>
         <w:spacing w:after="80"/>
@@ -17514,12 +17829,6 @@
         <w:gridCol w:w="7159"/>
       </w:tblGrid>
       <w:tr>
-        <w:tblPrEx>
-          <w:tblCellMar>
-            <w:top w:w="0" w:type="dxa"/>
-            <w:bottom w:w="0" w:type="dxa"/>
-          </w:tblCellMar>
-        </w:tblPrEx>
         <w:tc>
           <w:tcPr>
             <w:tcW w:w="2200" w:type="dxa"/>
@@ -17588,12 +17897,6 @@
         </w:tc>
       </w:tr>
       <w:tr>
-        <w:tblPrEx>
-          <w:tblCellMar>
-            <w:top w:w="0" w:type="dxa"/>
-            <w:bottom w:w="0" w:type="dxa"/>
-          </w:tblCellMar>
-        </w:tblPrEx>
         <w:tc>
           <w:tcPr>
             <w:tcW w:w="2200" w:type="dxa"/>
@@ -17656,12 +17959,6 @@
         </w:tc>
       </w:tr>
       <w:tr>
-        <w:tblPrEx>
-          <w:tblCellMar>
-            <w:top w:w="0" w:type="dxa"/>
-            <w:bottom w:w="0" w:type="dxa"/>
-          </w:tblCellMar>
-        </w:tblPrEx>
         <w:tc>
           <w:tcPr>
             <w:tcW w:w="2200" w:type="dxa"/>
@@ -17724,12 +18021,6 @@
         </w:tc>
       </w:tr>
       <w:tr>
-        <w:tblPrEx>
-          <w:tblCellMar>
-            <w:top w:w="0" w:type="dxa"/>
-            <w:bottom w:w="0" w:type="dxa"/>
-          </w:tblCellMar>
-        </w:tblPrEx>
         <w:tc>
           <w:tcPr>
             <w:tcW w:w="2200" w:type="dxa"/>
@@ -17792,12 +18083,6 @@
         </w:tc>
       </w:tr>
       <w:tr>
-        <w:tblPrEx>
-          <w:tblCellMar>
-            <w:top w:w="0" w:type="dxa"/>
-            <w:bottom w:w="0" w:type="dxa"/>
-          </w:tblCellMar>
-        </w:tblPrEx>
         <w:tc>
           <w:tcPr>
             <w:tcW w:w="2200" w:type="dxa"/>
@@ -17860,12 +18145,6 @@
         </w:tc>
       </w:tr>
       <w:tr>
-        <w:tblPrEx>
-          <w:tblCellMar>
-            <w:top w:w="0" w:type="dxa"/>
-            <w:bottom w:w="0" w:type="dxa"/>
-          </w:tblCellMar>
-        </w:tblPrEx>
         <w:tc>
           <w:tcPr>
             <w:tcW w:w="2200" w:type="dxa"/>
@@ -17922,18 +18201,76 @@
                 <w:color w:val="000000" w:themeColor="text1"/>
                 <w:szCs w:val="24"/>
               </w:rPr>
-              <w:t>1. Parent opens Reports section. 2. Selects report type and date range. 3. Views: Spending Summary, Category Breakdown, Mood-Spending Correlation, Time Patterns, Balance History, Goal Report. 4. Charts display data visually. 5. Parent optionally downloads selected sections as a PDF.</w:t>
+              <w:t xml:space="preserve">1. Parent opens Reports section. </w:t>
+            </w:r>
+            <w:r>
+              <w:rPr>
+                <w:rFonts w:asciiTheme="majorBidi" w:hAnsiTheme="majorBidi" w:cstheme="majorBidi"/>
+                <w:color w:val="000000" w:themeColor="text1"/>
+                <w:szCs w:val="24"/>
+              </w:rPr>
+              <w:br/>
+            </w:r>
+            <w:r>
+              <w:rPr>
+                <w:rFonts w:asciiTheme="majorBidi" w:hAnsiTheme="majorBidi" w:cstheme="majorBidi"/>
+                <w:color w:val="000000" w:themeColor="text1"/>
+                <w:szCs w:val="24"/>
+              </w:rPr>
+              <w:t xml:space="preserve">2. Selects report type and date range. </w:t>
+            </w:r>
+            <w:r>
+              <w:rPr>
+                <w:rFonts w:asciiTheme="majorBidi" w:hAnsiTheme="majorBidi" w:cstheme="majorBidi"/>
+                <w:color w:val="000000" w:themeColor="text1"/>
+                <w:szCs w:val="24"/>
+              </w:rPr>
+              <w:br/>
+            </w:r>
+            <w:r>
+              <w:rPr>
+                <w:rFonts w:asciiTheme="majorBidi" w:hAnsiTheme="majorBidi" w:cstheme="majorBidi"/>
+                <w:color w:val="000000" w:themeColor="text1"/>
+                <w:szCs w:val="24"/>
+              </w:rPr>
+              <w:t xml:space="preserve">3. Views: Spending Summary, Category Breakdown, Mood-Spending Correlation, Time Patterns, Balance History, Goal Report. </w:t>
+            </w:r>
+            <w:r>
+              <w:rPr>
+                <w:rFonts w:asciiTheme="majorBidi" w:hAnsiTheme="majorBidi" w:cstheme="majorBidi"/>
+                <w:color w:val="000000" w:themeColor="text1"/>
+                <w:szCs w:val="24"/>
+              </w:rPr>
+              <w:br/>
+            </w:r>
+            <w:r>
+              <w:rPr>
+                <w:rFonts w:asciiTheme="majorBidi" w:hAnsiTheme="majorBidi" w:cstheme="majorBidi"/>
+                <w:color w:val="000000" w:themeColor="text1"/>
+                <w:szCs w:val="24"/>
+              </w:rPr>
+              <w:t xml:space="preserve">4. Charts display data visually. </w:t>
+            </w:r>
+            <w:r>
+              <w:rPr>
+                <w:rFonts w:asciiTheme="majorBidi" w:hAnsiTheme="majorBidi" w:cstheme="majorBidi"/>
+                <w:color w:val="000000" w:themeColor="text1"/>
+                <w:szCs w:val="24"/>
+              </w:rPr>
+              <w:br/>
+            </w:r>
+            <w:r>
+              <w:rPr>
+                <w:rFonts w:asciiTheme="majorBidi" w:hAnsiTheme="majorBidi" w:cstheme="majorBidi"/>
+                <w:color w:val="000000" w:themeColor="text1"/>
+                <w:szCs w:val="24"/>
+              </w:rPr>
+              <w:t>5. Parent optionally downloads selected sections as a PDF.</w:t>
             </w:r>
           </w:p>
         </w:tc>
       </w:tr>
       <w:tr>
-        <w:tblPrEx>
-          <w:tblCellMar>
-            <w:top w:w="0" w:type="dxa"/>
-            <w:bottom w:w="0" w:type="dxa"/>
-          </w:tblCellMar>
-        </w:tblPrEx>
         <w:tc>
           <w:tcPr>
             <w:tcW w:w="2200" w:type="dxa"/>
@@ -18050,12 +18387,6 @@
         <w:gridCol w:w="7159"/>
       </w:tblGrid>
       <w:tr>
-        <w:tblPrEx>
-          <w:tblCellMar>
-            <w:top w:w="0" w:type="dxa"/>
-            <w:bottom w:w="0" w:type="dxa"/>
-          </w:tblCellMar>
-        </w:tblPrEx>
         <w:tc>
           <w:tcPr>
             <w:tcW w:w="2200" w:type="dxa"/>
@@ -18124,12 +18455,6 @@
         </w:tc>
       </w:tr>
       <w:tr>
-        <w:tblPrEx>
-          <w:tblCellMar>
-            <w:top w:w="0" w:type="dxa"/>
-            <w:bottom w:w="0" w:type="dxa"/>
-          </w:tblCellMar>
-        </w:tblPrEx>
         <w:tc>
           <w:tcPr>
             <w:tcW w:w="2200" w:type="dxa"/>
@@ -18192,12 +18517,6 @@
         </w:tc>
       </w:tr>
       <w:tr>
-        <w:tblPrEx>
-          <w:tblCellMar>
-            <w:top w:w="0" w:type="dxa"/>
-            <w:bottom w:w="0" w:type="dxa"/>
-          </w:tblCellMar>
-        </w:tblPrEx>
         <w:tc>
           <w:tcPr>
             <w:tcW w:w="2200" w:type="dxa"/>
@@ -18260,12 +18579,6 @@
         </w:tc>
       </w:tr>
       <w:tr>
-        <w:tblPrEx>
-          <w:tblCellMar>
-            <w:top w:w="0" w:type="dxa"/>
-            <w:bottom w:w="0" w:type="dxa"/>
-          </w:tblCellMar>
-        </w:tblPrEx>
         <w:tc>
           <w:tcPr>
             <w:tcW w:w="2200" w:type="dxa"/>
@@ -18328,12 +18641,6 @@
         </w:tc>
       </w:tr>
       <w:tr>
-        <w:tblPrEx>
-          <w:tblCellMar>
-            <w:top w:w="0" w:type="dxa"/>
-            <w:bottom w:w="0" w:type="dxa"/>
-          </w:tblCellMar>
-        </w:tblPrEx>
         <w:tc>
           <w:tcPr>
             <w:tcW w:w="2200" w:type="dxa"/>
@@ -18396,12 +18703,6 @@
         </w:tc>
       </w:tr>
       <w:tr>
-        <w:tblPrEx>
-          <w:tblCellMar>
-            <w:top w:w="0" w:type="dxa"/>
-            <w:bottom w:w="0" w:type="dxa"/>
-          </w:tblCellMar>
-        </w:tblPrEx>
         <w:tc>
           <w:tcPr>
             <w:tcW w:w="2200" w:type="dxa"/>
@@ -18458,7 +18759,23 @@
                 <w:color w:val="000000" w:themeColor="text1"/>
                 <w:szCs w:val="24"/>
               </w:rPr>
-              <w:t xml:space="preserve">1. Child opens Quiz section. 2. App loads next age-appropriate, </w:t>
+              <w:t xml:space="preserve">1. Child opens Quiz section. </w:t>
+            </w:r>
+            <w:r>
+              <w:rPr>
+                <w:rFonts w:asciiTheme="majorBidi" w:hAnsiTheme="majorBidi" w:cstheme="majorBidi"/>
+                <w:color w:val="000000" w:themeColor="text1"/>
+                <w:szCs w:val="24"/>
+              </w:rPr>
+              <w:br/>
+            </w:r>
+            <w:r>
+              <w:rPr>
+                <w:rFonts w:asciiTheme="majorBidi" w:hAnsiTheme="majorBidi" w:cstheme="majorBidi"/>
+                <w:color w:val="000000" w:themeColor="text1"/>
+                <w:szCs w:val="24"/>
+              </w:rPr>
+              <w:t xml:space="preserve">2. App loads next age-appropriate, </w:t>
             </w:r>
             <w:proofErr w:type="spellStart"/>
             <w:r>
@@ -18476,7 +18793,39 @@
                 <w:color w:val="000000" w:themeColor="text1"/>
                 <w:szCs w:val="24"/>
               </w:rPr>
-              <w:t xml:space="preserve"> quiz from DB (sequential by ID). 3. Child reads story scenario and selects one of 4 choices. 4. System records answer, updates </w:t>
+              <w:t xml:space="preserve"> quiz from DB (sequential by ID). </w:t>
+            </w:r>
+            <w:r>
+              <w:rPr>
+                <w:rFonts w:asciiTheme="majorBidi" w:hAnsiTheme="majorBidi" w:cstheme="majorBidi"/>
+                <w:color w:val="000000" w:themeColor="text1"/>
+                <w:szCs w:val="24"/>
+              </w:rPr>
+              <w:br/>
+            </w:r>
+            <w:r>
+              <w:rPr>
+                <w:rFonts w:asciiTheme="majorBidi" w:hAnsiTheme="majorBidi" w:cstheme="majorBidi"/>
+                <w:color w:val="000000" w:themeColor="text1"/>
+                <w:szCs w:val="24"/>
+              </w:rPr>
+              <w:t xml:space="preserve">3. Child reads story scenario and selects one of 4 choices. </w:t>
+            </w:r>
+            <w:r>
+              <w:rPr>
+                <w:rFonts w:asciiTheme="majorBidi" w:hAnsiTheme="majorBidi" w:cstheme="majorBidi"/>
+                <w:color w:val="000000" w:themeColor="text1"/>
+                <w:szCs w:val="24"/>
+              </w:rPr>
+              <w:br/>
+            </w:r>
+            <w:r>
+              <w:rPr>
+                <w:rFonts w:asciiTheme="majorBidi" w:hAnsiTheme="majorBidi" w:cstheme="majorBidi"/>
+                <w:color w:val="000000" w:themeColor="text1"/>
+                <w:szCs w:val="24"/>
+              </w:rPr>
+              <w:t xml:space="preserve">4. System records answer, updates </w:t>
             </w:r>
             <w:proofErr w:type="spellStart"/>
             <w:r>
@@ -18494,18 +18843,60 @@
                 <w:color w:val="000000" w:themeColor="text1"/>
                 <w:szCs w:val="24"/>
               </w:rPr>
-              <w:t xml:space="preserve"> and personality scores. 5. Character reacts: happy animation for good financial choice, sad for poor choice. 6. Feedback message shown. 7. Achievement check triggered. Limit: 2 quizzes per day.</w:t>
+              <w:t xml:space="preserve"> and personality scores. </w:t>
+            </w:r>
+            <w:r>
+              <w:rPr>
+                <w:rFonts w:asciiTheme="majorBidi" w:hAnsiTheme="majorBidi" w:cstheme="majorBidi"/>
+                <w:color w:val="000000" w:themeColor="text1"/>
+                <w:szCs w:val="24"/>
+              </w:rPr>
+              <w:br/>
+            </w:r>
+            <w:r>
+              <w:rPr>
+                <w:rFonts w:asciiTheme="majorBidi" w:hAnsiTheme="majorBidi" w:cstheme="majorBidi"/>
+                <w:color w:val="000000" w:themeColor="text1"/>
+                <w:szCs w:val="24"/>
+              </w:rPr>
+              <w:t xml:space="preserve">5. Character reacts: happy animation for good financial choice, sad for poor choice. </w:t>
+            </w:r>
+            <w:r>
+              <w:rPr>
+                <w:rFonts w:asciiTheme="majorBidi" w:hAnsiTheme="majorBidi" w:cstheme="majorBidi"/>
+                <w:color w:val="000000" w:themeColor="text1"/>
+                <w:szCs w:val="24"/>
+              </w:rPr>
+              <w:br/>
+            </w:r>
+            <w:r>
+              <w:rPr>
+                <w:rFonts w:asciiTheme="majorBidi" w:hAnsiTheme="majorBidi" w:cstheme="majorBidi"/>
+                <w:color w:val="000000" w:themeColor="text1"/>
+                <w:szCs w:val="24"/>
+              </w:rPr>
+              <w:t xml:space="preserve">6. Feedback message shown. </w:t>
+            </w:r>
+            <w:r>
+              <w:rPr>
+                <w:rFonts w:asciiTheme="majorBidi" w:hAnsiTheme="majorBidi" w:cstheme="majorBidi"/>
+                <w:color w:val="000000" w:themeColor="text1"/>
+                <w:szCs w:val="24"/>
+              </w:rPr>
+              <w:br/>
+            </w:r>
+            <w:r>
+              <w:rPr>
+                <w:rFonts w:asciiTheme="majorBidi" w:hAnsiTheme="majorBidi" w:cstheme="majorBidi"/>
+                <w:color w:val="000000" w:themeColor="text1"/>
+                <w:szCs w:val="24"/>
+              </w:rPr>
+              <w:t>7. Achievement check triggered. Limit: 2 quizzes per day.</w:t>
             </w:r>
           </w:p>
         </w:tc>
       </w:tr>
       <w:tr>
-        <w:tblPrEx>
-          <w:tblCellMar>
-            <w:top w:w="0" w:type="dxa"/>
-            <w:bottom w:w="0" w:type="dxa"/>
-          </w:tblCellMar>
-        </w:tblPrEx>
         <w:tc>
           <w:tcPr>
             <w:tcW w:w="2200" w:type="dxa"/>
@@ -18617,18 +19008,6 @@
           <w:szCs w:val="24"/>
         </w:rPr>
       </w:pPr>
-    </w:p>
-    <w:p>
-      <w:pPr>
-        <w:spacing w:after="80"/>
-        <w:rPr>
-          <w:rFonts w:asciiTheme="majorBidi" w:hAnsiTheme="majorBidi" w:cstheme="majorBidi"/>
-          <w:color w:val="000000" w:themeColor="text1"/>
-          <w:szCs w:val="24"/>
-        </w:rPr>
-      </w:pPr>
-      <w:bookmarkStart w:id="36" w:name="_GoBack"/>
-      <w:bookmarkEnd w:id="36"/>
     </w:p>
     <w:p>
       <w:pPr>
@@ -18682,12 +19061,6 @@
         <w:gridCol w:w="7159"/>
       </w:tblGrid>
       <w:tr>
-        <w:tblPrEx>
-          <w:tblCellMar>
-            <w:top w:w="0" w:type="dxa"/>
-            <w:bottom w:w="0" w:type="dxa"/>
-          </w:tblCellMar>
-        </w:tblPrEx>
         <w:tc>
           <w:tcPr>
             <w:tcW w:w="2200" w:type="dxa"/>
@@ -18778,12 +19151,6 @@
         </w:tc>
       </w:tr>
       <w:tr>
-        <w:tblPrEx>
-          <w:tblCellMar>
-            <w:top w:w="0" w:type="dxa"/>
-            <w:bottom w:w="0" w:type="dxa"/>
-          </w:tblCellMar>
-        </w:tblPrEx>
         <w:tc>
           <w:tcPr>
             <w:tcW w:w="2200" w:type="dxa"/>
@@ -18846,12 +19213,6 @@
         </w:tc>
       </w:tr>
       <w:tr>
-        <w:tblPrEx>
-          <w:tblCellMar>
-            <w:top w:w="0" w:type="dxa"/>
-            <w:bottom w:w="0" w:type="dxa"/>
-          </w:tblCellMar>
-        </w:tblPrEx>
         <w:tc>
           <w:tcPr>
             <w:tcW w:w="2200" w:type="dxa"/>
@@ -18932,12 +19293,6 @@
         </w:tc>
       </w:tr>
       <w:tr>
-        <w:tblPrEx>
-          <w:tblCellMar>
-            <w:top w:w="0" w:type="dxa"/>
-            <w:bottom w:w="0" w:type="dxa"/>
-          </w:tblCellMar>
-        </w:tblPrEx>
         <w:tc>
           <w:tcPr>
             <w:tcW w:w="2200" w:type="dxa"/>
@@ -19018,12 +19373,6 @@
         </w:tc>
       </w:tr>
       <w:tr>
-        <w:tblPrEx>
-          <w:tblCellMar>
-            <w:top w:w="0" w:type="dxa"/>
-            <w:bottom w:w="0" w:type="dxa"/>
-          </w:tblCellMar>
-        </w:tblPrEx>
         <w:tc>
           <w:tcPr>
             <w:tcW w:w="2200" w:type="dxa"/>
@@ -19086,12 +19435,6 @@
         </w:tc>
       </w:tr>
       <w:tr>
-        <w:tblPrEx>
-          <w:tblCellMar>
-            <w:top w:w="0" w:type="dxa"/>
-            <w:bottom w:w="0" w:type="dxa"/>
-          </w:tblCellMar>
-        </w:tblPrEx>
         <w:tc>
           <w:tcPr>
             <w:tcW w:w="2200" w:type="dxa"/>
@@ -19166,7 +19509,55 @@
                 <w:color w:val="000000" w:themeColor="text1"/>
                 <w:szCs w:val="24"/>
               </w:rPr>
-              <w:t xml:space="preserve">. 2. Types a financial question. 3. System enriches with user context (child profile, balance, spending patterns, personality, goals). 4. Child </w:t>
+              <w:t xml:space="preserve">. </w:t>
+            </w:r>
+            <w:r>
+              <w:rPr>
+                <w:rFonts w:asciiTheme="majorBidi" w:hAnsiTheme="majorBidi" w:cstheme="majorBidi"/>
+                <w:color w:val="000000" w:themeColor="text1"/>
+                <w:szCs w:val="24"/>
+              </w:rPr>
+              <w:br/>
+            </w:r>
+            <w:r>
+              <w:rPr>
+                <w:rFonts w:asciiTheme="majorBidi" w:hAnsiTheme="majorBidi" w:cstheme="majorBidi"/>
+                <w:color w:val="000000" w:themeColor="text1"/>
+                <w:szCs w:val="24"/>
+              </w:rPr>
+              <w:t xml:space="preserve">2. Types a financial question. </w:t>
+            </w:r>
+            <w:r>
+              <w:rPr>
+                <w:rFonts w:asciiTheme="majorBidi" w:hAnsiTheme="majorBidi" w:cstheme="majorBidi"/>
+                <w:color w:val="000000" w:themeColor="text1"/>
+                <w:szCs w:val="24"/>
+              </w:rPr>
+              <w:br/>
+            </w:r>
+            <w:r>
+              <w:rPr>
+                <w:rFonts w:asciiTheme="majorBidi" w:hAnsiTheme="majorBidi" w:cstheme="majorBidi"/>
+                <w:color w:val="000000" w:themeColor="text1"/>
+                <w:szCs w:val="24"/>
+              </w:rPr>
+              <w:t xml:space="preserve">3. System enriches with user context (child profile, balance, spending patterns, personality, goals). </w:t>
+            </w:r>
+            <w:r>
+              <w:rPr>
+                <w:rFonts w:asciiTheme="majorBidi" w:hAnsiTheme="majorBidi" w:cstheme="majorBidi"/>
+                <w:color w:val="000000" w:themeColor="text1"/>
+                <w:szCs w:val="24"/>
+              </w:rPr>
+              <w:br/>
+            </w:r>
+            <w:r>
+              <w:rPr>
+                <w:rFonts w:asciiTheme="majorBidi" w:hAnsiTheme="majorBidi" w:cstheme="majorBidi"/>
+                <w:color w:val="000000" w:themeColor="text1"/>
+                <w:szCs w:val="24"/>
+              </w:rPr>
+              <w:t xml:space="preserve">4. Child </w:t>
             </w:r>
             <w:proofErr w:type="spellStart"/>
             <w:r>
@@ -19202,7 +19593,23 @@
                 <w:color w:val="000000" w:themeColor="text1"/>
                 <w:szCs w:val="24"/>
               </w:rPr>
-              <w:t xml:space="preserve">: attaches analysis alerts and strengths. 5. LLM (Gemini first, then </w:t>
+              <w:t xml:space="preserve">: attaches analysis alerts and strengths. </w:t>
+            </w:r>
+            <w:r>
+              <w:rPr>
+                <w:rFonts w:asciiTheme="majorBidi" w:hAnsiTheme="majorBidi" w:cstheme="majorBidi"/>
+                <w:color w:val="000000" w:themeColor="text1"/>
+                <w:szCs w:val="24"/>
+              </w:rPr>
+              <w:br/>
+            </w:r>
+            <w:r>
+              <w:rPr>
+                <w:rFonts w:asciiTheme="majorBidi" w:hAnsiTheme="majorBidi" w:cstheme="majorBidi"/>
+                <w:color w:val="000000" w:themeColor="text1"/>
+                <w:szCs w:val="24"/>
+              </w:rPr>
+              <w:t xml:space="preserve">5. LLM (Gemini first, then </w:t>
             </w:r>
             <w:proofErr w:type="spellStart"/>
             <w:r>
@@ -19238,18 +19645,28 @@
                 <w:color w:val="000000" w:themeColor="text1"/>
                 <w:szCs w:val="24"/>
               </w:rPr>
-              <w:t>) generates response. 6. Response displayed to user.</w:t>
+              <w:t xml:space="preserve">) generates response. </w:t>
+            </w:r>
+            <w:r>
+              <w:rPr>
+                <w:rFonts w:asciiTheme="majorBidi" w:hAnsiTheme="majorBidi" w:cstheme="majorBidi"/>
+                <w:color w:val="000000" w:themeColor="text1"/>
+                <w:szCs w:val="24"/>
+              </w:rPr>
+              <w:br/>
+            </w:r>
+            <w:r>
+              <w:rPr>
+                <w:rFonts w:asciiTheme="majorBidi" w:hAnsiTheme="majorBidi" w:cstheme="majorBidi"/>
+                <w:color w:val="000000" w:themeColor="text1"/>
+                <w:szCs w:val="24"/>
+              </w:rPr>
+              <w:t>6. Response displayed to user.</w:t>
             </w:r>
           </w:p>
         </w:tc>
       </w:tr>
       <w:tr>
-        <w:tblPrEx>
-          <w:tblCellMar>
-            <w:top w:w="0" w:type="dxa"/>
-            <w:bottom w:w="0" w:type="dxa"/>
-          </w:tblCellMar>
-        </w:tblPrEx>
         <w:tc>
           <w:tcPr>
             <w:tcW w:w="2200" w:type="dxa"/>
@@ -19364,12 +19781,6 @@
         <w:gridCol w:w="7159"/>
       </w:tblGrid>
       <w:tr>
-        <w:tblPrEx>
-          <w:tblCellMar>
-            <w:top w:w="0" w:type="dxa"/>
-            <w:bottom w:w="0" w:type="dxa"/>
-          </w:tblCellMar>
-        </w:tblPrEx>
         <w:tc>
           <w:tcPr>
             <w:tcW w:w="2200" w:type="dxa"/>
@@ -19438,12 +19849,6 @@
         </w:tc>
       </w:tr>
       <w:tr>
-        <w:tblPrEx>
-          <w:tblCellMar>
-            <w:top w:w="0" w:type="dxa"/>
-            <w:bottom w:w="0" w:type="dxa"/>
-          </w:tblCellMar>
-        </w:tblPrEx>
         <w:tc>
           <w:tcPr>
             <w:tcW w:w="2200" w:type="dxa"/>
@@ -19506,12 +19911,6 @@
         </w:tc>
       </w:tr>
       <w:tr>
-        <w:tblPrEx>
-          <w:tblCellMar>
-            <w:top w:w="0" w:type="dxa"/>
-            <w:bottom w:w="0" w:type="dxa"/>
-          </w:tblCellMar>
-        </w:tblPrEx>
         <w:tc>
           <w:tcPr>
             <w:tcW w:w="2200" w:type="dxa"/>
@@ -19574,12 +19973,6 @@
         </w:tc>
       </w:tr>
       <w:tr>
-        <w:tblPrEx>
-          <w:tblCellMar>
-            <w:top w:w="0" w:type="dxa"/>
-            <w:bottom w:w="0" w:type="dxa"/>
-          </w:tblCellMar>
-        </w:tblPrEx>
         <w:tc>
           <w:tcPr>
             <w:tcW w:w="2200" w:type="dxa"/>
@@ -19642,12 +20035,6 @@
         </w:tc>
       </w:tr>
       <w:tr>
-        <w:tblPrEx>
-          <w:tblCellMar>
-            <w:top w:w="0" w:type="dxa"/>
-            <w:bottom w:w="0" w:type="dxa"/>
-          </w:tblCellMar>
-        </w:tblPrEx>
         <w:tc>
           <w:tcPr>
             <w:tcW w:w="2200" w:type="dxa"/>
@@ -19710,12 +20097,6 @@
         </w:tc>
       </w:tr>
       <w:tr>
-        <w:tblPrEx>
-          <w:tblCellMar>
-            <w:top w:w="0" w:type="dxa"/>
-            <w:bottom w:w="0" w:type="dxa"/>
-          </w:tblCellMar>
-        </w:tblPrEx>
         <w:tc>
           <w:tcPr>
             <w:tcW w:w="2200" w:type="dxa"/>
@@ -19772,6 +20153,14 @@
                 <w:color w:val="000000" w:themeColor="text1"/>
                 <w:szCs w:val="24"/>
               </w:rPr>
+              <w:t xml:space="preserve">1- </w:t>
+            </w:r>
+            <w:r>
+              <w:rPr>
+                <w:rFonts w:asciiTheme="majorBidi" w:hAnsiTheme="majorBidi" w:cstheme="majorBidi"/>
+                <w:color w:val="000000" w:themeColor="text1"/>
+                <w:szCs w:val="24"/>
+              </w:rPr>
               <w:t xml:space="preserve">In-App: </w:t>
             </w:r>
             <w:proofErr w:type="spellStart"/>
@@ -19790,7 +20179,58 @@
                 <w:color w:val="000000" w:themeColor="text1"/>
                 <w:szCs w:val="24"/>
               </w:rPr>
-              <w:t xml:space="preserve"> sends notification to user's hub group. Notification stored in DB. Unread count badge updated. Email (Parent only): </w:t>
+              <w:t xml:space="preserve"> sends notification to user's hub group. </w:t>
+            </w:r>
+            <w:r>
+              <w:rPr>
+                <w:rFonts w:asciiTheme="majorBidi" w:hAnsiTheme="majorBidi" w:cstheme="majorBidi"/>
+                <w:color w:val="000000" w:themeColor="text1"/>
+                <w:szCs w:val="24"/>
+              </w:rPr>
+              <w:br/>
+              <w:t xml:space="preserve">2- </w:t>
+            </w:r>
+            <w:r>
+              <w:rPr>
+                <w:rFonts w:asciiTheme="majorBidi" w:hAnsiTheme="majorBidi" w:cstheme="majorBidi"/>
+                <w:color w:val="000000" w:themeColor="text1"/>
+                <w:szCs w:val="24"/>
+              </w:rPr>
+              <w:t xml:space="preserve">Notification stored in DB. </w:t>
+            </w:r>
+            <w:r>
+              <w:rPr>
+                <w:rFonts w:asciiTheme="majorBidi" w:hAnsiTheme="majorBidi" w:cstheme="majorBidi"/>
+                <w:color w:val="000000" w:themeColor="text1"/>
+                <w:szCs w:val="24"/>
+              </w:rPr>
+              <w:br/>
+              <w:t xml:space="preserve">3- </w:t>
+            </w:r>
+            <w:r>
+              <w:rPr>
+                <w:rFonts w:asciiTheme="majorBidi" w:hAnsiTheme="majorBidi" w:cstheme="majorBidi"/>
+                <w:color w:val="000000" w:themeColor="text1"/>
+                <w:szCs w:val="24"/>
+              </w:rPr>
+              <w:t xml:space="preserve">Unread count badge updated. </w:t>
+            </w:r>
+            <w:r>
+              <w:rPr>
+                <w:rFonts w:asciiTheme="majorBidi" w:hAnsiTheme="majorBidi" w:cstheme="majorBidi"/>
+                <w:color w:val="000000" w:themeColor="text1"/>
+                <w:szCs w:val="24"/>
+              </w:rPr>
+              <w:br/>
+              <w:t xml:space="preserve">4- </w:t>
+            </w:r>
+            <w:r>
+              <w:rPr>
+                <w:rFonts w:asciiTheme="majorBidi" w:hAnsiTheme="majorBidi" w:cstheme="majorBidi"/>
+                <w:color w:val="000000" w:themeColor="text1"/>
+                <w:szCs w:val="24"/>
+              </w:rPr>
+              <w:t xml:space="preserve">Email (Parent only): </w:t>
             </w:r>
             <w:proofErr w:type="spellStart"/>
             <w:r>
@@ -19814,12 +20254,6 @@
         </w:tc>
       </w:tr>
       <w:tr>
-        <w:tblPrEx>
-          <w:tblCellMar>
-            <w:top w:w="0" w:type="dxa"/>
-            <w:bottom w:w="0" w:type="dxa"/>
-          </w:tblCellMar>
-        </w:tblPrEx>
         <w:tc>
           <w:tcPr>
             <w:tcW w:w="2200" w:type="dxa"/>
@@ -19882,26 +20316,6 @@
         </w:tc>
       </w:tr>
     </w:tbl>
-    <w:p>
-      <w:pPr>
-        <w:spacing w:after="80"/>
-        <w:rPr>
-          <w:rFonts w:asciiTheme="majorBidi" w:hAnsiTheme="majorBidi" w:cstheme="majorBidi"/>
-          <w:color w:val="000000" w:themeColor="text1"/>
-          <w:szCs w:val="24"/>
-        </w:rPr>
-      </w:pPr>
-    </w:p>
-    <w:p>
-      <w:pPr>
-        <w:spacing w:after="80"/>
-        <w:rPr>
-          <w:rFonts w:asciiTheme="majorBidi" w:hAnsiTheme="majorBidi" w:cstheme="majorBidi"/>
-          <w:color w:val="000000" w:themeColor="text1"/>
-          <w:szCs w:val="24"/>
-        </w:rPr>
-      </w:pPr>
-    </w:p>
     <w:p>
       <w:pPr>
         <w:spacing w:after="80"/>
@@ -20004,12 +20418,6 @@
         <w:gridCol w:w="7065"/>
       </w:tblGrid>
       <w:tr>
-        <w:tblPrEx>
-          <w:tblCellMar>
-            <w:top w:w="0" w:type="dxa"/>
-            <w:bottom w:w="0" w:type="dxa"/>
-          </w:tblCellMar>
-        </w:tblPrEx>
         <w:tc>
           <w:tcPr>
             <w:tcW w:w="2200" w:type="dxa"/>
@@ -20078,12 +20486,6 @@
         </w:tc>
       </w:tr>
       <w:tr>
-        <w:tblPrEx>
-          <w:tblCellMar>
-            <w:top w:w="0" w:type="dxa"/>
-            <w:bottom w:w="0" w:type="dxa"/>
-          </w:tblCellMar>
-        </w:tblPrEx>
         <w:tc>
           <w:tcPr>
             <w:tcW w:w="2200" w:type="dxa"/>
@@ -20146,12 +20548,6 @@
         </w:tc>
       </w:tr>
       <w:tr>
-        <w:tblPrEx>
-          <w:tblCellMar>
-            <w:top w:w="0" w:type="dxa"/>
-            <w:bottom w:w="0" w:type="dxa"/>
-          </w:tblCellMar>
-        </w:tblPrEx>
         <w:tc>
           <w:tcPr>
             <w:tcW w:w="2200" w:type="dxa"/>
@@ -20214,12 +20610,6 @@
         </w:tc>
       </w:tr>
       <w:tr>
-        <w:tblPrEx>
-          <w:tblCellMar>
-            <w:top w:w="0" w:type="dxa"/>
-            <w:bottom w:w="0" w:type="dxa"/>
-          </w:tblCellMar>
-        </w:tblPrEx>
         <w:tc>
           <w:tcPr>
             <w:tcW w:w="2200" w:type="dxa"/>
@@ -20282,12 +20672,6 @@
         </w:tc>
       </w:tr>
       <w:tr>
-        <w:tblPrEx>
-          <w:tblCellMar>
-            <w:top w:w="0" w:type="dxa"/>
-            <w:bottom w:w="0" w:type="dxa"/>
-          </w:tblCellMar>
-        </w:tblPrEx>
         <w:tc>
           <w:tcPr>
             <w:tcW w:w="2200" w:type="dxa"/>
@@ -20350,12 +20734,6 @@
         </w:tc>
       </w:tr>
       <w:tr>
-        <w:tblPrEx>
-          <w:tblCellMar>
-            <w:top w:w="0" w:type="dxa"/>
-            <w:bottom w:w="0" w:type="dxa"/>
-          </w:tblCellMar>
-        </w:tblPrEx>
         <w:tc>
           <w:tcPr>
             <w:tcW w:w="2200" w:type="dxa"/>
@@ -20412,7 +20790,23 @@
                 <w:color w:val="000000" w:themeColor="text1"/>
                 <w:szCs w:val="24"/>
               </w:rPr>
-              <w:t xml:space="preserve">1. Child performs qualifying action. 2. </w:t>
+              <w:t xml:space="preserve">1. Child performs qualifying action. </w:t>
+            </w:r>
+            <w:r>
+              <w:rPr>
+                <w:rFonts w:asciiTheme="majorBidi" w:hAnsiTheme="majorBidi" w:cstheme="majorBidi"/>
+                <w:color w:val="000000" w:themeColor="text1"/>
+                <w:szCs w:val="24"/>
+              </w:rPr>
+              <w:br/>
+            </w:r>
+            <w:r>
+              <w:rPr>
+                <w:rFonts w:asciiTheme="majorBidi" w:hAnsiTheme="majorBidi" w:cstheme="majorBidi"/>
+                <w:color w:val="000000" w:themeColor="text1"/>
+                <w:szCs w:val="24"/>
+              </w:rPr>
+              <w:t xml:space="preserve">2. </w:t>
             </w:r>
             <w:proofErr w:type="spellStart"/>
             <w:r>
@@ -20430,7 +20824,39 @@
                 <w:color w:val="000000" w:themeColor="text1"/>
                 <w:szCs w:val="24"/>
               </w:rPr>
-              <w:t xml:space="preserve"> checks current count against thresholds. 3. If threshold reached and not already earned: badge unlocked. 4. </w:t>
+              <w:t xml:space="preserve"> checks current count against thresholds. </w:t>
+            </w:r>
+            <w:r>
+              <w:rPr>
+                <w:rFonts w:asciiTheme="majorBidi" w:hAnsiTheme="majorBidi" w:cstheme="majorBidi"/>
+                <w:color w:val="000000" w:themeColor="text1"/>
+                <w:szCs w:val="24"/>
+              </w:rPr>
+              <w:br/>
+            </w:r>
+            <w:r>
+              <w:rPr>
+                <w:rFonts w:asciiTheme="majorBidi" w:hAnsiTheme="majorBidi" w:cstheme="majorBidi"/>
+                <w:color w:val="000000" w:themeColor="text1"/>
+                <w:szCs w:val="24"/>
+              </w:rPr>
+              <w:t xml:space="preserve">3. If threshold reached and not already earned: badge unlocked. </w:t>
+            </w:r>
+            <w:r>
+              <w:rPr>
+                <w:rFonts w:asciiTheme="majorBidi" w:hAnsiTheme="majorBidi" w:cstheme="majorBidi"/>
+                <w:color w:val="000000" w:themeColor="text1"/>
+                <w:szCs w:val="24"/>
+              </w:rPr>
+              <w:br/>
+            </w:r>
+            <w:r>
+              <w:rPr>
+                <w:rFonts w:asciiTheme="majorBidi" w:hAnsiTheme="majorBidi" w:cstheme="majorBidi"/>
+                <w:color w:val="000000" w:themeColor="text1"/>
+                <w:szCs w:val="24"/>
+              </w:rPr>
+              <w:t xml:space="preserve">4. </w:t>
             </w:r>
             <w:proofErr w:type="spellStart"/>
             <w:r>
@@ -20448,18 +20874,44 @@
                 <w:color w:val="000000" w:themeColor="text1"/>
                 <w:szCs w:val="24"/>
               </w:rPr>
-              <w:t xml:space="preserve"> record created. 5. In-app notification sent. 6. Badge appears in Trophy Case.</w:t>
+              <w:t xml:space="preserve"> record created. </w:t>
+            </w:r>
+            <w:r>
+              <w:rPr>
+                <w:rFonts w:asciiTheme="majorBidi" w:hAnsiTheme="majorBidi" w:cstheme="majorBidi"/>
+                <w:color w:val="000000" w:themeColor="text1"/>
+                <w:szCs w:val="24"/>
+              </w:rPr>
+              <w:br/>
+            </w:r>
+            <w:r>
+              <w:rPr>
+                <w:rFonts w:asciiTheme="majorBidi" w:hAnsiTheme="majorBidi" w:cstheme="majorBidi"/>
+                <w:color w:val="000000" w:themeColor="text1"/>
+                <w:szCs w:val="24"/>
+              </w:rPr>
+              <w:t xml:space="preserve">5. In-app notification sent. </w:t>
+            </w:r>
+            <w:r>
+              <w:rPr>
+                <w:rFonts w:asciiTheme="majorBidi" w:hAnsiTheme="majorBidi" w:cstheme="majorBidi"/>
+                <w:color w:val="000000" w:themeColor="text1"/>
+                <w:szCs w:val="24"/>
+              </w:rPr>
+              <w:br/>
+            </w:r>
+            <w:r>
+              <w:rPr>
+                <w:rFonts w:asciiTheme="majorBidi" w:hAnsiTheme="majorBidi" w:cstheme="majorBidi"/>
+                <w:color w:val="000000" w:themeColor="text1"/>
+                <w:szCs w:val="24"/>
+              </w:rPr>
+              <w:t>6. Badge appears in Trophy Case.</w:t>
             </w:r>
           </w:p>
         </w:tc>
       </w:tr>
       <w:tr>
-        <w:tblPrEx>
-          <w:tblCellMar>
-            <w:top w:w="0" w:type="dxa"/>
-            <w:bottom w:w="0" w:type="dxa"/>
-          </w:tblCellMar>
-        </w:tblPrEx>
         <w:tc>
           <w:tcPr>
             <w:tcW w:w="2200" w:type="dxa"/>
@@ -20574,12 +21026,6 @@
         <w:gridCol w:w="7065"/>
       </w:tblGrid>
       <w:tr>
-        <w:tblPrEx>
-          <w:tblCellMar>
-            <w:top w:w="0" w:type="dxa"/>
-            <w:bottom w:w="0" w:type="dxa"/>
-          </w:tblCellMar>
-        </w:tblPrEx>
         <w:tc>
           <w:tcPr>
             <w:tcW w:w="2200" w:type="dxa"/>
@@ -20646,12 +21092,6 @@
         </w:tc>
       </w:tr>
       <w:tr>
-        <w:tblPrEx>
-          <w:tblCellMar>
-            <w:top w:w="0" w:type="dxa"/>
-            <w:bottom w:w="0" w:type="dxa"/>
-          </w:tblCellMar>
-        </w:tblPrEx>
         <w:tc>
           <w:tcPr>
             <w:tcW w:w="2200" w:type="dxa"/>
@@ -20714,12 +21154,6 @@
         </w:tc>
       </w:tr>
       <w:tr>
-        <w:tblPrEx>
-          <w:tblCellMar>
-            <w:top w:w="0" w:type="dxa"/>
-            <w:bottom w:w="0" w:type="dxa"/>
-          </w:tblCellMar>
-        </w:tblPrEx>
         <w:tc>
           <w:tcPr>
             <w:tcW w:w="2200" w:type="dxa"/>
@@ -20782,12 +21216,6 @@
         </w:tc>
       </w:tr>
       <w:tr>
-        <w:tblPrEx>
-          <w:tblCellMar>
-            <w:top w:w="0" w:type="dxa"/>
-            <w:bottom w:w="0" w:type="dxa"/>
-          </w:tblCellMar>
-        </w:tblPrEx>
         <w:tc>
           <w:tcPr>
             <w:tcW w:w="2200" w:type="dxa"/>
@@ -20850,12 +21278,6 @@
         </w:tc>
       </w:tr>
       <w:tr>
-        <w:tblPrEx>
-          <w:tblCellMar>
-            <w:top w:w="0" w:type="dxa"/>
-            <w:bottom w:w="0" w:type="dxa"/>
-          </w:tblCellMar>
-        </w:tblPrEx>
         <w:tc>
           <w:tcPr>
             <w:tcW w:w="2200" w:type="dxa"/>
@@ -20918,12 +21340,6 @@
         </w:tc>
       </w:tr>
       <w:tr>
-        <w:tblPrEx>
-          <w:tblCellMar>
-            <w:top w:w="0" w:type="dxa"/>
-            <w:bottom w:w="0" w:type="dxa"/>
-          </w:tblCellMar>
-        </w:tblPrEx>
         <w:tc>
           <w:tcPr>
             <w:tcW w:w="2200" w:type="dxa"/>
@@ -20980,7 +21396,23 @@
                 <w:color w:val="000000" w:themeColor="text1"/>
                 <w:szCs w:val="24"/>
               </w:rPr>
-              <w:t xml:space="preserve">1. System detects event. 2. </w:t>
+              <w:t xml:space="preserve">1. System detects event. </w:t>
+            </w:r>
+            <w:r>
+              <w:rPr>
+                <w:rFonts w:asciiTheme="majorBidi" w:hAnsiTheme="majorBidi" w:cstheme="majorBidi"/>
+                <w:color w:val="000000" w:themeColor="text1"/>
+                <w:szCs w:val="24"/>
+              </w:rPr>
+              <w:br/>
+            </w:r>
+            <w:r>
+              <w:rPr>
+                <w:rFonts w:asciiTheme="majorBidi" w:hAnsiTheme="majorBidi" w:cstheme="majorBidi"/>
+                <w:color w:val="000000" w:themeColor="text1"/>
+                <w:szCs w:val="24"/>
+              </w:rPr>
+              <w:t xml:space="preserve">2. </w:t>
             </w:r>
             <w:proofErr w:type="spellStart"/>
             <w:r>
@@ -20998,7 +21430,23 @@
                 <w:color w:val="000000" w:themeColor="text1"/>
                 <w:szCs w:val="24"/>
               </w:rPr>
-              <w:t xml:space="preserve"> builds HTML email template. 3. Sends via </w:t>
+              <w:t xml:space="preserve"> builds HTML email template. </w:t>
+            </w:r>
+            <w:r>
+              <w:rPr>
+                <w:rFonts w:asciiTheme="majorBidi" w:hAnsiTheme="majorBidi" w:cstheme="majorBidi"/>
+                <w:color w:val="000000" w:themeColor="text1"/>
+                <w:szCs w:val="24"/>
+              </w:rPr>
+              <w:br/>
+            </w:r>
+            <w:r>
+              <w:rPr>
+                <w:rFonts w:asciiTheme="majorBidi" w:hAnsiTheme="majorBidi" w:cstheme="majorBidi"/>
+                <w:color w:val="000000" w:themeColor="text1"/>
+                <w:szCs w:val="24"/>
+              </w:rPr>
+              <w:t xml:space="preserve">3. Sends via </w:t>
             </w:r>
             <w:proofErr w:type="spellStart"/>
             <w:r>
@@ -21016,18 +21464,44 @@
                 <w:color w:val="000000" w:themeColor="text1"/>
                 <w:szCs w:val="24"/>
               </w:rPr>
-              <w:t xml:space="preserve"> to parent's registered email. 4. Email contains event summary and deep link to app. 5. Notification log stored in DB.</w:t>
+              <w:t xml:space="preserve"> to parent's registered email. </w:t>
+            </w:r>
+            <w:r>
+              <w:rPr>
+                <w:rFonts w:asciiTheme="majorBidi" w:hAnsiTheme="majorBidi" w:cstheme="majorBidi"/>
+                <w:color w:val="000000" w:themeColor="text1"/>
+                <w:szCs w:val="24"/>
+              </w:rPr>
+              <w:br/>
+            </w:r>
+            <w:r>
+              <w:rPr>
+                <w:rFonts w:asciiTheme="majorBidi" w:hAnsiTheme="majorBidi" w:cstheme="majorBidi"/>
+                <w:color w:val="000000" w:themeColor="text1"/>
+                <w:szCs w:val="24"/>
+              </w:rPr>
+              <w:t xml:space="preserve">4. Email contains event summary. </w:t>
+            </w:r>
+            <w:r>
+              <w:rPr>
+                <w:rFonts w:asciiTheme="majorBidi" w:hAnsiTheme="majorBidi" w:cstheme="majorBidi"/>
+                <w:color w:val="000000" w:themeColor="text1"/>
+                <w:szCs w:val="24"/>
+              </w:rPr>
+              <w:br/>
+            </w:r>
+            <w:r>
+              <w:rPr>
+                <w:rFonts w:asciiTheme="majorBidi" w:hAnsiTheme="majorBidi" w:cstheme="majorBidi"/>
+                <w:color w:val="000000" w:themeColor="text1"/>
+                <w:szCs w:val="24"/>
+              </w:rPr>
+              <w:t>5. Notification log stored in DB.</w:t>
             </w:r>
           </w:p>
         </w:tc>
       </w:tr>
       <w:tr>
-        <w:tblPrEx>
-          <w:tblCellMar>
-            <w:top w:w="0" w:type="dxa"/>
-            <w:bottom w:w="0" w:type="dxa"/>
-          </w:tblCellMar>
-        </w:tblPrEx>
         <w:tc>
           <w:tcPr>
             <w:tcW w:w="2200" w:type="dxa"/>
@@ -21204,7 +21678,7 @@
                     </pic:cNvPicPr>
                   </pic:nvPicPr>
                   <pic:blipFill>
-                    <a:blip r:embed="rId17">
+                    <a:blip r:embed="rId18">
                       <a:extLst>
                         <a:ext uri="{28A0092B-C50C-407E-A947-70E740481C1C}">
                           <a14:useLocalDpi xmlns:a14="http://schemas.microsoft.com/office/drawing/2010/main" val="0"/>
@@ -21320,7 +21794,7 @@
                     </pic:cNvPicPr>
                   </pic:nvPicPr>
                   <pic:blipFill>
-                    <a:blip r:embed="rId18">
+                    <a:blip r:embed="rId19">
                       <a:extLst>
                         <a:ext uri="{28A0092B-C50C-407E-A947-70E740481C1C}">
                           <a14:useLocalDpi xmlns:a14="http://schemas.microsoft.com/office/drawing/2010/main" val="0"/>
@@ -21375,7 +21849,7 @@
                     </pic:cNvPicPr>
                   </pic:nvPicPr>
                   <pic:blipFill>
-                    <a:blip r:embed="rId19">
+                    <a:blip r:embed="rId20">
                       <a:extLst>
                         <a:ext uri="{28A0092B-C50C-407E-A947-70E740481C1C}">
                           <a14:useLocalDpi xmlns:a14="http://schemas.microsoft.com/office/drawing/2010/main" val="0"/>
@@ -21430,7 +21904,7 @@
                     </pic:cNvPicPr>
                   </pic:nvPicPr>
                   <pic:blipFill>
-                    <a:blip r:embed="rId20">
+                    <a:blip r:embed="rId21">
                       <a:extLst>
                         <a:ext uri="{28A0092B-C50C-407E-A947-70E740481C1C}">
                           <a14:useLocalDpi xmlns:a14="http://schemas.microsoft.com/office/drawing/2010/main" val="0"/>
@@ -21485,7 +21959,7 @@
                     </pic:cNvPicPr>
                   </pic:nvPicPr>
                   <pic:blipFill>
-                    <a:blip r:embed="rId21">
+                    <a:blip r:embed="rId22">
                       <a:extLst>
                         <a:ext uri="{28A0092B-C50C-407E-A947-70E740481C1C}">
                           <a14:useLocalDpi xmlns:a14="http://schemas.microsoft.com/office/drawing/2010/main" val="0"/>
@@ -21551,7 +22025,7 @@
                     </pic:cNvPicPr>
                   </pic:nvPicPr>
                   <pic:blipFill>
-                    <a:blip r:embed="rId22">
+                    <a:blip r:embed="rId23">
                       <a:extLst>
                         <a:ext uri="{28A0092B-C50C-407E-A947-70E740481C1C}">
                           <a14:useLocalDpi xmlns:a14="http://schemas.microsoft.com/office/drawing/2010/main" val="0"/>
@@ -21638,7 +22112,7 @@
                     </pic:cNvPicPr>
                   </pic:nvPicPr>
                   <pic:blipFill>
-                    <a:blip r:embed="rId23">
+                    <a:blip r:embed="rId24">
                       <a:extLst>
                         <a:ext uri="{28A0092B-C50C-407E-A947-70E740481C1C}">
                           <a14:useLocalDpi xmlns:a14="http://schemas.microsoft.com/office/drawing/2010/main" val="0"/>
@@ -21724,7 +22198,7 @@
                     </pic:cNvPicPr>
                   </pic:nvPicPr>
                   <pic:blipFill>
-                    <a:blip r:embed="rId24">
+                    <a:blip r:embed="rId25">
                       <a:extLst>
                         <a:ext uri="{28A0092B-C50C-407E-A947-70E740481C1C}">
                           <a14:useLocalDpi xmlns:a14="http://schemas.microsoft.com/office/drawing/2010/main" val="0"/>
@@ -21830,7 +22304,7 @@
                     </pic:cNvPicPr>
                   </pic:nvPicPr>
                   <pic:blipFill>
-                    <a:blip r:embed="rId25">
+                    <a:blip r:embed="rId26">
                       <a:extLst>
                         <a:ext uri="{28A0092B-C50C-407E-A947-70E740481C1C}">
                           <a14:useLocalDpi xmlns:a14="http://schemas.microsoft.com/office/drawing/2010/main" val="0"/>
@@ -21926,7 +22400,7 @@
                     </pic:cNvPicPr>
                   </pic:nvPicPr>
                   <pic:blipFill>
-                    <a:blip r:embed="rId26">
+                    <a:blip r:embed="rId27">
                       <a:extLst>
                         <a:ext uri="{28A0092B-C50C-407E-A947-70E740481C1C}">
                           <a14:useLocalDpi xmlns:a14="http://schemas.microsoft.com/office/drawing/2010/main" val="0"/>
@@ -22022,7 +22496,7 @@
                     </pic:cNvPicPr>
                   </pic:nvPicPr>
                   <pic:blipFill>
-                    <a:blip r:embed="rId27">
+                    <a:blip r:embed="rId28">
                       <a:extLst>
                         <a:ext uri="{28A0092B-C50C-407E-A947-70E740481C1C}">
                           <a14:useLocalDpi xmlns:a14="http://schemas.microsoft.com/office/drawing/2010/main" val="0"/>
@@ -22088,7 +22562,7 @@
                     </pic:cNvPicPr>
                   </pic:nvPicPr>
                   <pic:blipFill>
-                    <a:blip r:embed="rId28">
+                    <a:blip r:embed="rId29">
                       <a:extLst>
                         <a:ext uri="{28A0092B-C50C-407E-A947-70E740481C1C}">
                           <a14:useLocalDpi xmlns:a14="http://schemas.microsoft.com/office/drawing/2010/main" val="0"/>
@@ -22154,7 +22628,7 @@
                     </pic:cNvPicPr>
                   </pic:nvPicPr>
                   <pic:blipFill>
-                    <a:blip r:embed="rId29">
+                    <a:blip r:embed="rId30">
                       <a:extLst>
                         <a:ext uri="{28A0092B-C50C-407E-A947-70E740481C1C}">
                           <a14:useLocalDpi xmlns:a14="http://schemas.microsoft.com/office/drawing/2010/main" val="0"/>
@@ -22220,7 +22694,7 @@
                     </pic:cNvPicPr>
                   </pic:nvPicPr>
                   <pic:blipFill>
-                    <a:blip r:embed="rId30">
+                    <a:blip r:embed="rId31">
                       <a:extLst>
                         <a:ext uri="{28A0092B-C50C-407E-A947-70E740481C1C}">
                           <a14:useLocalDpi xmlns:a14="http://schemas.microsoft.com/office/drawing/2010/main" val="0"/>
@@ -22275,7 +22749,7 @@
                     </pic:cNvPicPr>
                   </pic:nvPicPr>
                   <pic:blipFill>
-                    <a:blip r:embed="rId31">
+                    <a:blip r:embed="rId32">
                       <a:extLst>
                         <a:ext uri="{28A0092B-C50C-407E-A947-70E740481C1C}">
                           <a14:useLocalDpi xmlns:a14="http://schemas.microsoft.com/office/drawing/2010/main" val="0"/>
@@ -22340,7 +22814,7 @@
                     </pic:cNvPicPr>
                   </pic:nvPicPr>
                   <pic:blipFill>
-                    <a:blip r:embed="rId32">
+                    <a:blip r:embed="rId33">
                       <a:extLst>
                         <a:ext uri="{28A0092B-C50C-407E-A947-70E740481C1C}">
                           <a14:useLocalDpi xmlns:a14="http://schemas.microsoft.com/office/drawing/2010/main" val="0"/>
@@ -25359,7 +25833,7 @@
       </w:r>
     </w:p>
     <w:sectPr>
-      <w:headerReference w:type="default" r:id="rId33"/>
+      <w:headerReference w:type="default" r:id="rId34"/>
       <w:pgSz w:w="12240" w:h="15840" w:code="1"/>
       <w:pgMar w:top="1440" w:right="1296" w:bottom="1440" w:left="1296" w:header="720" w:footer="720" w:gutter="0"/>
       <w:pgNumType w:start="1"/>
@@ -25521,7 +25995,7 @@
       <w:rPr>
         <w:noProof/>
       </w:rPr>
-      <w:t>25</w:t>
+      <w:t>19</w:t>
     </w:r>
     <w:r>
       <w:fldChar w:fldCharType="end"/>
@@ -28532,20 +29006,20 @@
 </file>
 
 <file path=customXml/item2.xml><?xml version="1.0" encoding="utf-8"?>
-<p:properties xmlns:p="http://schemas.microsoft.com/office/2006/metadata/properties" xmlns:xsi="http://www.w3.org/2001/XMLSchema-instance" xmlns:pc="http://schemas.microsoft.com/office/infopath/2007/PartnerControls">
-  <documentManagement>
-    <_activity xmlns="a0b9350d-f11b-4c2c-9411-1305d64a2cf9" xsi:nil="true"/>
-  </documentManagement>
-</p:properties>
-</file>
-
-<file path=customXml/item3.xml><?xml version="1.0" encoding="utf-8"?>
 <?mso-contentType ?>
 <FormTemplates xmlns="http://schemas.microsoft.com/sharepoint/v3/contenttype/forms">
   <Display>DocumentLibraryForm</Display>
   <Edit>DocumentLibraryForm</Edit>
   <New>DocumentLibraryForm</New>
 </FormTemplates>
+</file>
+
+<file path=customXml/item3.xml><?xml version="1.0" encoding="utf-8"?>
+<p:properties xmlns:p="http://schemas.microsoft.com/office/2006/metadata/properties" xmlns:xsi="http://www.w3.org/2001/XMLSchema-instance" xmlns:pc="http://schemas.microsoft.com/office/infopath/2007/PartnerControls">
+  <documentManagement>
+    <_activity xmlns="a0b9350d-f11b-4c2c-9411-1305d64a2cf9" xsi:nil="true"/>
+  </documentManagement>
+</p:properties>
 </file>
 
 <file path=customXml/item4.xml><?xml version="1.0" encoding="utf-8"?>
@@ -28572,6 +29046,14 @@
 </file>
 
 <file path=customXml/itemProps2.xml><?xml version="1.0" encoding="utf-8"?>
+<ds:datastoreItem xmlns:ds="http://schemas.openxmlformats.org/officeDocument/2006/customXml" ds:itemID="{CA1C910A-E087-4A41-BE29-FE60FF116498}">
+  <ds:schemaRefs>
+    <ds:schemaRef ds:uri="http://schemas.microsoft.com/sharepoint/v3/contenttype/forms"/>
+  </ds:schemaRefs>
+</ds:datastoreItem>
+</file>
+
+<file path=customXml/itemProps3.xml><?xml version="1.0" encoding="utf-8"?>
 <ds:datastoreItem xmlns:ds="http://schemas.openxmlformats.org/officeDocument/2006/customXml" ds:itemID="{F48E6873-909C-4AED-A304-42171A5F15F4}">
   <ds:schemaRefs>
     <ds:schemaRef ds:uri="http://schemas.microsoft.com/office/2006/metadata/properties"/>
@@ -28581,16 +29063,8 @@
 </ds:datastoreItem>
 </file>
 
-<file path=customXml/itemProps3.xml><?xml version="1.0" encoding="utf-8"?>
-<ds:datastoreItem xmlns:ds="http://schemas.openxmlformats.org/officeDocument/2006/customXml" ds:itemID="{CA1C910A-E087-4A41-BE29-FE60FF116498}">
-  <ds:schemaRefs>
-    <ds:schemaRef ds:uri="http://schemas.microsoft.com/sharepoint/v3/contenttype/forms"/>
-  </ds:schemaRefs>
-</ds:datastoreItem>
-</file>
-
 <file path=customXml/itemProps4.xml><?xml version="1.0" encoding="utf-8"?>
-<ds:datastoreItem xmlns:ds="http://schemas.openxmlformats.org/officeDocument/2006/customXml" ds:itemID="{EEB005E3-ABC3-4A59-AFBB-2EF43533E444}">
+<ds:datastoreItem xmlns:ds="http://schemas.openxmlformats.org/officeDocument/2006/customXml" ds:itemID="{6A6333BA-1C37-4D90-BE7C-E69BDE1043DC}">
   <ds:schemaRefs>
     <ds:schemaRef ds:uri="http://schemas.openxmlformats.org/officeDocument/2006/bibliography"/>
   </ds:schemaRefs>

</xml_diff>